<commit_message>
feat: atualizar fonte dos documentos gerados
</commit_message>
<xml_diff>
--- a/services/worker/src/assets/templates/calculadoras/rescisao_trabalhista_report.docx
+++ b/services/worker/src/assets/templates/calculadoras/rescisao_trabalhista_report.docx
@@ -4968,51 +4968,7 @@
           <w:szCs w:val="22"/>
           <w14:ligatures w14:val="none"/>
         </w:rPr>
-        <w:t>Este cálculo é uma estimativa baseada nas informações</w:t>
-      </w:r>
-      <w:r>
-        <w:rPr>
-          <w:rFonts w:eastAsiaTheme="minorEastAsia"/>
-          <w:color w:val="888888"/>
-          <w:kern w:val="0"/>
-          <w:sz w:val="16"/>
-          <w:szCs w:val="22"/>
-          <w14:ligatures w14:val="none"/>
-        </w:rPr>
-        <w:t xml:space="preserve"> </w:t>
-      </w:r>
-      <w:r>
-        <w:rPr>
-          <w:rFonts w:eastAsiaTheme="minorEastAsia"/>
-          <w:color w:val="888888"/>
-          <w:kern w:val="0"/>
-          <w:sz w:val="16"/>
-          <w:szCs w:val="22"/>
-          <w14:ligatures w14:val="none"/>
-        </w:rPr>
-        <w:t>fornecidas e na legislação trabalhista vigente (CLT).</w:t>
-      </w:r>
-      <w:r>
-        <w:rPr>
-          <w:rFonts w:eastAsiaTheme="minorEastAsia"/>
-          <w:color w:val="888888"/>
-          <w:kern w:val="0"/>
-          <w:sz w:val="16"/>
-          <w:szCs w:val="22"/>
-          <w14:ligatures w14:val="none"/>
-        </w:rPr>
-        <w:t xml:space="preserve"> </w:t>
-      </w:r>
-      <w:r>
-        <w:rPr>
-          <w:rFonts w:eastAsiaTheme="minorEastAsia"/>
-          <w:color w:val="888888"/>
-          <w:kern w:val="0"/>
-          <w:sz w:val="16"/>
-          <w:szCs w:val="22"/>
-          <w14:ligatures w14:val="none"/>
-        </w:rPr>
-        <w:t>Não substitui a análise de um profissional.</w:t>
+        <w:t>Este cálculo é uma estimativa baseada nas informações fornecidas e na legislação trabalhista vigente (CLT). Não substitui a análise de um profissional.</w:t>
       </w:r>
     </w:p>
     <w:p>
@@ -5042,29 +4998,7 @@
           <w:szCs w:val="22"/>
           <w14:ligatures w14:val="none"/>
         </w:rPr>
-        <w:t>O FGTS acumulado é estimado com base na remuneração</w:t>
-      </w:r>
-      <w:r>
-        <w:rPr>
-          <w:rFonts w:eastAsiaTheme="minorEastAsia"/>
-          <w:color w:val="888888"/>
-          <w:kern w:val="0"/>
-          <w:sz w:val="16"/>
-          <w:szCs w:val="22"/>
-          <w14:ligatures w14:val="none"/>
-        </w:rPr>
-        <w:t xml:space="preserve"> </w:t>
-      </w:r>
-      <w:r>
-        <w:rPr>
-          <w:rFonts w:eastAsiaTheme="minorEastAsia"/>
-          <w:color w:val="888888"/>
-          <w:kern w:val="0"/>
-          <w:sz w:val="16"/>
-          <w:szCs w:val="22"/>
-          <w14:ligatures w14:val="none"/>
-        </w:rPr>
-        <w:t>atual. O saldo real depende dos depósitos efetivamente realizados pelo empregador ao longo do contrato.</w:t>
+        <w:t>O FGTS acumulado é estimado com base na remuneração atual. O saldo real depende dos depósitos efetivamente realizados pelo empregador ao longo do contrato.</w:t>
       </w:r>
     </w:p>
     <w:p>
@@ -5094,51 +5028,7 @@
           <w:szCs w:val="22"/>
           <w14:ligatures w14:val="none"/>
         </w:rPr>
-        <w:t>Os descontos de INSS e IRRF foram calculados conforme</w:t>
-      </w:r>
-      <w:r>
-        <w:rPr>
-          <w:rFonts w:eastAsiaTheme="minorEastAsia"/>
-          <w:color w:val="888888"/>
-          <w:kern w:val="0"/>
-          <w:sz w:val="16"/>
-          <w:szCs w:val="22"/>
-          <w14:ligatures w14:val="none"/>
-        </w:rPr>
-        <w:t xml:space="preserve"> </w:t>
-      </w:r>
-      <w:r>
-        <w:rPr>
-          <w:rFonts w:eastAsiaTheme="minorEastAsia"/>
-          <w:color w:val="888888"/>
-          <w:kern w:val="0"/>
-          <w:sz w:val="16"/>
-          <w:szCs w:val="22"/>
-          <w14:ligatures w14:val="none"/>
-        </w:rPr>
-        <w:t>as tabelas progressivas vigentes em 2026 (Portaria Interministerial MPS/MF nº 13/2026). Férias + 1/3 e</w:t>
-      </w:r>
-      <w:r>
-        <w:rPr>
-          <w:rFonts w:eastAsiaTheme="minorEastAsia"/>
-          <w:color w:val="888888"/>
-          <w:kern w:val="0"/>
-          <w:sz w:val="16"/>
-          <w:szCs w:val="22"/>
-          <w14:ligatures w14:val="none"/>
-        </w:rPr>
-        <w:t xml:space="preserve"> </w:t>
-      </w:r>
-      <w:r>
-        <w:rPr>
-          <w:rFonts w:eastAsiaTheme="minorEastAsia"/>
-          <w:color w:val="888888"/>
-          <w:kern w:val="0"/>
-          <w:sz w:val="16"/>
-          <w:szCs w:val="22"/>
-          <w14:ligatures w14:val="none"/>
-        </w:rPr>
-        <w:t>verbas indenizatórias são isentas de tributação.</w:t>
+        <w:t>Os descontos de INSS e IRRF foram calculados conforme as tabelas progressivas vigentes em 2026 (Portaria Interministerial MPS/MF nº 13/2026). Férias + 1/3 e verbas indenizatórias são isentas de tributação.</w:t>
       </w:r>
     </w:p>
     <w:p>
@@ -5168,29 +5058,7 @@
           <w:szCs w:val="22"/>
           <w14:ligatures w14:val="none"/>
         </w:rPr>
-        <w:t>O aviso prévio proporcional ao tempo de serviço segue</w:t>
-      </w:r>
-      <w:r>
-        <w:rPr>
-          <w:rFonts w:eastAsiaTheme="minorEastAsia"/>
-          <w:color w:val="888888"/>
-          <w:kern w:val="0"/>
-          <w:sz w:val="16"/>
-          <w:szCs w:val="22"/>
-          <w14:ligatures w14:val="none"/>
-        </w:rPr>
-        <w:t xml:space="preserve"> </w:t>
-      </w:r>
-      <w:r>
-        <w:rPr>
-          <w:rFonts w:eastAsiaTheme="minorEastAsia"/>
-          <w:color w:val="888888"/>
-          <w:kern w:val="0"/>
-          <w:sz w:val="16"/>
-          <w:szCs w:val="22"/>
-          <w14:ligatures w14:val="none"/>
-        </w:rPr>
-        <w:t>a Lei nº 12.506/2011 (30 dias + 3 dias por ano trabalhado, máximo de 90 dias).</w:t>
+        <w:t>O aviso prévio proporcional ao tempo de serviço segue a Lei nº 12.506/2011 (30 dias + 3 dias por ano trabalhado, máximo de 90 dias).</w:t>
       </w:r>
     </w:p>
     <w:p>
@@ -5220,29 +5088,7 @@
           <w:szCs w:val="22"/>
           <w14:ligatures w14:val="none"/>
         </w:rPr>
-        <w:t>Este documento é meramente informativo e não possui</w:t>
-      </w:r>
-      <w:r>
-        <w:rPr>
-          <w:rFonts w:eastAsiaTheme="minorEastAsia"/>
-          <w:color w:val="888888"/>
-          <w:kern w:val="0"/>
-          <w:sz w:val="16"/>
-          <w:szCs w:val="22"/>
-          <w14:ligatures w14:val="none"/>
-        </w:rPr>
-        <w:t xml:space="preserve"> </w:t>
-      </w:r>
-      <w:r>
-        <w:rPr>
-          <w:rFonts w:eastAsiaTheme="minorEastAsia"/>
-          <w:color w:val="888888"/>
-          <w:kern w:val="0"/>
-          <w:sz w:val="16"/>
-          <w:szCs w:val="22"/>
-          <w14:ligatures w14:val="none"/>
-        </w:rPr>
-        <w:t>valor legal. Para fins oficiais, consulte um advogado trabalhista.</w:t>
+        <w:t>Este documento é meramente informativo e não possui valor legal. Para fins oficiais, consulte um advogado trabalhista.</w:t>
       </w:r>
     </w:p>
     <w:sectPr>
@@ -6120,13 +5966,13 @@
   <w:style w:type="paragraph" w:default="1" w:styleId="Normal">
     <w:name w:val="Normal"/>
     <w:qFormat/>
-    <w:rsid w:val="00F97D08"/>
+    <w:rsid w:val="00D02226"/>
     <w:pPr>
       <w:spacing w:after="80"/>
       <w:jc w:val="both"/>
     </w:pPr>
     <w:rPr>
-      <w:rFonts w:ascii="Georgia" w:hAnsi="Georgia"/>
+      <w:rFonts w:ascii="Arial" w:hAnsi="Arial"/>
     </w:rPr>
   </w:style>
   <w:style w:type="paragraph" w:styleId="Ttulo1">
@@ -6330,6 +6176,7 @@
   <w:style w:type="character" w:default="1" w:styleId="Fontepargpadro">
     <w:name w:val="Default Paragraph Font"/>
     <w:uiPriority w:val="1"/>
+    <w:semiHidden/>
     <w:unhideWhenUsed/>
   </w:style>
   <w:style w:type="table" w:default="1" w:styleId="Tabelanormal">

</xml_diff>

<commit_message>
feat: implementar geração de PDF opcional na calculadora de rescisão trabalhista
</commit_message>
<xml_diff>
--- a/services/worker/src/assets/templates/calculadoras/rescisao_trabalhista_report.docx
+++ b/services/worker/src/assets/templates/calculadoras/rescisao_trabalhista_report.docx
@@ -88,16 +88,9 @@
       <w:r>
         <w:t>: {{</w:t>
       </w:r>
-      <w:proofErr w:type="spellStart"/>
       <w:r>
-        <w:t>data_</w:t>
+        <w:t>data_calculo</w:t>
       </w:r>
-      <w:proofErr w:type="gramStart"/>
-      <w:r>
-        <w:t>calculo</w:t>
-      </w:r>
-      <w:proofErr w:type="spellEnd"/>
-      <w:proofErr w:type="gramEnd"/>
       <w:r>
         <w:t>}}</w:t>
       </w:r>
@@ -163,33 +156,11 @@
                 <w:rFonts w:ascii="Aptos Narrow" w:hAnsi="Aptos Narrow"/>
               </w:rPr>
             </w:pPr>
-            <w:proofErr w:type="gramStart"/>
-            <w:r>
-              <w:rPr>
-                <w:rFonts w:ascii="Aptos Narrow" w:hAnsi="Aptos Narrow"/>
-              </w:rPr>
-              <w:t xml:space="preserve">{{ </w:t>
-            </w:r>
-            <w:proofErr w:type="spellStart"/>
-            <w:r>
-              <w:rPr>
-                <w:rFonts w:ascii="Aptos Narrow" w:hAnsi="Aptos Narrow"/>
-              </w:rPr>
-              <w:t>tipo</w:t>
-            </w:r>
-            <w:proofErr w:type="gramEnd"/>
-            <w:r>
-              <w:rPr>
-                <w:rFonts w:ascii="Aptos Narrow" w:hAnsi="Aptos Narrow"/>
-              </w:rPr>
-              <w:t>_rescisao_label</w:t>
-            </w:r>
-            <w:proofErr w:type="spellEnd"/>
-            <w:r>
-              <w:rPr>
-                <w:rFonts w:ascii="Aptos Narrow" w:hAnsi="Aptos Narrow"/>
-              </w:rPr>
-              <w:t xml:space="preserve"> }}</w:t>
+            <w:r>
+              <w:rPr>
+                <w:rFonts w:ascii="Aptos Narrow" w:hAnsi="Aptos Narrow"/>
+              </w:rPr>
+              <w:t>{{ tipo_rescisao_label }}</w:t>
             </w:r>
           </w:p>
         </w:tc>
@@ -212,31 +183,22 @@
                 <w:rFonts w:ascii="Aptos Narrow" w:hAnsi="Aptos Narrow"/>
                 <w:b/>
               </w:rPr>
-              <w:t xml:space="preserve">Data de </w:t>
-            </w:r>
-            <w:proofErr w:type="spellStart"/>
+              <w:t>Data de Admiss</w:t>
+            </w:r>
             <w:r>
               <w:rPr>
                 <w:rFonts w:ascii="Aptos Narrow" w:hAnsi="Aptos Narrow"/>
                 <w:b/>
               </w:rPr>
-              <w:t>Admiss</w:t>
+              <w:t>ã</w:t>
             </w:r>
             <w:r>
               <w:rPr>
                 <w:rFonts w:ascii="Aptos Narrow" w:hAnsi="Aptos Narrow"/>
                 <w:b/>
               </w:rPr>
-              <w:t>ã</w:t>
-            </w:r>
-            <w:r>
-              <w:rPr>
-                <w:rFonts w:ascii="Aptos Narrow" w:hAnsi="Aptos Narrow"/>
-                <w:b/>
-              </w:rPr>
               <w:t>o</w:t>
             </w:r>
-            <w:proofErr w:type="spellEnd"/>
           </w:p>
         </w:tc>
         <w:tc>
@@ -251,33 +213,11 @@
                 <w:rFonts w:ascii="Aptos Narrow" w:hAnsi="Aptos Narrow"/>
               </w:rPr>
             </w:pPr>
-            <w:proofErr w:type="gramStart"/>
-            <w:r>
-              <w:rPr>
-                <w:rFonts w:ascii="Aptos Narrow" w:hAnsi="Aptos Narrow"/>
-              </w:rPr>
-              <w:t xml:space="preserve">{{ </w:t>
-            </w:r>
-            <w:proofErr w:type="spellStart"/>
-            <w:r>
-              <w:rPr>
-                <w:rFonts w:ascii="Aptos Narrow" w:hAnsi="Aptos Narrow"/>
-              </w:rPr>
-              <w:t>data</w:t>
-            </w:r>
-            <w:proofErr w:type="gramEnd"/>
-            <w:r>
-              <w:rPr>
-                <w:rFonts w:ascii="Aptos Narrow" w:hAnsi="Aptos Narrow"/>
-              </w:rPr>
-              <w:t>_admissao</w:t>
-            </w:r>
-            <w:proofErr w:type="spellEnd"/>
-            <w:r>
-              <w:rPr>
-                <w:rFonts w:ascii="Aptos Narrow" w:hAnsi="Aptos Narrow"/>
-              </w:rPr>
-              <w:t xml:space="preserve"> }}</w:t>
+            <w:r>
+              <w:rPr>
+                <w:rFonts w:ascii="Aptos Narrow" w:hAnsi="Aptos Narrow"/>
+              </w:rPr>
+              <w:t>{{ data_admissao }}</w:t>
             </w:r>
           </w:p>
         </w:tc>
@@ -323,33 +263,11 @@
                 <w:rFonts w:ascii="Aptos Narrow" w:hAnsi="Aptos Narrow"/>
               </w:rPr>
             </w:pPr>
-            <w:proofErr w:type="gramStart"/>
-            <w:r>
-              <w:rPr>
-                <w:rFonts w:ascii="Aptos Narrow" w:hAnsi="Aptos Narrow"/>
-              </w:rPr>
-              <w:t xml:space="preserve">{{ </w:t>
-            </w:r>
-            <w:proofErr w:type="spellStart"/>
-            <w:r>
-              <w:rPr>
-                <w:rFonts w:ascii="Aptos Narrow" w:hAnsi="Aptos Narrow"/>
-              </w:rPr>
-              <w:t>data</w:t>
-            </w:r>
-            <w:proofErr w:type="gramEnd"/>
-            <w:r>
-              <w:rPr>
-                <w:rFonts w:ascii="Aptos Narrow" w:hAnsi="Aptos Narrow"/>
-              </w:rPr>
-              <w:t>_rescisao</w:t>
-            </w:r>
-            <w:proofErr w:type="spellEnd"/>
-            <w:r>
-              <w:rPr>
-                <w:rFonts w:ascii="Aptos Narrow" w:hAnsi="Aptos Narrow"/>
-              </w:rPr>
-              <w:t xml:space="preserve"> }}</w:t>
+            <w:r>
+              <w:rPr>
+                <w:rFonts w:ascii="Aptos Narrow" w:hAnsi="Aptos Narrow"/>
+              </w:rPr>
+              <w:t>{{ data_rescisao }}</w:t>
             </w:r>
           </w:p>
         </w:tc>
@@ -372,31 +290,22 @@
                 <w:rFonts w:ascii="Aptos Narrow" w:hAnsi="Aptos Narrow"/>
                 <w:b/>
               </w:rPr>
-              <w:t xml:space="preserve">Tempo de </w:t>
-            </w:r>
-            <w:proofErr w:type="spellStart"/>
+              <w:t>Tempo de Servi</w:t>
+            </w:r>
             <w:r>
               <w:rPr>
                 <w:rFonts w:ascii="Aptos Narrow" w:hAnsi="Aptos Narrow"/>
                 <w:b/>
               </w:rPr>
-              <w:t>Servi</w:t>
+              <w:t>ç</w:t>
             </w:r>
             <w:r>
               <w:rPr>
                 <w:rFonts w:ascii="Aptos Narrow" w:hAnsi="Aptos Narrow"/>
                 <w:b/>
               </w:rPr>
-              <w:t>ç</w:t>
-            </w:r>
-            <w:r>
-              <w:rPr>
-                <w:rFonts w:ascii="Aptos Narrow" w:hAnsi="Aptos Narrow"/>
-                <w:b/>
-              </w:rPr>
               <w:t>o</w:t>
             </w:r>
-            <w:proofErr w:type="spellEnd"/>
           </w:p>
         </w:tc>
         <w:tc>
@@ -411,33 +320,11 @@
                 <w:rFonts w:ascii="Aptos Narrow" w:hAnsi="Aptos Narrow"/>
               </w:rPr>
             </w:pPr>
-            <w:proofErr w:type="gramStart"/>
-            <w:r>
-              <w:rPr>
-                <w:rFonts w:ascii="Aptos Narrow" w:hAnsi="Aptos Narrow"/>
-              </w:rPr>
-              <w:t xml:space="preserve">{{ </w:t>
-            </w:r>
-            <w:proofErr w:type="spellStart"/>
-            <w:r>
-              <w:rPr>
-                <w:rFonts w:ascii="Aptos Narrow" w:hAnsi="Aptos Narrow"/>
-              </w:rPr>
-              <w:t>tempo</w:t>
-            </w:r>
-            <w:proofErr w:type="gramEnd"/>
-            <w:r>
-              <w:rPr>
-                <w:rFonts w:ascii="Aptos Narrow" w:hAnsi="Aptos Narrow"/>
-              </w:rPr>
-              <w:t>_servico</w:t>
-            </w:r>
-            <w:proofErr w:type="spellEnd"/>
-            <w:r>
-              <w:rPr>
-                <w:rFonts w:ascii="Aptos Narrow" w:hAnsi="Aptos Narrow"/>
-              </w:rPr>
-              <w:t xml:space="preserve"> }}</w:t>
+            <w:r>
+              <w:rPr>
+                <w:rFonts w:ascii="Aptos Narrow" w:hAnsi="Aptos Narrow"/>
+              </w:rPr>
+              <w:t>{{ tempo_servico }}</w:t>
             </w:r>
           </w:p>
         </w:tc>
@@ -460,17 +347,8 @@
                 <w:rFonts w:ascii="Aptos Narrow" w:hAnsi="Aptos Narrow"/>
                 <w:b/>
               </w:rPr>
-              <w:t xml:space="preserve">Tipo do Aviso </w:t>
-            </w:r>
-            <w:proofErr w:type="spellStart"/>
-            <w:r>
-              <w:rPr>
-                <w:rFonts w:ascii="Aptos Narrow" w:hAnsi="Aptos Narrow"/>
-                <w:b/>
-              </w:rPr>
-              <w:t>Prévio</w:t>
-            </w:r>
-            <w:proofErr w:type="spellEnd"/>
+              <w:t>Tipo do Aviso Prévio</w:t>
+            </w:r>
           </w:p>
         </w:tc>
         <w:tc>
@@ -485,33 +363,11 @@
                 <w:rFonts w:ascii="Aptos Narrow" w:hAnsi="Aptos Narrow"/>
               </w:rPr>
             </w:pPr>
-            <w:proofErr w:type="gramStart"/>
-            <w:r>
-              <w:rPr>
-                <w:rFonts w:ascii="Aptos Narrow" w:hAnsi="Aptos Narrow"/>
-              </w:rPr>
-              <w:t xml:space="preserve">{{ </w:t>
-            </w:r>
-            <w:proofErr w:type="spellStart"/>
-            <w:r>
-              <w:rPr>
-                <w:rFonts w:ascii="Aptos Narrow" w:hAnsi="Aptos Narrow"/>
-              </w:rPr>
-              <w:t>aviso</w:t>
-            </w:r>
-            <w:proofErr w:type="gramEnd"/>
-            <w:r>
-              <w:rPr>
-                <w:rFonts w:ascii="Aptos Narrow" w:hAnsi="Aptos Narrow"/>
-              </w:rPr>
-              <w:t>_previo_label</w:t>
-            </w:r>
-            <w:proofErr w:type="spellEnd"/>
-            <w:r>
-              <w:rPr>
-                <w:rFonts w:ascii="Aptos Narrow" w:hAnsi="Aptos Narrow"/>
-              </w:rPr>
-              <w:t xml:space="preserve"> }}</w:t>
+            <w:r>
+              <w:rPr>
+                <w:rFonts w:ascii="Aptos Narrow" w:hAnsi="Aptos Narrow"/>
+              </w:rPr>
+              <w:t>{{ aviso_previo_label }}</w:t>
             </w:r>
           </w:p>
         </w:tc>
@@ -718,69 +574,29 @@
               </w:rPr>
               <w:t>{{</w:t>
             </w:r>
-            <w:proofErr w:type="spellStart"/>
-            <w:r>
-              <w:rPr>
-                <w:rFonts w:ascii="Aptos Narrow" w:eastAsia="Times New Roman" w:hAnsi="Aptos Narrow" w:cs="Times New Roman"/>
-                <w:color w:val="000000"/>
-                <w:kern w:val="0"/>
-                <w:sz w:val="22"/>
-                <w:szCs w:val="22"/>
-                <w:lang w:eastAsia="pt-BR"/>
-                <w14:ligatures w14:val="none"/>
-              </w:rPr>
-              <w:t>composicao_</w:t>
-            </w:r>
-            <w:proofErr w:type="gramStart"/>
-            <w:r>
-              <w:rPr>
-                <w:rFonts w:ascii="Aptos Narrow" w:eastAsia="Times New Roman" w:hAnsi="Aptos Narrow" w:cs="Times New Roman"/>
-                <w:color w:val="000000"/>
-                <w:kern w:val="0"/>
-                <w:sz w:val="22"/>
-                <w:szCs w:val="22"/>
-                <w:lang w:eastAsia="pt-BR"/>
-                <w14:ligatures w14:val="none"/>
-              </w:rPr>
-              <w:t>remuneracao</w:t>
-            </w:r>
-            <w:r>
-              <w:rPr>
-                <w:rFonts w:ascii="Aptos Narrow" w:eastAsia="Times New Roman" w:hAnsi="Aptos Narrow" w:cs="Times New Roman"/>
-                <w:color w:val="000000"/>
-                <w:kern w:val="0"/>
-                <w:sz w:val="22"/>
-                <w:szCs w:val="22"/>
-                <w:lang w:eastAsia="pt-BR"/>
-                <w14:ligatures w14:val="none"/>
-              </w:rPr>
-              <w:t>.salario</w:t>
-            </w:r>
-            <w:proofErr w:type="gramEnd"/>
-            <w:r>
-              <w:rPr>
-                <w:rFonts w:ascii="Aptos Narrow" w:eastAsia="Times New Roman" w:hAnsi="Aptos Narrow" w:cs="Times New Roman"/>
-                <w:color w:val="000000"/>
-                <w:kern w:val="0"/>
-                <w:sz w:val="22"/>
-                <w:szCs w:val="22"/>
-                <w:lang w:eastAsia="pt-BR"/>
-                <w14:ligatures w14:val="none"/>
-              </w:rPr>
-              <w:t>_base</w:t>
-            </w:r>
-            <w:proofErr w:type="spellEnd"/>
-            <w:r>
-              <w:rPr>
-                <w:rFonts w:ascii="Aptos Narrow" w:eastAsia="Times New Roman" w:hAnsi="Aptos Narrow" w:cs="Times New Roman"/>
-                <w:color w:val="000000"/>
-                <w:kern w:val="0"/>
-                <w:sz w:val="22"/>
-                <w:szCs w:val="22"/>
-                <w:lang w:eastAsia="pt-BR"/>
-                <w14:ligatures w14:val="none"/>
-              </w:rPr>
-              <w:t>}}</w:t>
+            <w:r>
+              <w:rPr>
+                <w:rFonts w:ascii="Aptos Narrow" w:eastAsia="Times New Roman" w:hAnsi="Aptos Narrow" w:cs="Times New Roman"/>
+                <w:color w:val="000000"/>
+                <w:kern w:val="0"/>
+                <w:sz w:val="22"/>
+                <w:szCs w:val="22"/>
+                <w:lang w:eastAsia="pt-BR"/>
+                <w14:ligatures w14:val="none"/>
+              </w:rPr>
+              <w:t>composicao_remuneracao</w:t>
+            </w:r>
+            <w:r>
+              <w:rPr>
+                <w:rFonts w:ascii="Aptos Narrow" w:eastAsia="Times New Roman" w:hAnsi="Aptos Narrow" w:cs="Times New Roman"/>
+                <w:color w:val="000000"/>
+                <w:kern w:val="0"/>
+                <w:sz w:val="22"/>
+                <w:szCs w:val="22"/>
+                <w:lang w:eastAsia="pt-BR"/>
+                <w14:ligatures w14:val="none"/>
+              </w:rPr>
+              <w:t>.salario_base}}</w:t>
             </w:r>
           </w:p>
         </w:tc>
@@ -857,7 +673,6 @@
                 <w14:ligatures w14:val="none"/>
               </w:rPr>
             </w:pPr>
-            <w:proofErr w:type="gramStart"/>
             <w:r>
               <w:rPr>
                 <w:rFonts w:ascii="Aptos Narrow" w:eastAsia="Times New Roman" w:hAnsi="Aptos Narrow" w:cs="Times New Roman"/>
@@ -882,70 +697,29 @@
               </w:rPr>
               <w:t xml:space="preserve"> </w:t>
             </w:r>
-            <w:proofErr w:type="spellStart"/>
-            <w:r>
-              <w:rPr>
-                <w:rFonts w:ascii="Aptos Narrow" w:eastAsia="Times New Roman" w:hAnsi="Aptos Narrow" w:cs="Times New Roman"/>
-                <w:color w:val="000000"/>
-                <w:kern w:val="0"/>
-                <w:sz w:val="22"/>
-                <w:szCs w:val="22"/>
-                <w:lang w:eastAsia="pt-BR"/>
-                <w14:ligatures w14:val="none"/>
-              </w:rPr>
-              <w:t>composicao</w:t>
-            </w:r>
-            <w:proofErr w:type="gramEnd"/>
-            <w:r>
-              <w:rPr>
-                <w:rFonts w:ascii="Aptos Narrow" w:eastAsia="Times New Roman" w:hAnsi="Aptos Narrow" w:cs="Times New Roman"/>
-                <w:color w:val="000000"/>
-                <w:kern w:val="0"/>
-                <w:sz w:val="22"/>
-                <w:szCs w:val="22"/>
-                <w:lang w:eastAsia="pt-BR"/>
-                <w14:ligatures w14:val="none"/>
-              </w:rPr>
-              <w:t>_</w:t>
-            </w:r>
-            <w:proofErr w:type="gramStart"/>
-            <w:r>
-              <w:rPr>
-                <w:rFonts w:ascii="Aptos Narrow" w:eastAsia="Times New Roman" w:hAnsi="Aptos Narrow" w:cs="Times New Roman"/>
-                <w:color w:val="000000"/>
-                <w:kern w:val="0"/>
-                <w:sz w:val="22"/>
-                <w:szCs w:val="22"/>
-                <w:lang w:eastAsia="pt-BR"/>
-                <w14:ligatures w14:val="none"/>
-              </w:rPr>
-              <w:t>remuneracao</w:t>
-            </w:r>
-            <w:r>
-              <w:rPr>
-                <w:rFonts w:ascii="Aptos Narrow" w:eastAsia="Times New Roman" w:hAnsi="Aptos Narrow" w:cs="Times New Roman"/>
-                <w:color w:val="000000"/>
-                <w:kern w:val="0"/>
-                <w:sz w:val="22"/>
-                <w:szCs w:val="22"/>
-                <w:lang w:eastAsia="pt-BR"/>
-                <w14:ligatures w14:val="none"/>
-              </w:rPr>
-              <w:t>.periculosidade</w:t>
-            </w:r>
-            <w:proofErr w:type="spellEnd"/>
-            <w:proofErr w:type="gramEnd"/>
-            <w:r>
-              <w:rPr>
-                <w:rFonts w:ascii="Aptos Narrow" w:eastAsia="Times New Roman" w:hAnsi="Aptos Narrow" w:cs="Times New Roman"/>
-                <w:color w:val="000000"/>
-                <w:kern w:val="0"/>
-                <w:sz w:val="22"/>
-                <w:szCs w:val="22"/>
-                <w:lang w:eastAsia="pt-BR"/>
-                <w14:ligatures w14:val="none"/>
-              </w:rPr>
-              <w:t>}}</w:t>
+            <w:r>
+              <w:rPr>
+                <w:rFonts w:ascii="Aptos Narrow" w:eastAsia="Times New Roman" w:hAnsi="Aptos Narrow" w:cs="Times New Roman"/>
+                <w:color w:val="000000"/>
+                <w:kern w:val="0"/>
+                <w:sz w:val="22"/>
+                <w:szCs w:val="22"/>
+                <w:lang w:eastAsia="pt-BR"/>
+                <w14:ligatures w14:val="none"/>
+              </w:rPr>
+              <w:t>composicao_remuneracao</w:t>
+            </w:r>
+            <w:r>
+              <w:rPr>
+                <w:rFonts w:ascii="Aptos Narrow" w:eastAsia="Times New Roman" w:hAnsi="Aptos Narrow" w:cs="Times New Roman"/>
+                <w:color w:val="000000"/>
+                <w:kern w:val="0"/>
+                <w:sz w:val="22"/>
+                <w:szCs w:val="22"/>
+                <w:lang w:eastAsia="pt-BR"/>
+                <w14:ligatures w14:val="none"/>
+              </w:rPr>
+              <w:t>.periculosidade}}</w:t>
             </w:r>
           </w:p>
         </w:tc>
@@ -1022,7 +796,6 @@
                 <w14:ligatures w14:val="none"/>
               </w:rPr>
             </w:pPr>
-            <w:proofErr w:type="gramStart"/>
             <w:r>
               <w:rPr>
                 <w:rFonts w:ascii="Aptos Narrow" w:eastAsia="Times New Roman" w:hAnsi="Aptos Narrow" w:cs="Times New Roman"/>
@@ -1047,70 +820,29 @@
               </w:rPr>
               <w:t xml:space="preserve"> </w:t>
             </w:r>
-            <w:proofErr w:type="spellStart"/>
-            <w:r>
-              <w:rPr>
-                <w:rFonts w:ascii="Aptos Narrow" w:eastAsia="Times New Roman" w:hAnsi="Aptos Narrow" w:cs="Times New Roman"/>
-                <w:color w:val="000000"/>
-                <w:kern w:val="0"/>
-                <w:sz w:val="22"/>
-                <w:szCs w:val="22"/>
-                <w:lang w:eastAsia="pt-BR"/>
-                <w14:ligatures w14:val="none"/>
-              </w:rPr>
-              <w:t>composicao</w:t>
-            </w:r>
-            <w:proofErr w:type="gramEnd"/>
-            <w:r>
-              <w:rPr>
-                <w:rFonts w:ascii="Aptos Narrow" w:eastAsia="Times New Roman" w:hAnsi="Aptos Narrow" w:cs="Times New Roman"/>
-                <w:color w:val="000000"/>
-                <w:kern w:val="0"/>
-                <w:sz w:val="22"/>
-                <w:szCs w:val="22"/>
-                <w:lang w:eastAsia="pt-BR"/>
-                <w14:ligatures w14:val="none"/>
-              </w:rPr>
-              <w:t>_</w:t>
-            </w:r>
-            <w:proofErr w:type="gramStart"/>
-            <w:r>
-              <w:rPr>
-                <w:rFonts w:ascii="Aptos Narrow" w:eastAsia="Times New Roman" w:hAnsi="Aptos Narrow" w:cs="Times New Roman"/>
-                <w:color w:val="000000"/>
-                <w:kern w:val="0"/>
-                <w:sz w:val="22"/>
-                <w:szCs w:val="22"/>
-                <w:lang w:eastAsia="pt-BR"/>
-                <w14:ligatures w14:val="none"/>
-              </w:rPr>
-              <w:t>remuneracao</w:t>
-            </w:r>
-            <w:r>
-              <w:rPr>
-                <w:rFonts w:ascii="Aptos Narrow" w:eastAsia="Times New Roman" w:hAnsi="Aptos Narrow" w:cs="Times New Roman"/>
-                <w:color w:val="000000"/>
-                <w:kern w:val="0"/>
-                <w:sz w:val="22"/>
-                <w:szCs w:val="22"/>
-                <w:lang w:eastAsia="pt-BR"/>
-                <w14:ligatures w14:val="none"/>
-              </w:rPr>
-              <w:t>.insalubridade</w:t>
-            </w:r>
-            <w:proofErr w:type="spellEnd"/>
-            <w:proofErr w:type="gramEnd"/>
-            <w:r>
-              <w:rPr>
-                <w:rFonts w:ascii="Aptos Narrow" w:eastAsia="Times New Roman" w:hAnsi="Aptos Narrow" w:cs="Times New Roman"/>
-                <w:color w:val="000000"/>
-                <w:kern w:val="0"/>
-                <w:sz w:val="22"/>
-                <w:szCs w:val="22"/>
-                <w:lang w:eastAsia="pt-BR"/>
-                <w14:ligatures w14:val="none"/>
-              </w:rPr>
-              <w:t>}}</w:t>
+            <w:r>
+              <w:rPr>
+                <w:rFonts w:ascii="Aptos Narrow" w:eastAsia="Times New Roman" w:hAnsi="Aptos Narrow" w:cs="Times New Roman"/>
+                <w:color w:val="000000"/>
+                <w:kern w:val="0"/>
+                <w:sz w:val="22"/>
+                <w:szCs w:val="22"/>
+                <w:lang w:eastAsia="pt-BR"/>
+                <w14:ligatures w14:val="none"/>
+              </w:rPr>
+              <w:t>composicao_remuneracao</w:t>
+            </w:r>
+            <w:r>
+              <w:rPr>
+                <w:rFonts w:ascii="Aptos Narrow" w:eastAsia="Times New Roman" w:hAnsi="Aptos Narrow" w:cs="Times New Roman"/>
+                <w:color w:val="000000"/>
+                <w:kern w:val="0"/>
+                <w:sz w:val="22"/>
+                <w:szCs w:val="22"/>
+                <w:lang w:eastAsia="pt-BR"/>
+                <w14:ligatures w14:val="none"/>
+              </w:rPr>
+              <w:t>.insalubridade}}</w:t>
             </w:r>
           </w:p>
         </w:tc>
@@ -1187,7 +919,6 @@
                 <w14:ligatures w14:val="none"/>
               </w:rPr>
             </w:pPr>
-            <w:proofErr w:type="gramStart"/>
             <w:r>
               <w:rPr>
                 <w:rFonts w:ascii="Aptos Narrow" w:eastAsia="Times New Roman" w:hAnsi="Aptos Narrow" w:cs="Times New Roman"/>
@@ -1212,70 +943,29 @@
               </w:rPr>
               <w:t xml:space="preserve"> </w:t>
             </w:r>
-            <w:proofErr w:type="spellStart"/>
-            <w:r>
-              <w:rPr>
-                <w:rFonts w:ascii="Aptos Narrow" w:eastAsia="Times New Roman" w:hAnsi="Aptos Narrow" w:cs="Times New Roman"/>
-                <w:color w:val="000000"/>
-                <w:kern w:val="0"/>
-                <w:sz w:val="22"/>
-                <w:szCs w:val="22"/>
-                <w:lang w:eastAsia="pt-BR"/>
-                <w14:ligatures w14:val="none"/>
-              </w:rPr>
-              <w:t>composicao</w:t>
-            </w:r>
-            <w:proofErr w:type="gramEnd"/>
-            <w:r>
-              <w:rPr>
-                <w:rFonts w:ascii="Aptos Narrow" w:eastAsia="Times New Roman" w:hAnsi="Aptos Narrow" w:cs="Times New Roman"/>
-                <w:color w:val="000000"/>
-                <w:kern w:val="0"/>
-                <w:sz w:val="22"/>
-                <w:szCs w:val="22"/>
-                <w:lang w:eastAsia="pt-BR"/>
-                <w14:ligatures w14:val="none"/>
-              </w:rPr>
-              <w:t>_</w:t>
-            </w:r>
-            <w:proofErr w:type="gramStart"/>
-            <w:r>
-              <w:rPr>
-                <w:rFonts w:ascii="Aptos Narrow" w:eastAsia="Times New Roman" w:hAnsi="Aptos Narrow" w:cs="Times New Roman"/>
-                <w:color w:val="000000"/>
-                <w:kern w:val="0"/>
-                <w:sz w:val="22"/>
-                <w:szCs w:val="22"/>
-                <w:lang w:eastAsia="pt-BR"/>
-                <w14:ligatures w14:val="none"/>
-              </w:rPr>
-              <w:t>remuneracao</w:t>
-            </w:r>
-            <w:r>
-              <w:rPr>
-                <w:rFonts w:ascii="Aptos Narrow" w:eastAsia="Times New Roman" w:hAnsi="Aptos Narrow" w:cs="Times New Roman"/>
-                <w:color w:val="000000"/>
-                <w:kern w:val="0"/>
-                <w:sz w:val="22"/>
-                <w:szCs w:val="22"/>
-                <w:lang w:eastAsia="pt-BR"/>
-                <w14:ligatures w14:val="none"/>
-              </w:rPr>
-              <w:t>.noturno</w:t>
-            </w:r>
-            <w:proofErr w:type="spellEnd"/>
-            <w:proofErr w:type="gramEnd"/>
-            <w:r>
-              <w:rPr>
-                <w:rFonts w:ascii="Aptos Narrow" w:eastAsia="Times New Roman" w:hAnsi="Aptos Narrow" w:cs="Times New Roman"/>
-                <w:color w:val="000000"/>
-                <w:kern w:val="0"/>
-                <w:sz w:val="22"/>
-                <w:szCs w:val="22"/>
-                <w:lang w:eastAsia="pt-BR"/>
-                <w14:ligatures w14:val="none"/>
-              </w:rPr>
-              <w:t xml:space="preserve"> }}</w:t>
+            <w:r>
+              <w:rPr>
+                <w:rFonts w:ascii="Aptos Narrow" w:eastAsia="Times New Roman" w:hAnsi="Aptos Narrow" w:cs="Times New Roman"/>
+                <w:color w:val="000000"/>
+                <w:kern w:val="0"/>
+                <w:sz w:val="22"/>
+                <w:szCs w:val="22"/>
+                <w:lang w:eastAsia="pt-BR"/>
+                <w14:ligatures w14:val="none"/>
+              </w:rPr>
+              <w:t>composicao_remuneracao</w:t>
+            </w:r>
+            <w:r>
+              <w:rPr>
+                <w:rFonts w:ascii="Aptos Narrow" w:eastAsia="Times New Roman" w:hAnsi="Aptos Narrow" w:cs="Times New Roman"/>
+                <w:color w:val="000000"/>
+                <w:kern w:val="0"/>
+                <w:sz w:val="22"/>
+                <w:szCs w:val="22"/>
+                <w:lang w:eastAsia="pt-BR"/>
+                <w14:ligatures w14:val="none"/>
+              </w:rPr>
+              <w:t>.noturno }}</w:t>
             </w:r>
           </w:p>
         </w:tc>
@@ -1352,7 +1042,6 @@
                 <w14:ligatures w14:val="none"/>
               </w:rPr>
             </w:pPr>
-            <w:proofErr w:type="gramStart"/>
             <w:r>
               <w:rPr>
                 <w:rFonts w:ascii="Aptos Narrow" w:eastAsia="Times New Roman" w:hAnsi="Aptos Narrow" w:cs="Times New Roman"/>
@@ -1377,82 +1066,29 @@
               </w:rPr>
               <w:t xml:space="preserve"> </w:t>
             </w:r>
-            <w:proofErr w:type="spellStart"/>
-            <w:r>
-              <w:rPr>
-                <w:rFonts w:ascii="Aptos Narrow" w:eastAsia="Times New Roman" w:hAnsi="Aptos Narrow" w:cs="Times New Roman"/>
-                <w:color w:val="000000"/>
-                <w:kern w:val="0"/>
-                <w:sz w:val="22"/>
-                <w:szCs w:val="22"/>
-                <w:lang w:eastAsia="pt-BR"/>
-                <w14:ligatures w14:val="none"/>
-              </w:rPr>
-              <w:t>composicao</w:t>
-            </w:r>
-            <w:proofErr w:type="gramEnd"/>
-            <w:r>
-              <w:rPr>
-                <w:rFonts w:ascii="Aptos Narrow" w:eastAsia="Times New Roman" w:hAnsi="Aptos Narrow" w:cs="Times New Roman"/>
-                <w:color w:val="000000"/>
-                <w:kern w:val="0"/>
-                <w:sz w:val="22"/>
-                <w:szCs w:val="22"/>
-                <w:lang w:eastAsia="pt-BR"/>
-                <w14:ligatures w14:val="none"/>
-              </w:rPr>
-              <w:t>_</w:t>
-            </w:r>
-            <w:proofErr w:type="gramStart"/>
-            <w:r>
-              <w:rPr>
-                <w:rFonts w:ascii="Aptos Narrow" w:eastAsia="Times New Roman" w:hAnsi="Aptos Narrow" w:cs="Times New Roman"/>
-                <w:color w:val="000000"/>
-                <w:kern w:val="0"/>
-                <w:sz w:val="22"/>
-                <w:szCs w:val="22"/>
-                <w:lang w:eastAsia="pt-BR"/>
-                <w14:ligatures w14:val="none"/>
-              </w:rPr>
-              <w:t>remuneracao</w:t>
-            </w:r>
-            <w:r>
-              <w:rPr>
-                <w:rFonts w:ascii="Aptos Narrow" w:eastAsia="Times New Roman" w:hAnsi="Aptos Narrow" w:cs="Times New Roman"/>
-                <w:color w:val="000000"/>
-                <w:kern w:val="0"/>
-                <w:sz w:val="22"/>
-                <w:szCs w:val="22"/>
-                <w:lang w:eastAsia="pt-BR"/>
-                <w14:ligatures w14:val="none"/>
-              </w:rPr>
-              <w:t>.outras</w:t>
-            </w:r>
-            <w:proofErr w:type="gramEnd"/>
-            <w:r>
-              <w:rPr>
-                <w:rFonts w:ascii="Aptos Narrow" w:eastAsia="Times New Roman" w:hAnsi="Aptos Narrow" w:cs="Times New Roman"/>
-                <w:color w:val="000000"/>
-                <w:kern w:val="0"/>
-                <w:sz w:val="22"/>
-                <w:szCs w:val="22"/>
-                <w:lang w:eastAsia="pt-BR"/>
-                <w14:ligatures w14:val="none"/>
-              </w:rPr>
-              <w:t>_verbas</w:t>
-            </w:r>
-            <w:proofErr w:type="spellEnd"/>
-            <w:r>
-              <w:rPr>
-                <w:rFonts w:ascii="Aptos Narrow" w:eastAsia="Times New Roman" w:hAnsi="Aptos Narrow" w:cs="Times New Roman"/>
-                <w:color w:val="000000"/>
-                <w:kern w:val="0"/>
-                <w:sz w:val="22"/>
-                <w:szCs w:val="22"/>
-                <w:lang w:eastAsia="pt-BR"/>
-                <w14:ligatures w14:val="none"/>
-              </w:rPr>
-              <w:t>}}</w:t>
+            <w:r>
+              <w:rPr>
+                <w:rFonts w:ascii="Aptos Narrow" w:eastAsia="Times New Roman" w:hAnsi="Aptos Narrow" w:cs="Times New Roman"/>
+                <w:color w:val="000000"/>
+                <w:kern w:val="0"/>
+                <w:sz w:val="22"/>
+                <w:szCs w:val="22"/>
+                <w:lang w:eastAsia="pt-BR"/>
+                <w14:ligatures w14:val="none"/>
+              </w:rPr>
+              <w:t>composicao_remuneracao</w:t>
+            </w:r>
+            <w:r>
+              <w:rPr>
+                <w:rFonts w:ascii="Aptos Narrow" w:eastAsia="Times New Roman" w:hAnsi="Aptos Narrow" w:cs="Times New Roman"/>
+                <w:color w:val="000000"/>
+                <w:kern w:val="0"/>
+                <w:sz w:val="22"/>
+                <w:szCs w:val="22"/>
+                <w:lang w:eastAsia="pt-BR"/>
+                <w14:ligatures w14:val="none"/>
+              </w:rPr>
+              <w:t>.outras_verbas}}</w:t>
             </w:r>
           </w:p>
         </w:tc>
@@ -1559,7 +1195,6 @@
               </w:rPr>
               <w:t>{{</w:t>
             </w:r>
-            <w:proofErr w:type="spellStart"/>
             <w:r>
               <w:rPr>
                 <w:rFonts w:ascii="Aptos Narrow" w:eastAsia="Times New Roman" w:hAnsi="Aptos Narrow" w:cs="Times New Roman"/>
@@ -1572,7 +1207,6 @@
               </w:rPr>
               <w:t>remuneracao_bruta</w:t>
             </w:r>
-            <w:proofErr w:type="spellEnd"/>
             <w:r>
               <w:rPr>
                 <w:rFonts w:ascii="Aptos Narrow" w:eastAsia="Times New Roman" w:hAnsi="Aptos Narrow" w:cs="Times New Roman"/>
@@ -1597,10 +1231,12 @@
     <w:p>
       <w:pPr>
         <w:pStyle w:val="Ttulo2"/>
-        <w:spacing w:before="0"/>
       </w:pPr>
       <w:r>
-        <w:t>Detalhamento das Verbas Rescisórias</w:t>
+        <w:t>D</w:t>
+      </w:r>
+      <w:r>
+        <w:t>etalhamento das Verbas Rescisórias</w:t>
       </w:r>
     </w:p>
     <w:tbl>
@@ -1831,85 +1467,31 @@
                 <w:lang w:eastAsia="pt-BR"/>
                 <w14:ligatures w14:val="none"/>
               </w:rPr>
-              <w:t>{{</w:t>
-            </w:r>
-            <w:proofErr w:type="spellStart"/>
-            <w:proofErr w:type="gramStart"/>
-            <w:r>
-              <w:rPr>
-                <w:rFonts w:ascii="Aptos Narrow" w:eastAsia="Times New Roman" w:hAnsi="Aptos Narrow" w:cs="Times New Roman"/>
-                <w:color w:val="000000"/>
-                <w:kern w:val="0"/>
-                <w:sz w:val="22"/>
-                <w:szCs w:val="22"/>
-                <w:lang w:eastAsia="pt-BR"/>
-                <w14:ligatures w14:val="none"/>
-              </w:rPr>
-              <w:t>verbas.</w:t>
-            </w:r>
-            <w:r>
-              <w:rPr>
-                <w:rFonts w:ascii="Aptos Narrow" w:eastAsia="Times New Roman" w:hAnsi="Aptos Narrow" w:cs="Times New Roman"/>
-                <w:color w:val="000000"/>
-                <w:kern w:val="0"/>
-                <w:sz w:val="22"/>
-                <w:szCs w:val="22"/>
-                <w:lang w:eastAsia="pt-BR"/>
-                <w14:ligatures w14:val="none"/>
-              </w:rPr>
-              <w:t>saldo</w:t>
-            </w:r>
-            <w:proofErr w:type="gramEnd"/>
-            <w:r>
-              <w:rPr>
-                <w:rFonts w:ascii="Aptos Narrow" w:eastAsia="Times New Roman" w:hAnsi="Aptos Narrow" w:cs="Times New Roman"/>
-                <w:color w:val="000000"/>
-                <w:kern w:val="0"/>
-                <w:sz w:val="22"/>
-                <w:szCs w:val="22"/>
-                <w:lang w:eastAsia="pt-BR"/>
-                <w14:ligatures w14:val="none"/>
-              </w:rPr>
-              <w:t>_</w:t>
-            </w:r>
-            <w:proofErr w:type="gramStart"/>
-            <w:r>
-              <w:rPr>
-                <w:rFonts w:ascii="Aptos Narrow" w:eastAsia="Times New Roman" w:hAnsi="Aptos Narrow" w:cs="Times New Roman"/>
-                <w:color w:val="000000"/>
-                <w:kern w:val="0"/>
-                <w:sz w:val="22"/>
-                <w:szCs w:val="22"/>
-                <w:lang w:eastAsia="pt-BR"/>
-                <w14:ligatures w14:val="none"/>
-              </w:rPr>
-              <w:t>salario</w:t>
-            </w:r>
-            <w:r>
-              <w:rPr>
-                <w:rFonts w:ascii="Aptos Narrow" w:eastAsia="Times New Roman" w:hAnsi="Aptos Narrow" w:cs="Times New Roman"/>
-                <w:color w:val="000000"/>
-                <w:kern w:val="0"/>
-                <w:sz w:val="22"/>
-                <w:szCs w:val="22"/>
-                <w:lang w:eastAsia="pt-BR"/>
-                <w14:ligatures w14:val="none"/>
-              </w:rPr>
-              <w:t>.detalhe</w:t>
-            </w:r>
-            <w:proofErr w:type="spellEnd"/>
-            <w:proofErr w:type="gramEnd"/>
-            <w:r>
-              <w:rPr>
-                <w:rFonts w:ascii="Aptos Narrow" w:eastAsia="Times New Roman" w:hAnsi="Aptos Narrow" w:cs="Times New Roman"/>
-                <w:color w:val="000000"/>
-                <w:kern w:val="0"/>
-                <w:sz w:val="22"/>
-                <w:szCs w:val="22"/>
-                <w:lang w:eastAsia="pt-BR"/>
-                <w14:ligatures w14:val="none"/>
-              </w:rPr>
-              <w:t>}}</w:t>
+              <w:t>{{verbas.</w:t>
+            </w:r>
+            <w:r>
+              <w:rPr>
+                <w:rFonts w:ascii="Aptos Narrow" w:eastAsia="Times New Roman" w:hAnsi="Aptos Narrow" w:cs="Times New Roman"/>
+                <w:color w:val="000000"/>
+                <w:kern w:val="0"/>
+                <w:sz w:val="22"/>
+                <w:szCs w:val="22"/>
+                <w:lang w:eastAsia="pt-BR"/>
+                <w14:ligatures w14:val="none"/>
+              </w:rPr>
+              <w:t>saldo_salario</w:t>
+            </w:r>
+            <w:r>
+              <w:rPr>
+                <w:rFonts w:ascii="Aptos Narrow" w:eastAsia="Times New Roman" w:hAnsi="Aptos Narrow" w:cs="Times New Roman"/>
+                <w:color w:val="000000"/>
+                <w:kern w:val="0"/>
+                <w:sz w:val="22"/>
+                <w:szCs w:val="22"/>
+                <w:lang w:eastAsia="pt-BR"/>
+                <w14:ligatures w14:val="none"/>
+              </w:rPr>
+              <w:t>.detalhe}}</w:t>
             </w:r>
           </w:p>
         </w:tc>
@@ -1950,85 +1532,31 @@
                 <w:lang w:eastAsia="pt-BR"/>
                 <w14:ligatures w14:val="none"/>
               </w:rPr>
-              <w:t>{{</w:t>
-            </w:r>
-            <w:proofErr w:type="spellStart"/>
-            <w:proofErr w:type="gramStart"/>
-            <w:r>
-              <w:rPr>
-                <w:rFonts w:ascii="Aptos Narrow" w:eastAsia="Times New Roman" w:hAnsi="Aptos Narrow" w:cs="Times New Roman"/>
-                <w:color w:val="000000"/>
-                <w:kern w:val="0"/>
-                <w:sz w:val="22"/>
-                <w:szCs w:val="22"/>
-                <w:lang w:eastAsia="pt-BR"/>
-                <w14:ligatures w14:val="none"/>
-              </w:rPr>
-              <w:t>verbas.</w:t>
-            </w:r>
-            <w:r>
-              <w:rPr>
-                <w:rFonts w:ascii="Aptos Narrow" w:eastAsia="Times New Roman" w:hAnsi="Aptos Narrow" w:cs="Times New Roman"/>
-                <w:color w:val="000000"/>
-                <w:kern w:val="0"/>
-                <w:sz w:val="22"/>
-                <w:szCs w:val="22"/>
-                <w:lang w:eastAsia="pt-BR"/>
-                <w14:ligatures w14:val="none"/>
-              </w:rPr>
-              <w:t>saldo</w:t>
-            </w:r>
-            <w:proofErr w:type="gramEnd"/>
-            <w:r>
-              <w:rPr>
-                <w:rFonts w:ascii="Aptos Narrow" w:eastAsia="Times New Roman" w:hAnsi="Aptos Narrow" w:cs="Times New Roman"/>
-                <w:color w:val="000000"/>
-                <w:kern w:val="0"/>
-                <w:sz w:val="22"/>
-                <w:szCs w:val="22"/>
-                <w:lang w:eastAsia="pt-BR"/>
-                <w14:ligatures w14:val="none"/>
-              </w:rPr>
-              <w:t>_</w:t>
-            </w:r>
-            <w:proofErr w:type="gramStart"/>
-            <w:r>
-              <w:rPr>
-                <w:rFonts w:ascii="Aptos Narrow" w:eastAsia="Times New Roman" w:hAnsi="Aptos Narrow" w:cs="Times New Roman"/>
-                <w:color w:val="000000"/>
-                <w:kern w:val="0"/>
-                <w:sz w:val="22"/>
-                <w:szCs w:val="22"/>
-                <w:lang w:eastAsia="pt-BR"/>
-                <w14:ligatures w14:val="none"/>
-              </w:rPr>
-              <w:t>salario</w:t>
-            </w:r>
-            <w:r>
-              <w:rPr>
-                <w:rFonts w:ascii="Aptos Narrow" w:eastAsia="Times New Roman" w:hAnsi="Aptos Narrow" w:cs="Times New Roman"/>
-                <w:color w:val="000000"/>
-                <w:kern w:val="0"/>
-                <w:sz w:val="22"/>
-                <w:szCs w:val="22"/>
-                <w:lang w:eastAsia="pt-BR"/>
-                <w14:ligatures w14:val="none"/>
-              </w:rPr>
-              <w:t>.valor</w:t>
-            </w:r>
-            <w:proofErr w:type="spellEnd"/>
-            <w:proofErr w:type="gramEnd"/>
-            <w:r>
-              <w:rPr>
-                <w:rFonts w:ascii="Aptos Narrow" w:eastAsia="Times New Roman" w:hAnsi="Aptos Narrow" w:cs="Times New Roman"/>
-                <w:color w:val="000000"/>
-                <w:kern w:val="0"/>
-                <w:sz w:val="22"/>
-                <w:szCs w:val="22"/>
-                <w:lang w:eastAsia="pt-BR"/>
-                <w14:ligatures w14:val="none"/>
-              </w:rPr>
-              <w:t>}}</w:t>
+              <w:t>{{verbas.</w:t>
+            </w:r>
+            <w:r>
+              <w:rPr>
+                <w:rFonts w:ascii="Aptos Narrow" w:eastAsia="Times New Roman" w:hAnsi="Aptos Narrow" w:cs="Times New Roman"/>
+                <w:color w:val="000000"/>
+                <w:kern w:val="0"/>
+                <w:sz w:val="22"/>
+                <w:szCs w:val="22"/>
+                <w:lang w:eastAsia="pt-BR"/>
+                <w14:ligatures w14:val="none"/>
+              </w:rPr>
+              <w:t>saldo_salario</w:t>
+            </w:r>
+            <w:r>
+              <w:rPr>
+                <w:rFonts w:ascii="Aptos Narrow" w:eastAsia="Times New Roman" w:hAnsi="Aptos Narrow" w:cs="Times New Roman"/>
+                <w:color w:val="000000"/>
+                <w:kern w:val="0"/>
+                <w:sz w:val="22"/>
+                <w:szCs w:val="22"/>
+                <w:lang w:eastAsia="pt-BR"/>
+                <w14:ligatures w14:val="none"/>
+              </w:rPr>
+              <w:t>.valor}}</w:t>
             </w:r>
           </w:p>
         </w:tc>
@@ -2115,85 +1643,31 @@
                 <w:lang w:eastAsia="pt-BR"/>
                 <w14:ligatures w14:val="none"/>
               </w:rPr>
-              <w:t>{{</w:t>
-            </w:r>
-            <w:proofErr w:type="spellStart"/>
-            <w:proofErr w:type="gramStart"/>
-            <w:r>
-              <w:rPr>
-                <w:rFonts w:ascii="Aptos Narrow" w:eastAsia="Times New Roman" w:hAnsi="Aptos Narrow" w:cs="Times New Roman"/>
-                <w:color w:val="000000"/>
-                <w:kern w:val="0"/>
-                <w:sz w:val="22"/>
-                <w:szCs w:val="22"/>
-                <w:lang w:eastAsia="pt-BR"/>
-                <w14:ligatures w14:val="none"/>
-              </w:rPr>
-              <w:t>verbas.</w:t>
-            </w:r>
-            <w:r>
-              <w:rPr>
-                <w:rFonts w:ascii="Aptos Narrow" w:eastAsia="Times New Roman" w:hAnsi="Aptos Narrow" w:cs="Times New Roman"/>
-                <w:color w:val="000000"/>
-                <w:kern w:val="0"/>
-                <w:sz w:val="22"/>
-                <w:szCs w:val="22"/>
-                <w:lang w:eastAsia="pt-BR"/>
-                <w14:ligatures w14:val="none"/>
-              </w:rPr>
-              <w:t>aviso</w:t>
-            </w:r>
-            <w:proofErr w:type="gramEnd"/>
-            <w:r>
-              <w:rPr>
-                <w:rFonts w:ascii="Aptos Narrow" w:eastAsia="Times New Roman" w:hAnsi="Aptos Narrow" w:cs="Times New Roman"/>
-                <w:color w:val="000000"/>
-                <w:kern w:val="0"/>
-                <w:sz w:val="22"/>
-                <w:szCs w:val="22"/>
-                <w:lang w:eastAsia="pt-BR"/>
-                <w14:ligatures w14:val="none"/>
-              </w:rPr>
-              <w:t>_</w:t>
-            </w:r>
-            <w:proofErr w:type="gramStart"/>
-            <w:r>
-              <w:rPr>
-                <w:rFonts w:ascii="Aptos Narrow" w:eastAsia="Times New Roman" w:hAnsi="Aptos Narrow" w:cs="Times New Roman"/>
-                <w:color w:val="000000"/>
-                <w:kern w:val="0"/>
-                <w:sz w:val="22"/>
-                <w:szCs w:val="22"/>
-                <w:lang w:eastAsia="pt-BR"/>
-                <w14:ligatures w14:val="none"/>
-              </w:rPr>
-              <w:t>previo</w:t>
-            </w:r>
-            <w:r>
-              <w:rPr>
-                <w:rFonts w:ascii="Aptos Narrow" w:eastAsia="Times New Roman" w:hAnsi="Aptos Narrow" w:cs="Times New Roman"/>
-                <w:color w:val="000000"/>
-                <w:kern w:val="0"/>
-                <w:sz w:val="22"/>
-                <w:szCs w:val="22"/>
-                <w:lang w:eastAsia="pt-BR"/>
-                <w14:ligatures w14:val="none"/>
-              </w:rPr>
-              <w:t>.detalhe</w:t>
-            </w:r>
-            <w:proofErr w:type="spellEnd"/>
-            <w:proofErr w:type="gramEnd"/>
-            <w:r>
-              <w:rPr>
-                <w:rFonts w:ascii="Aptos Narrow" w:eastAsia="Times New Roman" w:hAnsi="Aptos Narrow" w:cs="Times New Roman"/>
-                <w:color w:val="000000"/>
-                <w:kern w:val="0"/>
-                <w:sz w:val="22"/>
-                <w:szCs w:val="22"/>
-                <w:lang w:eastAsia="pt-BR"/>
-                <w14:ligatures w14:val="none"/>
-              </w:rPr>
-              <w:t>}}</w:t>
+              <w:t>{{verbas.</w:t>
+            </w:r>
+            <w:r>
+              <w:rPr>
+                <w:rFonts w:ascii="Aptos Narrow" w:eastAsia="Times New Roman" w:hAnsi="Aptos Narrow" w:cs="Times New Roman"/>
+                <w:color w:val="000000"/>
+                <w:kern w:val="0"/>
+                <w:sz w:val="22"/>
+                <w:szCs w:val="22"/>
+                <w:lang w:eastAsia="pt-BR"/>
+                <w14:ligatures w14:val="none"/>
+              </w:rPr>
+              <w:t>aviso_previo</w:t>
+            </w:r>
+            <w:r>
+              <w:rPr>
+                <w:rFonts w:ascii="Aptos Narrow" w:eastAsia="Times New Roman" w:hAnsi="Aptos Narrow" w:cs="Times New Roman"/>
+                <w:color w:val="000000"/>
+                <w:kern w:val="0"/>
+                <w:sz w:val="22"/>
+                <w:szCs w:val="22"/>
+                <w:lang w:eastAsia="pt-BR"/>
+                <w14:ligatures w14:val="none"/>
+              </w:rPr>
+              <w:t>.detalhe}}</w:t>
             </w:r>
           </w:p>
         </w:tc>
@@ -2234,85 +1708,31 @@
                 <w:lang w:eastAsia="pt-BR"/>
                 <w14:ligatures w14:val="none"/>
               </w:rPr>
-              <w:t>{{</w:t>
-            </w:r>
-            <w:proofErr w:type="spellStart"/>
-            <w:proofErr w:type="gramStart"/>
-            <w:r>
-              <w:rPr>
-                <w:rFonts w:ascii="Aptos Narrow" w:eastAsia="Times New Roman" w:hAnsi="Aptos Narrow" w:cs="Times New Roman"/>
-                <w:color w:val="000000"/>
-                <w:kern w:val="0"/>
-                <w:sz w:val="22"/>
-                <w:szCs w:val="22"/>
-                <w:lang w:eastAsia="pt-BR"/>
-                <w14:ligatures w14:val="none"/>
-              </w:rPr>
-              <w:t>verbas.</w:t>
-            </w:r>
-            <w:r>
-              <w:rPr>
-                <w:rFonts w:ascii="Aptos Narrow" w:eastAsia="Times New Roman" w:hAnsi="Aptos Narrow" w:cs="Times New Roman"/>
-                <w:color w:val="000000"/>
-                <w:kern w:val="0"/>
-                <w:sz w:val="22"/>
-                <w:szCs w:val="22"/>
-                <w:lang w:eastAsia="pt-BR"/>
-                <w14:ligatures w14:val="none"/>
-              </w:rPr>
-              <w:t>aviso</w:t>
-            </w:r>
-            <w:proofErr w:type="gramEnd"/>
-            <w:r>
-              <w:rPr>
-                <w:rFonts w:ascii="Aptos Narrow" w:eastAsia="Times New Roman" w:hAnsi="Aptos Narrow" w:cs="Times New Roman"/>
-                <w:color w:val="000000"/>
-                <w:kern w:val="0"/>
-                <w:sz w:val="22"/>
-                <w:szCs w:val="22"/>
-                <w:lang w:eastAsia="pt-BR"/>
-                <w14:ligatures w14:val="none"/>
-              </w:rPr>
-              <w:t>_</w:t>
-            </w:r>
-            <w:proofErr w:type="gramStart"/>
-            <w:r>
-              <w:rPr>
-                <w:rFonts w:ascii="Aptos Narrow" w:eastAsia="Times New Roman" w:hAnsi="Aptos Narrow" w:cs="Times New Roman"/>
-                <w:color w:val="000000"/>
-                <w:kern w:val="0"/>
-                <w:sz w:val="22"/>
-                <w:szCs w:val="22"/>
-                <w:lang w:eastAsia="pt-BR"/>
-                <w14:ligatures w14:val="none"/>
-              </w:rPr>
-              <w:t>previo</w:t>
-            </w:r>
-            <w:r>
-              <w:rPr>
-                <w:rFonts w:ascii="Aptos Narrow" w:eastAsia="Times New Roman" w:hAnsi="Aptos Narrow" w:cs="Times New Roman"/>
-                <w:color w:val="000000"/>
-                <w:kern w:val="0"/>
-                <w:sz w:val="22"/>
-                <w:szCs w:val="22"/>
-                <w:lang w:eastAsia="pt-BR"/>
-                <w14:ligatures w14:val="none"/>
-              </w:rPr>
-              <w:t>.valor</w:t>
-            </w:r>
-            <w:proofErr w:type="spellEnd"/>
-            <w:proofErr w:type="gramEnd"/>
-            <w:r>
-              <w:rPr>
-                <w:rFonts w:ascii="Aptos Narrow" w:eastAsia="Times New Roman" w:hAnsi="Aptos Narrow" w:cs="Times New Roman"/>
-                <w:color w:val="000000"/>
-                <w:kern w:val="0"/>
-                <w:sz w:val="22"/>
-                <w:szCs w:val="22"/>
-                <w:lang w:eastAsia="pt-BR"/>
-                <w14:ligatures w14:val="none"/>
-              </w:rPr>
-              <w:t>}}</w:t>
+              <w:t>{{verbas.</w:t>
+            </w:r>
+            <w:r>
+              <w:rPr>
+                <w:rFonts w:ascii="Aptos Narrow" w:eastAsia="Times New Roman" w:hAnsi="Aptos Narrow" w:cs="Times New Roman"/>
+                <w:color w:val="000000"/>
+                <w:kern w:val="0"/>
+                <w:sz w:val="22"/>
+                <w:szCs w:val="22"/>
+                <w:lang w:eastAsia="pt-BR"/>
+                <w14:ligatures w14:val="none"/>
+              </w:rPr>
+              <w:t>aviso_previo</w:t>
+            </w:r>
+            <w:r>
+              <w:rPr>
+                <w:rFonts w:ascii="Aptos Narrow" w:eastAsia="Times New Roman" w:hAnsi="Aptos Narrow" w:cs="Times New Roman"/>
+                <w:color w:val="000000"/>
+                <w:kern w:val="0"/>
+                <w:sz w:val="22"/>
+                <w:szCs w:val="22"/>
+                <w:lang w:eastAsia="pt-BR"/>
+                <w14:ligatures w14:val="none"/>
+              </w:rPr>
+              <w:t>.valor}}</w:t>
             </w:r>
           </w:p>
         </w:tc>
@@ -2399,61 +1819,7 @@
                 <w:lang w:eastAsia="pt-BR"/>
                 <w14:ligatures w14:val="none"/>
               </w:rPr>
-              <w:t>{{</w:t>
-            </w:r>
-            <w:proofErr w:type="spellStart"/>
-            <w:proofErr w:type="gramStart"/>
-            <w:r>
-              <w:rPr>
-                <w:rFonts w:ascii="Aptos Narrow" w:eastAsia="Times New Roman" w:hAnsi="Aptos Narrow" w:cs="Times New Roman"/>
-                <w:color w:val="000000"/>
-                <w:kern w:val="0"/>
-                <w:sz w:val="22"/>
-                <w:szCs w:val="22"/>
-                <w:lang w:eastAsia="pt-BR"/>
-                <w14:ligatures w14:val="none"/>
-              </w:rPr>
-              <w:t>verbas.ferias</w:t>
-            </w:r>
-            <w:proofErr w:type="gramEnd"/>
-            <w:r>
-              <w:rPr>
-                <w:rFonts w:ascii="Aptos Narrow" w:eastAsia="Times New Roman" w:hAnsi="Aptos Narrow" w:cs="Times New Roman"/>
-                <w:color w:val="000000"/>
-                <w:kern w:val="0"/>
-                <w:sz w:val="22"/>
-                <w:szCs w:val="22"/>
-                <w:lang w:eastAsia="pt-BR"/>
-                <w14:ligatures w14:val="none"/>
-              </w:rPr>
-              <w:t>_</w:t>
-            </w:r>
-            <w:proofErr w:type="gramStart"/>
-            <w:r>
-              <w:rPr>
-                <w:rFonts w:ascii="Aptos Narrow" w:eastAsia="Times New Roman" w:hAnsi="Aptos Narrow" w:cs="Times New Roman"/>
-                <w:color w:val="000000"/>
-                <w:kern w:val="0"/>
-                <w:sz w:val="22"/>
-                <w:szCs w:val="22"/>
-                <w:lang w:eastAsia="pt-BR"/>
-                <w14:ligatures w14:val="none"/>
-              </w:rPr>
-              <w:t>vencidas.detalhe</w:t>
-            </w:r>
-            <w:proofErr w:type="spellEnd"/>
-            <w:proofErr w:type="gramEnd"/>
-            <w:r>
-              <w:rPr>
-                <w:rFonts w:ascii="Aptos Narrow" w:eastAsia="Times New Roman" w:hAnsi="Aptos Narrow" w:cs="Times New Roman"/>
-                <w:color w:val="000000"/>
-                <w:kern w:val="0"/>
-                <w:sz w:val="22"/>
-                <w:szCs w:val="22"/>
-                <w:lang w:eastAsia="pt-BR"/>
-                <w14:ligatures w14:val="none"/>
-              </w:rPr>
-              <w:t>}}</w:t>
+              <w:t>{{verbas.ferias_vencidas.detalhe}}</w:t>
             </w:r>
           </w:p>
         </w:tc>
@@ -2494,61 +1860,7 @@
                 <w:lang w:eastAsia="pt-BR"/>
                 <w14:ligatures w14:val="none"/>
               </w:rPr>
-              <w:t>{{</w:t>
-            </w:r>
-            <w:proofErr w:type="spellStart"/>
-            <w:proofErr w:type="gramStart"/>
-            <w:r>
-              <w:rPr>
-                <w:rFonts w:ascii="Aptos Narrow" w:eastAsia="Times New Roman" w:hAnsi="Aptos Narrow" w:cs="Times New Roman"/>
-                <w:color w:val="000000"/>
-                <w:kern w:val="0"/>
-                <w:sz w:val="22"/>
-                <w:szCs w:val="22"/>
-                <w:lang w:eastAsia="pt-BR"/>
-                <w14:ligatures w14:val="none"/>
-              </w:rPr>
-              <w:t>verbas.ferias</w:t>
-            </w:r>
-            <w:proofErr w:type="gramEnd"/>
-            <w:r>
-              <w:rPr>
-                <w:rFonts w:ascii="Aptos Narrow" w:eastAsia="Times New Roman" w:hAnsi="Aptos Narrow" w:cs="Times New Roman"/>
-                <w:color w:val="000000"/>
-                <w:kern w:val="0"/>
-                <w:sz w:val="22"/>
-                <w:szCs w:val="22"/>
-                <w:lang w:eastAsia="pt-BR"/>
-                <w14:ligatures w14:val="none"/>
-              </w:rPr>
-              <w:t>_</w:t>
-            </w:r>
-            <w:proofErr w:type="gramStart"/>
-            <w:r>
-              <w:rPr>
-                <w:rFonts w:ascii="Aptos Narrow" w:eastAsia="Times New Roman" w:hAnsi="Aptos Narrow" w:cs="Times New Roman"/>
-                <w:color w:val="000000"/>
-                <w:kern w:val="0"/>
-                <w:sz w:val="22"/>
-                <w:szCs w:val="22"/>
-                <w:lang w:eastAsia="pt-BR"/>
-                <w14:ligatures w14:val="none"/>
-              </w:rPr>
-              <w:t>vencidas.valor</w:t>
-            </w:r>
-            <w:proofErr w:type="spellEnd"/>
-            <w:proofErr w:type="gramEnd"/>
-            <w:r>
-              <w:rPr>
-                <w:rFonts w:ascii="Aptos Narrow" w:eastAsia="Times New Roman" w:hAnsi="Aptos Narrow" w:cs="Times New Roman"/>
-                <w:color w:val="000000"/>
-                <w:kern w:val="0"/>
-                <w:sz w:val="22"/>
-                <w:szCs w:val="22"/>
-                <w:lang w:eastAsia="pt-BR"/>
-                <w14:ligatures w14:val="none"/>
-              </w:rPr>
-              <w:t>}}</w:t>
+              <w:t>{{verbas.ferias_vencidas.valor}}</w:t>
             </w:r>
           </w:p>
         </w:tc>
@@ -2635,61 +1947,7 @@
                 <w:lang w:eastAsia="pt-BR"/>
                 <w14:ligatures w14:val="none"/>
               </w:rPr>
-              <w:t>{{</w:t>
-            </w:r>
-            <w:proofErr w:type="spellStart"/>
-            <w:proofErr w:type="gramStart"/>
-            <w:r>
-              <w:rPr>
-                <w:rFonts w:ascii="Aptos Narrow" w:eastAsia="Times New Roman" w:hAnsi="Aptos Narrow" w:cs="Times New Roman"/>
-                <w:color w:val="000000"/>
-                <w:kern w:val="0"/>
-                <w:sz w:val="22"/>
-                <w:szCs w:val="22"/>
-                <w:lang w:eastAsia="pt-BR"/>
-                <w14:ligatures w14:val="none"/>
-              </w:rPr>
-              <w:t>verbas.ferias</w:t>
-            </w:r>
-            <w:proofErr w:type="gramEnd"/>
-            <w:r>
-              <w:rPr>
-                <w:rFonts w:ascii="Aptos Narrow" w:eastAsia="Times New Roman" w:hAnsi="Aptos Narrow" w:cs="Times New Roman"/>
-                <w:color w:val="000000"/>
-                <w:kern w:val="0"/>
-                <w:sz w:val="22"/>
-                <w:szCs w:val="22"/>
-                <w:lang w:eastAsia="pt-BR"/>
-                <w14:ligatures w14:val="none"/>
-              </w:rPr>
-              <w:t>_</w:t>
-            </w:r>
-            <w:proofErr w:type="gramStart"/>
-            <w:r>
-              <w:rPr>
-                <w:rFonts w:ascii="Aptos Narrow" w:eastAsia="Times New Roman" w:hAnsi="Aptos Narrow" w:cs="Times New Roman"/>
-                <w:color w:val="000000"/>
-                <w:kern w:val="0"/>
-                <w:sz w:val="22"/>
-                <w:szCs w:val="22"/>
-                <w:lang w:eastAsia="pt-BR"/>
-                <w14:ligatures w14:val="none"/>
-              </w:rPr>
-              <w:t>proporcionais.detalhe</w:t>
-            </w:r>
-            <w:proofErr w:type="spellEnd"/>
-            <w:proofErr w:type="gramEnd"/>
-            <w:r>
-              <w:rPr>
-                <w:rFonts w:ascii="Aptos Narrow" w:eastAsia="Times New Roman" w:hAnsi="Aptos Narrow" w:cs="Times New Roman"/>
-                <w:color w:val="000000"/>
-                <w:kern w:val="0"/>
-                <w:sz w:val="22"/>
-                <w:szCs w:val="22"/>
-                <w:lang w:eastAsia="pt-BR"/>
-                <w14:ligatures w14:val="none"/>
-              </w:rPr>
-              <w:t>}}</w:t>
+              <w:t>{{verbas.ferias_proporcionais.detalhe}}</w:t>
             </w:r>
           </w:p>
         </w:tc>
@@ -2730,61 +1988,7 @@
                 <w:lang w:eastAsia="pt-BR"/>
                 <w14:ligatures w14:val="none"/>
               </w:rPr>
-              <w:t>{{</w:t>
-            </w:r>
-            <w:proofErr w:type="spellStart"/>
-            <w:proofErr w:type="gramStart"/>
-            <w:r>
-              <w:rPr>
-                <w:rFonts w:ascii="Aptos Narrow" w:eastAsia="Times New Roman" w:hAnsi="Aptos Narrow" w:cs="Times New Roman"/>
-                <w:color w:val="000000"/>
-                <w:kern w:val="0"/>
-                <w:sz w:val="22"/>
-                <w:szCs w:val="22"/>
-                <w:lang w:eastAsia="pt-BR"/>
-                <w14:ligatures w14:val="none"/>
-              </w:rPr>
-              <w:t>verbas.ferias</w:t>
-            </w:r>
-            <w:proofErr w:type="gramEnd"/>
-            <w:r>
-              <w:rPr>
-                <w:rFonts w:ascii="Aptos Narrow" w:eastAsia="Times New Roman" w:hAnsi="Aptos Narrow" w:cs="Times New Roman"/>
-                <w:color w:val="000000"/>
-                <w:kern w:val="0"/>
-                <w:sz w:val="22"/>
-                <w:szCs w:val="22"/>
-                <w:lang w:eastAsia="pt-BR"/>
-                <w14:ligatures w14:val="none"/>
-              </w:rPr>
-              <w:t>_</w:t>
-            </w:r>
-            <w:proofErr w:type="gramStart"/>
-            <w:r>
-              <w:rPr>
-                <w:rFonts w:ascii="Aptos Narrow" w:eastAsia="Times New Roman" w:hAnsi="Aptos Narrow" w:cs="Times New Roman"/>
-                <w:color w:val="000000"/>
-                <w:kern w:val="0"/>
-                <w:sz w:val="22"/>
-                <w:szCs w:val="22"/>
-                <w:lang w:eastAsia="pt-BR"/>
-                <w14:ligatures w14:val="none"/>
-              </w:rPr>
-              <w:t>proporcionais.valor</w:t>
-            </w:r>
-            <w:proofErr w:type="spellEnd"/>
-            <w:proofErr w:type="gramEnd"/>
-            <w:r>
-              <w:rPr>
-                <w:rFonts w:ascii="Aptos Narrow" w:eastAsia="Times New Roman" w:hAnsi="Aptos Narrow" w:cs="Times New Roman"/>
-                <w:color w:val="000000"/>
-                <w:kern w:val="0"/>
-                <w:sz w:val="22"/>
-                <w:szCs w:val="22"/>
-                <w:lang w:eastAsia="pt-BR"/>
-                <w14:ligatures w14:val="none"/>
-              </w:rPr>
-              <w:t>}}</w:t>
+              <w:t>{{verbas.ferias_proporcionais.valor}}</w:t>
             </w:r>
           </w:p>
         </w:tc>
@@ -2871,61 +2075,7 @@
                 <w:lang w:eastAsia="pt-BR"/>
                 <w14:ligatures w14:val="none"/>
               </w:rPr>
-              <w:t>{{</w:t>
-            </w:r>
-            <w:proofErr w:type="spellStart"/>
-            <w:proofErr w:type="gramStart"/>
-            <w:r>
-              <w:rPr>
-                <w:rFonts w:ascii="Aptos Narrow" w:eastAsia="Times New Roman" w:hAnsi="Aptos Narrow" w:cs="Times New Roman"/>
-                <w:color w:val="000000"/>
-                <w:kern w:val="0"/>
-                <w:sz w:val="22"/>
-                <w:szCs w:val="22"/>
-                <w:lang w:eastAsia="pt-BR"/>
-                <w14:ligatures w14:val="none"/>
-              </w:rPr>
-              <w:t>verbas.decimo</w:t>
-            </w:r>
-            <w:proofErr w:type="gramEnd"/>
-            <w:r>
-              <w:rPr>
-                <w:rFonts w:ascii="Aptos Narrow" w:eastAsia="Times New Roman" w:hAnsi="Aptos Narrow" w:cs="Times New Roman"/>
-                <w:color w:val="000000"/>
-                <w:kern w:val="0"/>
-                <w:sz w:val="22"/>
-                <w:szCs w:val="22"/>
-                <w:lang w:eastAsia="pt-BR"/>
-                <w14:ligatures w14:val="none"/>
-              </w:rPr>
-              <w:t>_</w:t>
-            </w:r>
-            <w:proofErr w:type="gramStart"/>
-            <w:r>
-              <w:rPr>
-                <w:rFonts w:ascii="Aptos Narrow" w:eastAsia="Times New Roman" w:hAnsi="Aptos Narrow" w:cs="Times New Roman"/>
-                <w:color w:val="000000"/>
-                <w:kern w:val="0"/>
-                <w:sz w:val="22"/>
-                <w:szCs w:val="22"/>
-                <w:lang w:eastAsia="pt-BR"/>
-                <w14:ligatures w14:val="none"/>
-              </w:rPr>
-              <w:t>terceiro.detalhe</w:t>
-            </w:r>
-            <w:proofErr w:type="spellEnd"/>
-            <w:proofErr w:type="gramEnd"/>
-            <w:r>
-              <w:rPr>
-                <w:rFonts w:ascii="Aptos Narrow" w:eastAsia="Times New Roman" w:hAnsi="Aptos Narrow" w:cs="Times New Roman"/>
-                <w:color w:val="000000"/>
-                <w:kern w:val="0"/>
-                <w:sz w:val="22"/>
-                <w:szCs w:val="22"/>
-                <w:lang w:eastAsia="pt-BR"/>
-                <w14:ligatures w14:val="none"/>
-              </w:rPr>
-              <w:t>}}</w:t>
+              <w:t>{{verbas.decimo_terceiro.detalhe}}</w:t>
             </w:r>
           </w:p>
         </w:tc>
@@ -2966,61 +2116,7 @@
                 <w:lang w:eastAsia="pt-BR"/>
                 <w14:ligatures w14:val="none"/>
               </w:rPr>
-              <w:t>{{</w:t>
-            </w:r>
-            <w:proofErr w:type="spellStart"/>
-            <w:proofErr w:type="gramStart"/>
-            <w:r>
-              <w:rPr>
-                <w:rFonts w:ascii="Aptos Narrow" w:eastAsia="Times New Roman" w:hAnsi="Aptos Narrow" w:cs="Times New Roman"/>
-                <w:color w:val="000000"/>
-                <w:kern w:val="0"/>
-                <w:sz w:val="22"/>
-                <w:szCs w:val="22"/>
-                <w:lang w:eastAsia="pt-BR"/>
-                <w14:ligatures w14:val="none"/>
-              </w:rPr>
-              <w:t>verbas.decimo</w:t>
-            </w:r>
-            <w:proofErr w:type="gramEnd"/>
-            <w:r>
-              <w:rPr>
-                <w:rFonts w:ascii="Aptos Narrow" w:eastAsia="Times New Roman" w:hAnsi="Aptos Narrow" w:cs="Times New Roman"/>
-                <w:color w:val="000000"/>
-                <w:kern w:val="0"/>
-                <w:sz w:val="22"/>
-                <w:szCs w:val="22"/>
-                <w:lang w:eastAsia="pt-BR"/>
-                <w14:ligatures w14:val="none"/>
-              </w:rPr>
-              <w:t>_</w:t>
-            </w:r>
-            <w:proofErr w:type="gramStart"/>
-            <w:r>
-              <w:rPr>
-                <w:rFonts w:ascii="Aptos Narrow" w:eastAsia="Times New Roman" w:hAnsi="Aptos Narrow" w:cs="Times New Roman"/>
-                <w:color w:val="000000"/>
-                <w:kern w:val="0"/>
-                <w:sz w:val="22"/>
-                <w:szCs w:val="22"/>
-                <w:lang w:eastAsia="pt-BR"/>
-                <w14:ligatures w14:val="none"/>
-              </w:rPr>
-              <w:t>terceiro.valor</w:t>
-            </w:r>
-            <w:proofErr w:type="spellEnd"/>
-            <w:proofErr w:type="gramEnd"/>
-            <w:r>
-              <w:rPr>
-                <w:rFonts w:ascii="Aptos Narrow" w:eastAsia="Times New Roman" w:hAnsi="Aptos Narrow" w:cs="Times New Roman"/>
-                <w:color w:val="000000"/>
-                <w:kern w:val="0"/>
-                <w:sz w:val="22"/>
-                <w:szCs w:val="22"/>
-                <w:lang w:eastAsia="pt-BR"/>
-                <w14:ligatures w14:val="none"/>
-              </w:rPr>
-              <w:t>}}</w:t>
+              <w:t>{{verbas.decimo_terceiro.valor}}</w:t>
             </w:r>
           </w:p>
         </w:tc>
@@ -3107,61 +2203,7 @@
                 <w:lang w:eastAsia="pt-BR"/>
                 <w14:ligatures w14:val="none"/>
               </w:rPr>
-              <w:t>{{</w:t>
-            </w:r>
-            <w:proofErr w:type="spellStart"/>
-            <w:proofErr w:type="gramStart"/>
-            <w:r>
-              <w:rPr>
-                <w:rFonts w:ascii="Aptos Narrow" w:eastAsia="Times New Roman" w:hAnsi="Aptos Narrow" w:cs="Times New Roman"/>
-                <w:color w:val="000000"/>
-                <w:kern w:val="0"/>
-                <w:sz w:val="22"/>
-                <w:szCs w:val="22"/>
-                <w:lang w:eastAsia="pt-BR"/>
-                <w14:ligatures w14:val="none"/>
-              </w:rPr>
-              <w:t>verbas.fgts</w:t>
-            </w:r>
-            <w:proofErr w:type="gramEnd"/>
-            <w:r>
-              <w:rPr>
-                <w:rFonts w:ascii="Aptos Narrow" w:eastAsia="Times New Roman" w:hAnsi="Aptos Narrow" w:cs="Times New Roman"/>
-                <w:color w:val="000000"/>
-                <w:kern w:val="0"/>
-                <w:sz w:val="22"/>
-                <w:szCs w:val="22"/>
-                <w:lang w:eastAsia="pt-BR"/>
-                <w14:ligatures w14:val="none"/>
-              </w:rPr>
-              <w:t>_</w:t>
-            </w:r>
-            <w:proofErr w:type="gramStart"/>
-            <w:r>
-              <w:rPr>
-                <w:rFonts w:ascii="Aptos Narrow" w:eastAsia="Times New Roman" w:hAnsi="Aptos Narrow" w:cs="Times New Roman"/>
-                <w:color w:val="000000"/>
-                <w:kern w:val="0"/>
-                <w:sz w:val="22"/>
-                <w:szCs w:val="22"/>
-                <w:lang w:eastAsia="pt-BR"/>
-                <w14:ligatures w14:val="none"/>
-              </w:rPr>
-              <w:t>rescisorio.detalhe</w:t>
-            </w:r>
-            <w:proofErr w:type="spellEnd"/>
-            <w:proofErr w:type="gramEnd"/>
-            <w:r>
-              <w:rPr>
-                <w:rFonts w:ascii="Aptos Narrow" w:eastAsia="Times New Roman" w:hAnsi="Aptos Narrow" w:cs="Times New Roman"/>
-                <w:color w:val="000000"/>
-                <w:kern w:val="0"/>
-                <w:sz w:val="22"/>
-                <w:szCs w:val="22"/>
-                <w:lang w:eastAsia="pt-BR"/>
-                <w14:ligatures w14:val="none"/>
-              </w:rPr>
-              <w:t>}}</w:t>
+              <w:t>{{verbas.fgts_rescisorio.detalhe}}</w:t>
             </w:r>
           </w:p>
         </w:tc>
@@ -3202,61 +2244,7 @@
                 <w:lang w:eastAsia="pt-BR"/>
                 <w14:ligatures w14:val="none"/>
               </w:rPr>
-              <w:t>{{</w:t>
-            </w:r>
-            <w:proofErr w:type="spellStart"/>
-            <w:proofErr w:type="gramStart"/>
-            <w:r>
-              <w:rPr>
-                <w:rFonts w:ascii="Aptos Narrow" w:eastAsia="Times New Roman" w:hAnsi="Aptos Narrow" w:cs="Times New Roman"/>
-                <w:color w:val="000000"/>
-                <w:kern w:val="0"/>
-                <w:sz w:val="22"/>
-                <w:szCs w:val="22"/>
-                <w:lang w:eastAsia="pt-BR"/>
-                <w14:ligatures w14:val="none"/>
-              </w:rPr>
-              <w:t>verbas.fgts</w:t>
-            </w:r>
-            <w:proofErr w:type="gramEnd"/>
-            <w:r>
-              <w:rPr>
-                <w:rFonts w:ascii="Aptos Narrow" w:eastAsia="Times New Roman" w:hAnsi="Aptos Narrow" w:cs="Times New Roman"/>
-                <w:color w:val="000000"/>
-                <w:kern w:val="0"/>
-                <w:sz w:val="22"/>
-                <w:szCs w:val="22"/>
-                <w:lang w:eastAsia="pt-BR"/>
-                <w14:ligatures w14:val="none"/>
-              </w:rPr>
-              <w:t>_</w:t>
-            </w:r>
-            <w:proofErr w:type="gramStart"/>
-            <w:r>
-              <w:rPr>
-                <w:rFonts w:ascii="Aptos Narrow" w:eastAsia="Times New Roman" w:hAnsi="Aptos Narrow" w:cs="Times New Roman"/>
-                <w:color w:val="000000"/>
-                <w:kern w:val="0"/>
-                <w:sz w:val="22"/>
-                <w:szCs w:val="22"/>
-                <w:lang w:eastAsia="pt-BR"/>
-                <w14:ligatures w14:val="none"/>
-              </w:rPr>
-              <w:t>rescisorio.valor</w:t>
-            </w:r>
-            <w:proofErr w:type="spellEnd"/>
-            <w:proofErr w:type="gramEnd"/>
-            <w:r>
-              <w:rPr>
-                <w:rFonts w:ascii="Aptos Narrow" w:eastAsia="Times New Roman" w:hAnsi="Aptos Narrow" w:cs="Times New Roman"/>
-                <w:color w:val="000000"/>
-                <w:kern w:val="0"/>
-                <w:sz w:val="22"/>
-                <w:szCs w:val="22"/>
-                <w:lang w:eastAsia="pt-BR"/>
-                <w14:ligatures w14:val="none"/>
-              </w:rPr>
-              <w:t>}}</w:t>
+              <w:t>{{verbas.fgts_rescisorio.valor}}</w:t>
             </w:r>
           </w:p>
         </w:tc>
@@ -3341,61 +2329,7 @@
                 <w:lang w:eastAsia="pt-BR"/>
                 <w14:ligatures w14:val="none"/>
               </w:rPr>
-              <w:t>{{</w:t>
-            </w:r>
-            <w:proofErr w:type="spellStart"/>
-            <w:proofErr w:type="gramStart"/>
-            <w:r>
-              <w:rPr>
-                <w:rFonts w:ascii="Aptos Narrow" w:eastAsia="Times New Roman" w:hAnsi="Aptos Narrow" w:cs="Times New Roman"/>
-                <w:color w:val="000000"/>
-                <w:kern w:val="0"/>
-                <w:sz w:val="22"/>
-                <w:szCs w:val="22"/>
-                <w:lang w:eastAsia="pt-BR"/>
-                <w14:ligatures w14:val="none"/>
-              </w:rPr>
-              <w:t>verbas.multa</w:t>
-            </w:r>
-            <w:proofErr w:type="gramEnd"/>
-            <w:r>
-              <w:rPr>
-                <w:rFonts w:ascii="Aptos Narrow" w:eastAsia="Times New Roman" w:hAnsi="Aptos Narrow" w:cs="Times New Roman"/>
-                <w:color w:val="000000"/>
-                <w:kern w:val="0"/>
-                <w:sz w:val="22"/>
-                <w:szCs w:val="22"/>
-                <w:lang w:eastAsia="pt-BR"/>
-                <w14:ligatures w14:val="none"/>
-              </w:rPr>
-              <w:t>_</w:t>
-            </w:r>
-            <w:proofErr w:type="gramStart"/>
-            <w:r>
-              <w:rPr>
-                <w:rFonts w:ascii="Aptos Narrow" w:eastAsia="Times New Roman" w:hAnsi="Aptos Narrow" w:cs="Times New Roman"/>
-                <w:color w:val="000000"/>
-                <w:kern w:val="0"/>
-                <w:sz w:val="22"/>
-                <w:szCs w:val="22"/>
-                <w:lang w:eastAsia="pt-BR"/>
-                <w14:ligatures w14:val="none"/>
-              </w:rPr>
-              <w:t>fgts.detalhe</w:t>
-            </w:r>
-            <w:proofErr w:type="spellEnd"/>
-            <w:proofErr w:type="gramEnd"/>
-            <w:r>
-              <w:rPr>
-                <w:rFonts w:ascii="Aptos Narrow" w:eastAsia="Times New Roman" w:hAnsi="Aptos Narrow" w:cs="Times New Roman"/>
-                <w:color w:val="000000"/>
-                <w:kern w:val="0"/>
-                <w:sz w:val="22"/>
-                <w:szCs w:val="22"/>
-                <w:lang w:eastAsia="pt-BR"/>
-                <w14:ligatures w14:val="none"/>
-              </w:rPr>
-              <w:t>}}</w:t>
+              <w:t>{{verbas.multa_fgts.detalhe}}</w:t>
             </w:r>
           </w:p>
         </w:tc>
@@ -3435,61 +2369,7 @@
                 <w:lang w:eastAsia="pt-BR"/>
                 <w14:ligatures w14:val="none"/>
               </w:rPr>
-              <w:t>{{</w:t>
-            </w:r>
-            <w:proofErr w:type="spellStart"/>
-            <w:proofErr w:type="gramStart"/>
-            <w:r>
-              <w:rPr>
-                <w:rFonts w:ascii="Aptos Narrow" w:eastAsia="Times New Roman" w:hAnsi="Aptos Narrow" w:cs="Times New Roman"/>
-                <w:color w:val="000000"/>
-                <w:kern w:val="0"/>
-                <w:sz w:val="22"/>
-                <w:szCs w:val="22"/>
-                <w:lang w:eastAsia="pt-BR"/>
-                <w14:ligatures w14:val="none"/>
-              </w:rPr>
-              <w:t>verbas.multa</w:t>
-            </w:r>
-            <w:proofErr w:type="gramEnd"/>
-            <w:r>
-              <w:rPr>
-                <w:rFonts w:ascii="Aptos Narrow" w:eastAsia="Times New Roman" w:hAnsi="Aptos Narrow" w:cs="Times New Roman"/>
-                <w:color w:val="000000"/>
-                <w:kern w:val="0"/>
-                <w:sz w:val="22"/>
-                <w:szCs w:val="22"/>
-                <w:lang w:eastAsia="pt-BR"/>
-                <w14:ligatures w14:val="none"/>
-              </w:rPr>
-              <w:t>_</w:t>
-            </w:r>
-            <w:proofErr w:type="gramStart"/>
-            <w:r>
-              <w:rPr>
-                <w:rFonts w:ascii="Aptos Narrow" w:eastAsia="Times New Roman" w:hAnsi="Aptos Narrow" w:cs="Times New Roman"/>
-                <w:color w:val="000000"/>
-                <w:kern w:val="0"/>
-                <w:sz w:val="22"/>
-                <w:szCs w:val="22"/>
-                <w:lang w:eastAsia="pt-BR"/>
-                <w14:ligatures w14:val="none"/>
-              </w:rPr>
-              <w:t>fgts.valor</w:t>
-            </w:r>
-            <w:proofErr w:type="spellEnd"/>
-            <w:proofErr w:type="gramEnd"/>
-            <w:r>
-              <w:rPr>
-                <w:rFonts w:ascii="Aptos Narrow" w:eastAsia="Times New Roman" w:hAnsi="Aptos Narrow" w:cs="Times New Roman"/>
-                <w:color w:val="000000"/>
-                <w:kern w:val="0"/>
-                <w:sz w:val="22"/>
-                <w:szCs w:val="22"/>
-                <w:lang w:eastAsia="pt-BR"/>
-                <w14:ligatures w14:val="none"/>
-              </w:rPr>
-              <w:t>}}</w:t>
+              <w:t>{{verbas.multa_fgts.valor}}</w:t>
             </w:r>
           </w:p>
         </w:tc>
@@ -3620,20 +2500,7 @@
                 <w:lang w:eastAsia="pt-BR"/>
                 <w14:ligatures w14:val="none"/>
               </w:rPr>
-              <w:t>{{</w:t>
-            </w:r>
-            <w:proofErr w:type="spellStart"/>
-            <w:r>
-              <w:rPr>
-                <w:rFonts w:ascii="Aptos Narrow" w:eastAsia="Times New Roman" w:hAnsi="Aptos Narrow" w:cs="Times New Roman"/>
-                <w:color w:val="000000"/>
-                <w:kern w:val="0"/>
-                <w:sz w:val="22"/>
-                <w:szCs w:val="22"/>
-                <w:lang w:eastAsia="pt-BR"/>
-                <w14:ligatures w14:val="none"/>
-              </w:rPr>
-              <w:t>total</w:t>
+              <w:t>{{total</w:t>
             </w:r>
             <w:r>
               <w:rPr>
@@ -3647,7 +2514,6 @@
               </w:rPr>
               <w:t>_bruto</w:t>
             </w:r>
-            <w:proofErr w:type="spellEnd"/>
             <w:r>
               <w:rPr>
                 <w:rFonts w:ascii="Aptos Narrow" w:eastAsia="Times New Roman" w:hAnsi="Aptos Narrow" w:cs="Times New Roman"/>
@@ -3891,71 +2757,17 @@
                 <w14:ligatures w14:val="none"/>
               </w:rPr>
             </w:pPr>
-            <w:proofErr w:type="gramStart"/>
-            <w:r>
-              <w:rPr>
-                <w:rFonts w:ascii="Aptos Narrow" w:eastAsia="Times New Roman" w:hAnsi="Aptos Narrow" w:cs="Times New Roman"/>
-                <w:color w:val="000000"/>
-                <w:kern w:val="0"/>
-                <w:sz w:val="22"/>
-                <w:szCs w:val="22"/>
-                <w:lang w:eastAsia="pt-BR"/>
-                <w14:ligatures w14:val="none"/>
-              </w:rPr>
-              <w:t xml:space="preserve">{{ </w:t>
-            </w:r>
-            <w:proofErr w:type="spellStart"/>
-            <w:r>
-              <w:rPr>
-                <w:rFonts w:ascii="Aptos Narrow" w:eastAsia="Times New Roman" w:hAnsi="Aptos Narrow" w:cs="Times New Roman"/>
-                <w:color w:val="000000"/>
-                <w:kern w:val="0"/>
-                <w:sz w:val="22"/>
-                <w:szCs w:val="22"/>
-                <w:lang w:eastAsia="pt-BR"/>
-                <w14:ligatures w14:val="none"/>
-              </w:rPr>
-              <w:t>descontos</w:t>
-            </w:r>
-            <w:proofErr w:type="gramEnd"/>
-            <w:r>
-              <w:rPr>
-                <w:rFonts w:ascii="Aptos Narrow" w:eastAsia="Times New Roman" w:hAnsi="Aptos Narrow" w:cs="Times New Roman"/>
-                <w:color w:val="000000"/>
-                <w:kern w:val="0"/>
-                <w:sz w:val="22"/>
-                <w:szCs w:val="22"/>
-                <w:lang w:eastAsia="pt-BR"/>
-                <w14:ligatures w14:val="none"/>
-              </w:rPr>
-              <w:t>.</w:t>
-            </w:r>
-            <w:proofErr w:type="gramStart"/>
-            <w:r>
-              <w:rPr>
-                <w:rFonts w:ascii="Aptos Narrow" w:eastAsia="Times New Roman" w:hAnsi="Aptos Narrow" w:cs="Times New Roman"/>
-                <w:color w:val="000000"/>
-                <w:kern w:val="0"/>
-                <w:sz w:val="22"/>
-                <w:szCs w:val="22"/>
-                <w:lang w:eastAsia="pt-BR"/>
-                <w14:ligatures w14:val="none"/>
-              </w:rPr>
-              <w:t>inss.detalhe</w:t>
-            </w:r>
-            <w:proofErr w:type="spellEnd"/>
-            <w:proofErr w:type="gramEnd"/>
-            <w:r>
-              <w:rPr>
-                <w:rFonts w:ascii="Aptos Narrow" w:eastAsia="Times New Roman" w:hAnsi="Aptos Narrow" w:cs="Times New Roman"/>
-                <w:color w:val="000000"/>
-                <w:kern w:val="0"/>
-                <w:sz w:val="22"/>
-                <w:szCs w:val="22"/>
-                <w:lang w:eastAsia="pt-BR"/>
-                <w14:ligatures w14:val="none"/>
-              </w:rPr>
-              <w:t xml:space="preserve"> }}</w:t>
+            <w:r>
+              <w:rPr>
+                <w:rFonts w:ascii="Aptos Narrow" w:eastAsia="Times New Roman" w:hAnsi="Aptos Narrow" w:cs="Times New Roman"/>
+                <w:color w:val="000000"/>
+                <w:kern w:val="0"/>
+                <w:sz w:val="22"/>
+                <w:szCs w:val="22"/>
+                <w:lang w:eastAsia="pt-BR"/>
+                <w14:ligatures w14:val="none"/>
+              </w:rPr>
+              <w:t>{{ descontos.inss.detalhe }}</w:t>
             </w:r>
           </w:p>
         </w:tc>
@@ -3986,71 +2798,17 @@
                 <w14:ligatures w14:val="none"/>
               </w:rPr>
             </w:pPr>
-            <w:proofErr w:type="gramStart"/>
-            <w:r>
-              <w:rPr>
-                <w:rFonts w:ascii="Aptos Narrow" w:eastAsia="Times New Roman" w:hAnsi="Aptos Narrow" w:cs="Times New Roman"/>
-                <w:color w:val="000000"/>
-                <w:kern w:val="0"/>
-                <w:sz w:val="22"/>
-                <w:szCs w:val="22"/>
-                <w:lang w:eastAsia="pt-BR"/>
-                <w14:ligatures w14:val="none"/>
-              </w:rPr>
-              <w:t xml:space="preserve">{{ </w:t>
-            </w:r>
-            <w:proofErr w:type="spellStart"/>
-            <w:r>
-              <w:rPr>
-                <w:rFonts w:ascii="Aptos Narrow" w:eastAsia="Times New Roman" w:hAnsi="Aptos Narrow" w:cs="Times New Roman"/>
-                <w:color w:val="000000"/>
-                <w:kern w:val="0"/>
-                <w:sz w:val="22"/>
-                <w:szCs w:val="22"/>
-                <w:lang w:eastAsia="pt-BR"/>
-                <w14:ligatures w14:val="none"/>
-              </w:rPr>
-              <w:t>descontos</w:t>
-            </w:r>
-            <w:proofErr w:type="gramEnd"/>
-            <w:r>
-              <w:rPr>
-                <w:rFonts w:ascii="Aptos Narrow" w:eastAsia="Times New Roman" w:hAnsi="Aptos Narrow" w:cs="Times New Roman"/>
-                <w:color w:val="000000"/>
-                <w:kern w:val="0"/>
-                <w:sz w:val="22"/>
-                <w:szCs w:val="22"/>
-                <w:lang w:eastAsia="pt-BR"/>
-                <w14:ligatures w14:val="none"/>
-              </w:rPr>
-              <w:t>.</w:t>
-            </w:r>
-            <w:proofErr w:type="gramStart"/>
-            <w:r>
-              <w:rPr>
-                <w:rFonts w:ascii="Aptos Narrow" w:eastAsia="Times New Roman" w:hAnsi="Aptos Narrow" w:cs="Times New Roman"/>
-                <w:color w:val="000000"/>
-                <w:kern w:val="0"/>
-                <w:sz w:val="22"/>
-                <w:szCs w:val="22"/>
-                <w:lang w:eastAsia="pt-BR"/>
-                <w14:ligatures w14:val="none"/>
-              </w:rPr>
-              <w:t>inss.valor</w:t>
-            </w:r>
-            <w:proofErr w:type="spellEnd"/>
-            <w:proofErr w:type="gramEnd"/>
-            <w:r>
-              <w:rPr>
-                <w:rFonts w:ascii="Aptos Narrow" w:eastAsia="Times New Roman" w:hAnsi="Aptos Narrow" w:cs="Times New Roman"/>
-                <w:color w:val="000000"/>
-                <w:kern w:val="0"/>
-                <w:sz w:val="22"/>
-                <w:szCs w:val="22"/>
-                <w:lang w:eastAsia="pt-BR"/>
-                <w14:ligatures w14:val="none"/>
-              </w:rPr>
-              <w:t xml:space="preserve"> }}</w:t>
+            <w:r>
+              <w:rPr>
+                <w:rFonts w:ascii="Aptos Narrow" w:eastAsia="Times New Roman" w:hAnsi="Aptos Narrow" w:cs="Times New Roman"/>
+                <w:color w:val="000000"/>
+                <w:kern w:val="0"/>
+                <w:sz w:val="22"/>
+                <w:szCs w:val="22"/>
+                <w:lang w:eastAsia="pt-BR"/>
+                <w14:ligatures w14:val="none"/>
+              </w:rPr>
+              <w:t>{{ descontos.inss.valor }}</w:t>
             </w:r>
           </w:p>
         </w:tc>
@@ -4127,71 +2885,17 @@
                 <w14:ligatures w14:val="none"/>
               </w:rPr>
             </w:pPr>
-            <w:proofErr w:type="gramStart"/>
-            <w:r>
-              <w:rPr>
-                <w:rFonts w:ascii="Aptos Narrow" w:eastAsia="Times New Roman" w:hAnsi="Aptos Narrow" w:cs="Times New Roman"/>
-                <w:color w:val="000000"/>
-                <w:kern w:val="0"/>
-                <w:sz w:val="22"/>
-                <w:szCs w:val="22"/>
-                <w:lang w:eastAsia="pt-BR"/>
-                <w14:ligatures w14:val="none"/>
-              </w:rPr>
-              <w:t xml:space="preserve">{{ </w:t>
-            </w:r>
-            <w:proofErr w:type="spellStart"/>
-            <w:r>
-              <w:rPr>
-                <w:rFonts w:ascii="Aptos Narrow" w:eastAsia="Times New Roman" w:hAnsi="Aptos Narrow" w:cs="Times New Roman"/>
-                <w:color w:val="000000"/>
-                <w:kern w:val="0"/>
-                <w:sz w:val="22"/>
-                <w:szCs w:val="22"/>
-                <w:lang w:eastAsia="pt-BR"/>
-                <w14:ligatures w14:val="none"/>
-              </w:rPr>
-              <w:t>descontos</w:t>
-            </w:r>
-            <w:proofErr w:type="gramEnd"/>
-            <w:r>
-              <w:rPr>
-                <w:rFonts w:ascii="Aptos Narrow" w:eastAsia="Times New Roman" w:hAnsi="Aptos Narrow" w:cs="Times New Roman"/>
-                <w:color w:val="000000"/>
-                <w:kern w:val="0"/>
-                <w:sz w:val="22"/>
-                <w:szCs w:val="22"/>
-                <w:lang w:eastAsia="pt-BR"/>
-                <w14:ligatures w14:val="none"/>
-              </w:rPr>
-              <w:t>.</w:t>
-            </w:r>
-            <w:proofErr w:type="gramStart"/>
-            <w:r>
-              <w:rPr>
-                <w:rFonts w:ascii="Aptos Narrow" w:eastAsia="Times New Roman" w:hAnsi="Aptos Narrow" w:cs="Times New Roman"/>
-                <w:color w:val="000000"/>
-                <w:kern w:val="0"/>
-                <w:sz w:val="22"/>
-                <w:szCs w:val="22"/>
-                <w:lang w:eastAsia="pt-BR"/>
-                <w14:ligatures w14:val="none"/>
-              </w:rPr>
-              <w:t>irrf.detalhe</w:t>
-            </w:r>
-            <w:proofErr w:type="spellEnd"/>
-            <w:proofErr w:type="gramEnd"/>
-            <w:r>
-              <w:rPr>
-                <w:rFonts w:ascii="Aptos Narrow" w:eastAsia="Times New Roman" w:hAnsi="Aptos Narrow" w:cs="Times New Roman"/>
-                <w:color w:val="000000"/>
-                <w:kern w:val="0"/>
-                <w:sz w:val="22"/>
-                <w:szCs w:val="22"/>
-                <w:lang w:eastAsia="pt-BR"/>
-                <w14:ligatures w14:val="none"/>
-              </w:rPr>
-              <w:t xml:space="preserve"> }}</w:t>
+            <w:r>
+              <w:rPr>
+                <w:rFonts w:ascii="Aptos Narrow" w:eastAsia="Times New Roman" w:hAnsi="Aptos Narrow" w:cs="Times New Roman"/>
+                <w:color w:val="000000"/>
+                <w:kern w:val="0"/>
+                <w:sz w:val="22"/>
+                <w:szCs w:val="22"/>
+                <w:lang w:eastAsia="pt-BR"/>
+                <w14:ligatures w14:val="none"/>
+              </w:rPr>
+              <w:t>{{ descontos.irrf.detalhe }}</w:t>
             </w:r>
           </w:p>
         </w:tc>
@@ -4222,71 +2926,17 @@
                 <w14:ligatures w14:val="none"/>
               </w:rPr>
             </w:pPr>
-            <w:proofErr w:type="gramStart"/>
-            <w:r>
-              <w:rPr>
-                <w:rFonts w:ascii="Aptos Narrow" w:eastAsia="Times New Roman" w:hAnsi="Aptos Narrow" w:cs="Times New Roman"/>
-                <w:color w:val="000000"/>
-                <w:kern w:val="0"/>
-                <w:sz w:val="22"/>
-                <w:szCs w:val="22"/>
-                <w:lang w:eastAsia="pt-BR"/>
-                <w14:ligatures w14:val="none"/>
-              </w:rPr>
-              <w:t xml:space="preserve">{{ </w:t>
-            </w:r>
-            <w:proofErr w:type="spellStart"/>
-            <w:r>
-              <w:rPr>
-                <w:rFonts w:ascii="Aptos Narrow" w:eastAsia="Times New Roman" w:hAnsi="Aptos Narrow" w:cs="Times New Roman"/>
-                <w:color w:val="000000"/>
-                <w:kern w:val="0"/>
-                <w:sz w:val="22"/>
-                <w:szCs w:val="22"/>
-                <w:lang w:eastAsia="pt-BR"/>
-                <w14:ligatures w14:val="none"/>
-              </w:rPr>
-              <w:t>descontos</w:t>
-            </w:r>
-            <w:proofErr w:type="gramEnd"/>
-            <w:r>
-              <w:rPr>
-                <w:rFonts w:ascii="Aptos Narrow" w:eastAsia="Times New Roman" w:hAnsi="Aptos Narrow" w:cs="Times New Roman"/>
-                <w:color w:val="000000"/>
-                <w:kern w:val="0"/>
-                <w:sz w:val="22"/>
-                <w:szCs w:val="22"/>
-                <w:lang w:eastAsia="pt-BR"/>
-                <w14:ligatures w14:val="none"/>
-              </w:rPr>
-              <w:t>.</w:t>
-            </w:r>
-            <w:proofErr w:type="gramStart"/>
-            <w:r>
-              <w:rPr>
-                <w:rFonts w:ascii="Aptos Narrow" w:eastAsia="Times New Roman" w:hAnsi="Aptos Narrow" w:cs="Times New Roman"/>
-                <w:color w:val="000000"/>
-                <w:kern w:val="0"/>
-                <w:sz w:val="22"/>
-                <w:szCs w:val="22"/>
-                <w:lang w:eastAsia="pt-BR"/>
-                <w14:ligatures w14:val="none"/>
-              </w:rPr>
-              <w:t>irrf.valor</w:t>
-            </w:r>
-            <w:proofErr w:type="spellEnd"/>
-            <w:proofErr w:type="gramEnd"/>
-            <w:r>
-              <w:rPr>
-                <w:rFonts w:ascii="Aptos Narrow" w:eastAsia="Times New Roman" w:hAnsi="Aptos Narrow" w:cs="Times New Roman"/>
-                <w:color w:val="000000"/>
-                <w:kern w:val="0"/>
-                <w:sz w:val="22"/>
-                <w:szCs w:val="22"/>
-                <w:lang w:eastAsia="pt-BR"/>
-                <w14:ligatures w14:val="none"/>
-              </w:rPr>
-              <w:t xml:space="preserve"> }}</w:t>
+            <w:r>
+              <w:rPr>
+                <w:rFonts w:ascii="Aptos Narrow" w:eastAsia="Times New Roman" w:hAnsi="Aptos Narrow" w:cs="Times New Roman"/>
+                <w:color w:val="000000"/>
+                <w:kern w:val="0"/>
+                <w:sz w:val="22"/>
+                <w:szCs w:val="22"/>
+                <w:lang w:eastAsia="pt-BR"/>
+                <w14:ligatures w14:val="none"/>
+              </w:rPr>
+              <w:t>{{ descontos.irrf.valor }}</w:t>
             </w:r>
           </w:p>
         </w:tc>
@@ -4407,57 +3057,17 @@
                 <w14:ligatures w14:val="none"/>
               </w:rPr>
             </w:pPr>
-            <w:proofErr w:type="gramStart"/>
-            <w:r>
-              <w:rPr>
-                <w:rFonts w:ascii="Aptos Narrow" w:eastAsia="Times New Roman" w:hAnsi="Aptos Narrow" w:cs="Times New Roman"/>
-                <w:color w:val="000000"/>
-                <w:kern w:val="0"/>
-                <w:sz w:val="22"/>
-                <w:szCs w:val="22"/>
-                <w:lang w:eastAsia="pt-BR"/>
-                <w14:ligatures w14:val="none"/>
-              </w:rPr>
-              <w:t xml:space="preserve">{{ </w:t>
-            </w:r>
-            <w:proofErr w:type="spellStart"/>
-            <w:r>
-              <w:rPr>
-                <w:rFonts w:ascii="Aptos Narrow" w:eastAsia="Times New Roman" w:hAnsi="Aptos Narrow" w:cs="Times New Roman"/>
-                <w:color w:val="000000"/>
-                <w:kern w:val="0"/>
-                <w:sz w:val="22"/>
-                <w:szCs w:val="22"/>
-                <w:lang w:eastAsia="pt-BR"/>
-                <w14:ligatures w14:val="none"/>
-              </w:rPr>
-              <w:t>total</w:t>
-            </w:r>
-            <w:proofErr w:type="gramEnd"/>
-            <w:r>
-              <w:rPr>
-                <w:rFonts w:ascii="Aptos Narrow" w:eastAsia="Times New Roman" w:hAnsi="Aptos Narrow" w:cs="Times New Roman"/>
-                <w:color w:val="000000"/>
-                <w:kern w:val="0"/>
-                <w:sz w:val="22"/>
-                <w:szCs w:val="22"/>
-                <w:lang w:eastAsia="pt-BR"/>
-                <w14:ligatures w14:val="none"/>
-              </w:rPr>
-              <w:t>_descontos</w:t>
-            </w:r>
-            <w:proofErr w:type="spellEnd"/>
-            <w:r>
-              <w:rPr>
-                <w:rFonts w:ascii="Aptos Narrow" w:eastAsia="Times New Roman" w:hAnsi="Aptos Narrow" w:cs="Times New Roman"/>
-                <w:color w:val="000000"/>
-                <w:kern w:val="0"/>
-                <w:sz w:val="22"/>
-                <w:szCs w:val="22"/>
-                <w:lang w:eastAsia="pt-BR"/>
-                <w14:ligatures w14:val="none"/>
-              </w:rPr>
-              <w:t xml:space="preserve"> }}</w:t>
+            <w:r>
+              <w:rPr>
+                <w:rFonts w:ascii="Aptos Narrow" w:eastAsia="Times New Roman" w:hAnsi="Aptos Narrow" w:cs="Times New Roman"/>
+                <w:color w:val="000000"/>
+                <w:kern w:val="0"/>
+                <w:sz w:val="22"/>
+                <w:szCs w:val="22"/>
+                <w:lang w:eastAsia="pt-BR"/>
+                <w14:ligatures w14:val="none"/>
+              </w:rPr>
+              <w:t>{{ total_descontos }}</w:t>
             </w:r>
           </w:p>
         </w:tc>
@@ -4525,19 +3135,11 @@
               </w:rPr>
               <w:t xml:space="preserve">Saldo </w:t>
             </w:r>
-            <w:proofErr w:type="spellStart"/>
-            <w:r>
-              <w:rPr>
-                <w:rFonts w:ascii="Aptos Narrow" w:hAnsi="Aptos Narrow"/>
-              </w:rPr>
-              <w:t>Acumulado</w:t>
-            </w:r>
-            <w:proofErr w:type="spellEnd"/>
-            <w:r>
-              <w:rPr>
-                <w:rFonts w:ascii="Aptos Narrow" w:hAnsi="Aptos Narrow"/>
-              </w:rPr>
-              <w:t xml:space="preserve"> (</w:t>
+            <w:r>
+              <w:rPr>
+                <w:rFonts w:ascii="Aptos Narrow" w:hAnsi="Aptos Narrow"/>
+              </w:rPr>
+              <w:t>Acumulado (</w:t>
             </w:r>
             <w:r>
               <w:rPr>
@@ -4561,28 +3163,18 @@
             <w:pPr>
               <w:jc w:val="center"/>
             </w:pPr>
-            <w:proofErr w:type="gramStart"/>
             <w:r>
               <w:rPr>
                 <w:rFonts w:ascii="Aptos Narrow" w:hAnsi="Aptos Narrow"/>
               </w:rPr>
               <w:t xml:space="preserve">{{ </w:t>
             </w:r>
-            <w:proofErr w:type="spellStart"/>
             <w:r>
               <w:rPr>
                 <w:sz w:val="20"/>
               </w:rPr>
-              <w:t>fgts</w:t>
-            </w:r>
-            <w:proofErr w:type="gramEnd"/>
-            <w:r>
-              <w:rPr>
-                <w:sz w:val="20"/>
-              </w:rPr>
-              <w:t>_acumulado</w:t>
-            </w:r>
-            <w:proofErr w:type="spellEnd"/>
+              <w:t>fgts_acumulado</w:t>
+            </w:r>
             <w:r>
               <w:rPr>
                 <w:rFonts w:ascii="Aptos Narrow" w:hAnsi="Aptos Narrow"/>
@@ -4635,7 +3227,6 @@
               </w:rPr>
               <w:t>{{</w:t>
             </w:r>
-            <w:proofErr w:type="spellStart"/>
             <w:r>
               <w:rPr>
                 <w:rFonts w:ascii="Aptos Narrow" w:hAnsi="Aptos Narrow"/>
@@ -4643,7 +3234,6 @@
               </w:rPr>
               <w:t>fgts_pode_sacar</w:t>
             </w:r>
-            <w:proofErr w:type="spellEnd"/>
             <w:r>
               <w:rPr>
                 <w:rFonts w:ascii="Aptos Narrow" w:hAnsi="Aptos Narrow"/>
@@ -4666,14 +3256,12 @@
                 <w:rFonts w:ascii="Aptos Narrow" w:hAnsi="Aptos Narrow"/>
               </w:rPr>
             </w:pPr>
-            <w:proofErr w:type="gramStart"/>
             <w:r>
               <w:rPr>
                 <w:rFonts w:ascii="Aptos Narrow" w:hAnsi="Aptos Narrow"/>
               </w:rPr>
               <w:t xml:space="preserve">FGTS  </w:t>
             </w:r>
-            <w:proofErr w:type="spellStart"/>
             <w:r>
               <w:rPr>
                 <w:rFonts w:ascii="Aptos Narrow" w:hAnsi="Aptos Narrow"/>
@@ -4690,15 +3278,7 @@
               <w:rPr>
                 <w:rFonts w:ascii="Aptos Narrow" w:hAnsi="Aptos Narrow"/>
               </w:rPr>
-              <w:t>rio</w:t>
-            </w:r>
-            <w:proofErr w:type="spellEnd"/>
-            <w:proofErr w:type="gramEnd"/>
-            <w:r>
-              <w:rPr>
-                <w:rFonts w:ascii="Aptos Narrow" w:hAnsi="Aptos Narrow"/>
-              </w:rPr>
-              <w:t xml:space="preserve"> (8%)</w:t>
+              <w:t>rio (8%)</w:t>
             </w:r>
           </w:p>
         </w:tc>
@@ -4713,33 +3293,17 @@
                 <w:rFonts w:ascii="Aptos Narrow" w:hAnsi="Aptos Narrow"/>
               </w:rPr>
             </w:pPr>
-            <w:proofErr w:type="gramStart"/>
             <w:r>
               <w:rPr>
                 <w:rFonts w:ascii="Aptos Narrow" w:hAnsi="Aptos Narrow"/>
               </w:rPr>
               <w:t xml:space="preserve">{{ </w:t>
             </w:r>
-            <w:proofErr w:type="spellStart"/>
             <w:r>
               <w:rPr>
                 <w:sz w:val="20"/>
               </w:rPr>
-              <w:t>fgts</w:t>
-            </w:r>
-            <w:proofErr w:type="gramEnd"/>
-            <w:r>
-              <w:rPr>
-                <w:sz w:val="20"/>
-              </w:rPr>
-              <w:t>_rescisorio</w:t>
-            </w:r>
-            <w:proofErr w:type="spellEnd"/>
-            <w:r>
-              <w:rPr>
-                <w:sz w:val="20"/>
-              </w:rPr>
-              <w:t xml:space="preserve"> </w:t>
+              <w:t xml:space="preserve">fgts_rescisorio </w:t>
             </w:r>
             <w:r>
               <w:rPr>
@@ -4762,88 +3326,36 @@
                 <w:rFonts w:ascii="Aptos Narrow" w:hAnsi="Aptos Narrow"/>
               </w:rPr>
             </w:pPr>
-            <w:proofErr w:type="spellStart"/>
-            <w:r>
-              <w:rPr>
-                <w:rFonts w:ascii="Aptos Narrow" w:hAnsi="Aptos Narrow"/>
-              </w:rPr>
-              <w:t>Multa</w:t>
-            </w:r>
-            <w:proofErr w:type="spellEnd"/>
-            <w:r>
-              <w:rPr>
-                <w:rFonts w:ascii="Aptos Narrow" w:hAnsi="Aptos Narrow"/>
-              </w:rPr>
-              <w:t xml:space="preserve"> (</w:t>
-            </w:r>
-            <w:proofErr w:type="gramStart"/>
+            <w:r>
+              <w:rPr>
+                <w:rFonts w:ascii="Aptos Narrow" w:hAnsi="Aptos Narrow"/>
+              </w:rPr>
+              <w:t>Multa ({{ multa_fgts_percent }})</w:t>
+            </w:r>
+          </w:p>
+        </w:tc>
+        <w:tc>
+          <w:tcPr>
+            <w:tcW w:w="5102" w:type="dxa"/>
+          </w:tcPr>
+          <w:p>
+            <w:pPr>
+              <w:jc w:val="center"/>
+              <w:rPr>
+                <w:rFonts w:ascii="Aptos Narrow" w:hAnsi="Aptos Narrow"/>
+              </w:rPr>
+            </w:pPr>
             <w:r>
               <w:rPr>
                 <w:rFonts w:ascii="Aptos Narrow" w:hAnsi="Aptos Narrow"/>
               </w:rPr>
               <w:t xml:space="preserve">{{ </w:t>
             </w:r>
-            <w:proofErr w:type="spellStart"/>
-            <w:r>
-              <w:rPr>
-                <w:rFonts w:ascii="Aptos Narrow" w:hAnsi="Aptos Narrow"/>
-              </w:rPr>
-              <w:t>multa</w:t>
-            </w:r>
-            <w:proofErr w:type="gramEnd"/>
-            <w:r>
-              <w:rPr>
-                <w:rFonts w:ascii="Aptos Narrow" w:hAnsi="Aptos Narrow"/>
-              </w:rPr>
-              <w:t>_fgts_percent</w:t>
-            </w:r>
-            <w:proofErr w:type="spellEnd"/>
-            <w:r>
-              <w:rPr>
-                <w:rFonts w:ascii="Aptos Narrow" w:hAnsi="Aptos Narrow"/>
-              </w:rPr>
-              <w:t xml:space="preserve"> }})</w:t>
-            </w:r>
-          </w:p>
-        </w:tc>
-        <w:tc>
-          <w:tcPr>
-            <w:tcW w:w="5102" w:type="dxa"/>
-          </w:tcPr>
-          <w:p>
-            <w:pPr>
-              <w:jc w:val="center"/>
-              <w:rPr>
-                <w:rFonts w:ascii="Aptos Narrow" w:hAnsi="Aptos Narrow"/>
-              </w:rPr>
-            </w:pPr>
-            <w:proofErr w:type="gramStart"/>
-            <w:r>
-              <w:rPr>
-                <w:rFonts w:ascii="Aptos Narrow" w:hAnsi="Aptos Narrow"/>
-              </w:rPr>
-              <w:t xml:space="preserve">{{ </w:t>
-            </w:r>
-            <w:proofErr w:type="spellStart"/>
             <w:r>
               <w:rPr>
                 <w:sz w:val="20"/>
               </w:rPr>
-              <w:t>multa</w:t>
-            </w:r>
-            <w:proofErr w:type="gramEnd"/>
-            <w:r>
-              <w:rPr>
-                <w:sz w:val="20"/>
-              </w:rPr>
-              <w:t>_fgts</w:t>
-            </w:r>
-            <w:proofErr w:type="spellEnd"/>
-            <w:r>
-              <w:rPr>
-                <w:sz w:val="20"/>
-              </w:rPr>
-              <w:t xml:space="preserve"> </w:t>
+              <w:t xml:space="preserve">multa_fgts </w:t>
             </w:r>
             <w:r>
               <w:rPr>
@@ -4893,33 +3405,11 @@
                 <w:rFonts w:ascii="Aptos Narrow" w:hAnsi="Aptos Narrow"/>
               </w:rPr>
             </w:pPr>
-            <w:proofErr w:type="gramStart"/>
-            <w:r>
-              <w:rPr>
-                <w:rFonts w:ascii="Aptos Narrow" w:hAnsi="Aptos Narrow"/>
-              </w:rPr>
-              <w:t xml:space="preserve">{{ </w:t>
-            </w:r>
-            <w:proofErr w:type="spellStart"/>
-            <w:r>
-              <w:rPr>
-                <w:rFonts w:ascii="Aptos Narrow" w:hAnsi="Aptos Narrow"/>
-              </w:rPr>
-              <w:t>total</w:t>
-            </w:r>
-            <w:proofErr w:type="gramEnd"/>
-            <w:r>
-              <w:rPr>
-                <w:rFonts w:ascii="Aptos Narrow" w:hAnsi="Aptos Narrow"/>
-              </w:rPr>
-              <w:t>_fgts</w:t>
-            </w:r>
-            <w:proofErr w:type="spellEnd"/>
-            <w:r>
-              <w:rPr>
-                <w:rFonts w:ascii="Aptos Narrow" w:hAnsi="Aptos Narrow"/>
-              </w:rPr>
-              <w:t xml:space="preserve"> }}</w:t>
+            <w:r>
+              <w:rPr>
+                <w:rFonts w:ascii="Aptos Narrow" w:hAnsi="Aptos Narrow"/>
+              </w:rPr>
+              <w:t>{{ total_fgts }}</w:t>
             </w:r>
           </w:p>
         </w:tc>
@@ -5172,58 +3662,7 @@
         <w:sz w:val="18"/>
         <w:szCs w:val="18"/>
       </w:rPr>
-      <w:t xml:space="preserve">Relatório Confidencial | </w:t>
-    </w:r>
-    <w:proofErr w:type="spellStart"/>
-    <w:r>
-      <w:rPr>
-        <w:i/>
-        <w:iCs/>
-        <w:sz w:val="18"/>
-        <w:szCs w:val="18"/>
-      </w:rPr>
-      <w:t>Powered</w:t>
-    </w:r>
-    <w:proofErr w:type="spellEnd"/>
-    <w:r>
-      <w:rPr>
-        <w:i/>
-        <w:iCs/>
-        <w:sz w:val="18"/>
-        <w:szCs w:val="18"/>
-      </w:rPr>
-      <w:t xml:space="preserve"> </w:t>
-    </w:r>
-    <w:proofErr w:type="spellStart"/>
-    <w:proofErr w:type="gramStart"/>
-    <w:r>
-      <w:rPr>
-        <w:i/>
-        <w:iCs/>
-        <w:sz w:val="18"/>
-        <w:szCs w:val="18"/>
-      </w:rPr>
-      <w:t>by</w:t>
-    </w:r>
-    <w:proofErr w:type="spellEnd"/>
-    <w:r>
-      <w:rPr>
-        <w:i/>
-        <w:iCs/>
-        <w:sz w:val="18"/>
-        <w:szCs w:val="18"/>
-      </w:rPr>
-      <w:t xml:space="preserve"> Processa</w:t>
-    </w:r>
-    <w:proofErr w:type="gramEnd"/>
-    <w:r>
-      <w:rPr>
-        <w:i/>
-        <w:iCs/>
-        <w:sz w:val="18"/>
-        <w:szCs w:val="18"/>
-      </w:rPr>
-      <w:t xml:space="preserve"> AI</w:t>
+      <w:t>Relatório Confidencial | Powered by Processa AI</w:t>
     </w:r>
   </w:p>
   <w:p>

</xml_diff>

<commit_message>
feat: inclusão de rescisão trabalhista na calculadora de rescisão
</commit_message>
<xml_diff>
--- a/services/worker/src/assets/templates/calculadoras/rescisao_trabalhista_report.docx
+++ b/services/worker/src/assets/templates/calculadoras/rescisao_trabalhista_report.docx
@@ -88,9 +88,16 @@
       <w:r>
         <w:t>: {{</w:t>
       </w:r>
+      <w:proofErr w:type="spellStart"/>
       <w:r>
-        <w:t>data_calculo</w:t>
+        <w:t>data_</w:t>
       </w:r>
+      <w:proofErr w:type="gramStart"/>
+      <w:r>
+        <w:t>calculo</w:t>
+      </w:r>
+      <w:proofErr w:type="spellEnd"/>
+      <w:proofErr w:type="gramEnd"/>
       <w:r>
         <w:t>}}</w:t>
       </w:r>
@@ -135,6 +142,7 @@
               </w:rPr>
               <w:t xml:space="preserve">Tipo de </w:t>
             </w:r>
+            <w:proofErr w:type="spellStart"/>
             <w:r>
               <w:rPr>
                 <w:rFonts w:ascii="Aptos Narrow" w:hAnsi="Aptos Narrow"/>
@@ -142,6 +150,7 @@
               </w:rPr>
               <w:t>Rescisão</w:t>
             </w:r>
+            <w:proofErr w:type="spellEnd"/>
           </w:p>
         </w:tc>
         <w:tc>
@@ -156,11 +165,33 @@
                 <w:rFonts w:ascii="Aptos Narrow" w:hAnsi="Aptos Narrow"/>
               </w:rPr>
             </w:pPr>
-            <w:r>
-              <w:rPr>
-                <w:rFonts w:ascii="Aptos Narrow" w:hAnsi="Aptos Narrow"/>
-              </w:rPr>
-              <w:t>{{ tipo_rescisao_label }}</w:t>
+            <w:proofErr w:type="gramStart"/>
+            <w:r>
+              <w:rPr>
+                <w:rFonts w:ascii="Aptos Narrow" w:hAnsi="Aptos Narrow"/>
+              </w:rPr>
+              <w:t xml:space="preserve">{{ </w:t>
+            </w:r>
+            <w:proofErr w:type="spellStart"/>
+            <w:r>
+              <w:rPr>
+                <w:rFonts w:ascii="Aptos Narrow" w:hAnsi="Aptos Narrow"/>
+              </w:rPr>
+              <w:t>tipo</w:t>
+            </w:r>
+            <w:proofErr w:type="gramEnd"/>
+            <w:r>
+              <w:rPr>
+                <w:rFonts w:ascii="Aptos Narrow" w:hAnsi="Aptos Narrow"/>
+              </w:rPr>
+              <w:t>_rescisao_label</w:t>
+            </w:r>
+            <w:proofErr w:type="spellEnd"/>
+            <w:r>
+              <w:rPr>
+                <w:rFonts w:ascii="Aptos Narrow" w:hAnsi="Aptos Narrow"/>
+              </w:rPr>
+              <w:t xml:space="preserve"> }}</w:t>
             </w:r>
           </w:p>
         </w:tc>
@@ -183,13 +214,21 @@
                 <w:rFonts w:ascii="Aptos Narrow" w:hAnsi="Aptos Narrow"/>
                 <w:b/>
               </w:rPr>
-              <w:t>Data de Admiss</w:t>
-            </w:r>
+              <w:t xml:space="preserve">Data de </w:t>
+            </w:r>
+            <w:proofErr w:type="spellStart"/>
             <w:r>
               <w:rPr>
                 <w:rFonts w:ascii="Aptos Narrow" w:hAnsi="Aptos Narrow"/>
                 <w:b/>
               </w:rPr>
+              <w:t>Admiss</w:t>
+            </w:r>
+            <w:r>
+              <w:rPr>
+                <w:rFonts w:ascii="Aptos Narrow" w:hAnsi="Aptos Narrow"/>
+                <w:b/>
+              </w:rPr>
               <w:t>ã</w:t>
             </w:r>
             <w:r>
@@ -199,6 +238,7 @@
               </w:rPr>
               <w:t>o</w:t>
             </w:r>
+            <w:proofErr w:type="spellEnd"/>
           </w:p>
         </w:tc>
         <w:tc>
@@ -213,11 +253,33 @@
                 <w:rFonts w:ascii="Aptos Narrow" w:hAnsi="Aptos Narrow"/>
               </w:rPr>
             </w:pPr>
-            <w:r>
-              <w:rPr>
-                <w:rFonts w:ascii="Aptos Narrow" w:hAnsi="Aptos Narrow"/>
-              </w:rPr>
-              <w:t>{{ data_admissao }}</w:t>
+            <w:proofErr w:type="gramStart"/>
+            <w:r>
+              <w:rPr>
+                <w:rFonts w:ascii="Aptos Narrow" w:hAnsi="Aptos Narrow"/>
+              </w:rPr>
+              <w:t xml:space="preserve">{{ </w:t>
+            </w:r>
+            <w:proofErr w:type="spellStart"/>
+            <w:r>
+              <w:rPr>
+                <w:rFonts w:ascii="Aptos Narrow" w:hAnsi="Aptos Narrow"/>
+              </w:rPr>
+              <w:t>data</w:t>
+            </w:r>
+            <w:proofErr w:type="gramEnd"/>
+            <w:r>
+              <w:rPr>
+                <w:rFonts w:ascii="Aptos Narrow" w:hAnsi="Aptos Narrow"/>
+              </w:rPr>
+              <w:t>_admissao</w:t>
+            </w:r>
+            <w:proofErr w:type="spellEnd"/>
+            <w:r>
+              <w:rPr>
+                <w:rFonts w:ascii="Aptos Narrow" w:hAnsi="Aptos Narrow"/>
+              </w:rPr>
+              <w:t xml:space="preserve"> }}</w:t>
             </w:r>
           </w:p>
         </w:tc>
@@ -240,15 +302,24 @@
                 <w:rFonts w:ascii="Aptos Narrow" w:hAnsi="Aptos Narrow"/>
                 <w:b/>
               </w:rPr>
-              <w:t>Data de Rescis</w:t>
-            </w:r>
+              <w:t xml:space="preserve">Data de </w:t>
+            </w:r>
+            <w:proofErr w:type="spellStart"/>
             <w:r>
               <w:rPr>
                 <w:rFonts w:ascii="Aptos Narrow" w:hAnsi="Aptos Narrow"/>
                 <w:b/>
               </w:rPr>
+              <w:t>Rescis</w:t>
+            </w:r>
+            <w:r>
+              <w:rPr>
+                <w:rFonts w:ascii="Aptos Narrow" w:hAnsi="Aptos Narrow"/>
+                <w:b/>
+              </w:rPr>
               <w:t>ão</w:t>
             </w:r>
+            <w:proofErr w:type="spellEnd"/>
           </w:p>
         </w:tc>
         <w:tc>
@@ -263,11 +334,33 @@
                 <w:rFonts w:ascii="Aptos Narrow" w:hAnsi="Aptos Narrow"/>
               </w:rPr>
             </w:pPr>
-            <w:r>
-              <w:rPr>
-                <w:rFonts w:ascii="Aptos Narrow" w:hAnsi="Aptos Narrow"/>
-              </w:rPr>
-              <w:t>{{ data_rescisao }}</w:t>
+            <w:proofErr w:type="gramStart"/>
+            <w:r>
+              <w:rPr>
+                <w:rFonts w:ascii="Aptos Narrow" w:hAnsi="Aptos Narrow"/>
+              </w:rPr>
+              <w:t xml:space="preserve">{{ </w:t>
+            </w:r>
+            <w:proofErr w:type="spellStart"/>
+            <w:r>
+              <w:rPr>
+                <w:rFonts w:ascii="Aptos Narrow" w:hAnsi="Aptos Narrow"/>
+              </w:rPr>
+              <w:t>data</w:t>
+            </w:r>
+            <w:proofErr w:type="gramEnd"/>
+            <w:r>
+              <w:rPr>
+                <w:rFonts w:ascii="Aptos Narrow" w:hAnsi="Aptos Narrow"/>
+              </w:rPr>
+              <w:t>_rescisao</w:t>
+            </w:r>
+            <w:proofErr w:type="spellEnd"/>
+            <w:r>
+              <w:rPr>
+                <w:rFonts w:ascii="Aptos Narrow" w:hAnsi="Aptos Narrow"/>
+              </w:rPr>
+              <w:t xml:space="preserve"> }}</w:t>
             </w:r>
           </w:p>
         </w:tc>
@@ -290,13 +383,21 @@
                 <w:rFonts w:ascii="Aptos Narrow" w:hAnsi="Aptos Narrow"/>
                 <w:b/>
               </w:rPr>
-              <w:t>Tempo de Servi</w:t>
-            </w:r>
+              <w:t xml:space="preserve">Tempo de </w:t>
+            </w:r>
+            <w:proofErr w:type="spellStart"/>
             <w:r>
               <w:rPr>
                 <w:rFonts w:ascii="Aptos Narrow" w:hAnsi="Aptos Narrow"/>
                 <w:b/>
               </w:rPr>
+              <w:t>Servi</w:t>
+            </w:r>
+            <w:r>
+              <w:rPr>
+                <w:rFonts w:ascii="Aptos Narrow" w:hAnsi="Aptos Narrow"/>
+                <w:b/>
+              </w:rPr>
               <w:t>ç</w:t>
             </w:r>
             <w:r>
@@ -306,6 +407,7 @@
               </w:rPr>
               <w:t>o</w:t>
             </w:r>
+            <w:proofErr w:type="spellEnd"/>
           </w:p>
         </w:tc>
         <w:tc>
@@ -320,11 +422,33 @@
                 <w:rFonts w:ascii="Aptos Narrow" w:hAnsi="Aptos Narrow"/>
               </w:rPr>
             </w:pPr>
-            <w:r>
-              <w:rPr>
-                <w:rFonts w:ascii="Aptos Narrow" w:hAnsi="Aptos Narrow"/>
-              </w:rPr>
-              <w:t>{{ tempo_servico }}</w:t>
+            <w:proofErr w:type="gramStart"/>
+            <w:r>
+              <w:rPr>
+                <w:rFonts w:ascii="Aptos Narrow" w:hAnsi="Aptos Narrow"/>
+              </w:rPr>
+              <w:t xml:space="preserve">{{ </w:t>
+            </w:r>
+            <w:proofErr w:type="spellStart"/>
+            <w:r>
+              <w:rPr>
+                <w:rFonts w:ascii="Aptos Narrow" w:hAnsi="Aptos Narrow"/>
+              </w:rPr>
+              <w:t>tempo</w:t>
+            </w:r>
+            <w:proofErr w:type="gramEnd"/>
+            <w:r>
+              <w:rPr>
+                <w:rFonts w:ascii="Aptos Narrow" w:hAnsi="Aptos Narrow"/>
+              </w:rPr>
+              <w:t>_servico</w:t>
+            </w:r>
+            <w:proofErr w:type="spellEnd"/>
+            <w:r>
+              <w:rPr>
+                <w:rFonts w:ascii="Aptos Narrow" w:hAnsi="Aptos Narrow"/>
+              </w:rPr>
+              <w:t xml:space="preserve"> }}</w:t>
             </w:r>
           </w:p>
         </w:tc>
@@ -347,8 +471,17 @@
                 <w:rFonts w:ascii="Aptos Narrow" w:hAnsi="Aptos Narrow"/>
                 <w:b/>
               </w:rPr>
-              <w:t>Tipo do Aviso Prévio</w:t>
-            </w:r>
+              <w:t xml:space="preserve">Tipo do Aviso </w:t>
+            </w:r>
+            <w:proofErr w:type="spellStart"/>
+            <w:r>
+              <w:rPr>
+                <w:rFonts w:ascii="Aptos Narrow" w:hAnsi="Aptos Narrow"/>
+                <w:b/>
+              </w:rPr>
+              <w:t>Prévio</w:t>
+            </w:r>
+            <w:proofErr w:type="spellEnd"/>
           </w:p>
         </w:tc>
         <w:tc>
@@ -363,11 +496,33 @@
                 <w:rFonts w:ascii="Aptos Narrow" w:hAnsi="Aptos Narrow"/>
               </w:rPr>
             </w:pPr>
-            <w:r>
-              <w:rPr>
-                <w:rFonts w:ascii="Aptos Narrow" w:hAnsi="Aptos Narrow"/>
-              </w:rPr>
-              <w:t>{{ aviso_previo_label }}</w:t>
+            <w:proofErr w:type="gramStart"/>
+            <w:r>
+              <w:rPr>
+                <w:rFonts w:ascii="Aptos Narrow" w:hAnsi="Aptos Narrow"/>
+              </w:rPr>
+              <w:t xml:space="preserve">{{ </w:t>
+            </w:r>
+            <w:proofErr w:type="spellStart"/>
+            <w:r>
+              <w:rPr>
+                <w:rFonts w:ascii="Aptos Narrow" w:hAnsi="Aptos Narrow"/>
+              </w:rPr>
+              <w:t>aviso</w:t>
+            </w:r>
+            <w:proofErr w:type="gramEnd"/>
+            <w:r>
+              <w:rPr>
+                <w:rFonts w:ascii="Aptos Narrow" w:hAnsi="Aptos Narrow"/>
+              </w:rPr>
+              <w:t>_previo_label</w:t>
+            </w:r>
+            <w:proofErr w:type="spellEnd"/>
+            <w:r>
+              <w:rPr>
+                <w:rFonts w:ascii="Aptos Narrow" w:hAnsi="Aptos Narrow"/>
+              </w:rPr>
+              <w:t xml:space="preserve"> }}</w:t>
             </w:r>
           </w:p>
         </w:tc>
@@ -574,29 +729,69 @@
               </w:rPr>
               <w:t>{{</w:t>
             </w:r>
-            <w:r>
-              <w:rPr>
-                <w:rFonts w:ascii="Aptos Narrow" w:eastAsia="Times New Roman" w:hAnsi="Aptos Narrow" w:cs="Times New Roman"/>
-                <w:color w:val="000000"/>
-                <w:kern w:val="0"/>
-                <w:sz w:val="22"/>
-                <w:szCs w:val="22"/>
-                <w:lang w:eastAsia="pt-BR"/>
-                <w14:ligatures w14:val="none"/>
-              </w:rPr>
-              <w:t>composicao_remuneracao</w:t>
-            </w:r>
-            <w:r>
-              <w:rPr>
-                <w:rFonts w:ascii="Aptos Narrow" w:eastAsia="Times New Roman" w:hAnsi="Aptos Narrow" w:cs="Times New Roman"/>
-                <w:color w:val="000000"/>
-                <w:kern w:val="0"/>
-                <w:sz w:val="22"/>
-                <w:szCs w:val="22"/>
-                <w:lang w:eastAsia="pt-BR"/>
-                <w14:ligatures w14:val="none"/>
-              </w:rPr>
-              <w:t>.salario_base}}</w:t>
+            <w:proofErr w:type="spellStart"/>
+            <w:r>
+              <w:rPr>
+                <w:rFonts w:ascii="Aptos Narrow" w:eastAsia="Times New Roman" w:hAnsi="Aptos Narrow" w:cs="Times New Roman"/>
+                <w:color w:val="000000"/>
+                <w:kern w:val="0"/>
+                <w:sz w:val="22"/>
+                <w:szCs w:val="22"/>
+                <w:lang w:eastAsia="pt-BR"/>
+                <w14:ligatures w14:val="none"/>
+              </w:rPr>
+              <w:t>composicao_</w:t>
+            </w:r>
+            <w:proofErr w:type="gramStart"/>
+            <w:r>
+              <w:rPr>
+                <w:rFonts w:ascii="Aptos Narrow" w:eastAsia="Times New Roman" w:hAnsi="Aptos Narrow" w:cs="Times New Roman"/>
+                <w:color w:val="000000"/>
+                <w:kern w:val="0"/>
+                <w:sz w:val="22"/>
+                <w:szCs w:val="22"/>
+                <w:lang w:eastAsia="pt-BR"/>
+                <w14:ligatures w14:val="none"/>
+              </w:rPr>
+              <w:t>remuneracao</w:t>
+            </w:r>
+            <w:r>
+              <w:rPr>
+                <w:rFonts w:ascii="Aptos Narrow" w:eastAsia="Times New Roman" w:hAnsi="Aptos Narrow" w:cs="Times New Roman"/>
+                <w:color w:val="000000"/>
+                <w:kern w:val="0"/>
+                <w:sz w:val="22"/>
+                <w:szCs w:val="22"/>
+                <w:lang w:eastAsia="pt-BR"/>
+                <w14:ligatures w14:val="none"/>
+              </w:rPr>
+              <w:t>.salario</w:t>
+            </w:r>
+            <w:proofErr w:type="gramEnd"/>
+            <w:r>
+              <w:rPr>
+                <w:rFonts w:ascii="Aptos Narrow" w:eastAsia="Times New Roman" w:hAnsi="Aptos Narrow" w:cs="Times New Roman"/>
+                <w:color w:val="000000"/>
+                <w:kern w:val="0"/>
+                <w:sz w:val="22"/>
+                <w:szCs w:val="22"/>
+                <w:lang w:eastAsia="pt-BR"/>
+                <w14:ligatures w14:val="none"/>
+              </w:rPr>
+              <w:t>_base</w:t>
+            </w:r>
+            <w:proofErr w:type="spellEnd"/>
+            <w:r>
+              <w:rPr>
+                <w:rFonts w:ascii="Aptos Narrow" w:eastAsia="Times New Roman" w:hAnsi="Aptos Narrow" w:cs="Times New Roman"/>
+                <w:color w:val="000000"/>
+                <w:kern w:val="0"/>
+                <w:sz w:val="22"/>
+                <w:szCs w:val="22"/>
+                <w:lang w:eastAsia="pt-BR"/>
+                <w14:ligatures w14:val="none"/>
+              </w:rPr>
+              <w:t>}}</w:t>
             </w:r>
           </w:p>
         </w:tc>
@@ -673,6 +868,7 @@
                 <w14:ligatures w14:val="none"/>
               </w:rPr>
             </w:pPr>
+            <w:proofErr w:type="gramStart"/>
             <w:r>
               <w:rPr>
                 <w:rFonts w:ascii="Aptos Narrow" w:eastAsia="Times New Roman" w:hAnsi="Aptos Narrow" w:cs="Times New Roman"/>
@@ -697,29 +893,70 @@
               </w:rPr>
               <w:t xml:space="preserve"> </w:t>
             </w:r>
-            <w:r>
-              <w:rPr>
-                <w:rFonts w:ascii="Aptos Narrow" w:eastAsia="Times New Roman" w:hAnsi="Aptos Narrow" w:cs="Times New Roman"/>
-                <w:color w:val="000000"/>
-                <w:kern w:val="0"/>
-                <w:sz w:val="22"/>
-                <w:szCs w:val="22"/>
-                <w:lang w:eastAsia="pt-BR"/>
-                <w14:ligatures w14:val="none"/>
-              </w:rPr>
-              <w:t>composicao_remuneracao</w:t>
-            </w:r>
-            <w:r>
-              <w:rPr>
-                <w:rFonts w:ascii="Aptos Narrow" w:eastAsia="Times New Roman" w:hAnsi="Aptos Narrow" w:cs="Times New Roman"/>
-                <w:color w:val="000000"/>
-                <w:kern w:val="0"/>
-                <w:sz w:val="22"/>
-                <w:szCs w:val="22"/>
-                <w:lang w:eastAsia="pt-BR"/>
-                <w14:ligatures w14:val="none"/>
-              </w:rPr>
-              <w:t>.periculosidade}}</w:t>
+            <w:proofErr w:type="spellStart"/>
+            <w:r>
+              <w:rPr>
+                <w:rFonts w:ascii="Aptos Narrow" w:eastAsia="Times New Roman" w:hAnsi="Aptos Narrow" w:cs="Times New Roman"/>
+                <w:color w:val="000000"/>
+                <w:kern w:val="0"/>
+                <w:sz w:val="22"/>
+                <w:szCs w:val="22"/>
+                <w:lang w:eastAsia="pt-BR"/>
+                <w14:ligatures w14:val="none"/>
+              </w:rPr>
+              <w:t>composicao</w:t>
+            </w:r>
+            <w:proofErr w:type="gramEnd"/>
+            <w:r>
+              <w:rPr>
+                <w:rFonts w:ascii="Aptos Narrow" w:eastAsia="Times New Roman" w:hAnsi="Aptos Narrow" w:cs="Times New Roman"/>
+                <w:color w:val="000000"/>
+                <w:kern w:val="0"/>
+                <w:sz w:val="22"/>
+                <w:szCs w:val="22"/>
+                <w:lang w:eastAsia="pt-BR"/>
+                <w14:ligatures w14:val="none"/>
+              </w:rPr>
+              <w:t>_</w:t>
+            </w:r>
+            <w:proofErr w:type="gramStart"/>
+            <w:r>
+              <w:rPr>
+                <w:rFonts w:ascii="Aptos Narrow" w:eastAsia="Times New Roman" w:hAnsi="Aptos Narrow" w:cs="Times New Roman"/>
+                <w:color w:val="000000"/>
+                <w:kern w:val="0"/>
+                <w:sz w:val="22"/>
+                <w:szCs w:val="22"/>
+                <w:lang w:eastAsia="pt-BR"/>
+                <w14:ligatures w14:val="none"/>
+              </w:rPr>
+              <w:t>remuneracao</w:t>
+            </w:r>
+            <w:r>
+              <w:rPr>
+                <w:rFonts w:ascii="Aptos Narrow" w:eastAsia="Times New Roman" w:hAnsi="Aptos Narrow" w:cs="Times New Roman"/>
+                <w:color w:val="000000"/>
+                <w:kern w:val="0"/>
+                <w:sz w:val="22"/>
+                <w:szCs w:val="22"/>
+                <w:lang w:eastAsia="pt-BR"/>
+                <w14:ligatures w14:val="none"/>
+              </w:rPr>
+              <w:t>.periculosidade</w:t>
+            </w:r>
+            <w:proofErr w:type="spellEnd"/>
+            <w:proofErr w:type="gramEnd"/>
+            <w:r>
+              <w:rPr>
+                <w:rFonts w:ascii="Aptos Narrow" w:eastAsia="Times New Roman" w:hAnsi="Aptos Narrow" w:cs="Times New Roman"/>
+                <w:color w:val="000000"/>
+                <w:kern w:val="0"/>
+                <w:sz w:val="22"/>
+                <w:szCs w:val="22"/>
+                <w:lang w:eastAsia="pt-BR"/>
+                <w14:ligatures w14:val="none"/>
+              </w:rPr>
+              <w:t>}}</w:t>
             </w:r>
           </w:p>
         </w:tc>
@@ -796,6 +1033,7 @@
                 <w14:ligatures w14:val="none"/>
               </w:rPr>
             </w:pPr>
+            <w:proofErr w:type="gramStart"/>
             <w:r>
               <w:rPr>
                 <w:rFonts w:ascii="Aptos Narrow" w:eastAsia="Times New Roman" w:hAnsi="Aptos Narrow" w:cs="Times New Roman"/>
@@ -820,29 +1058,70 @@
               </w:rPr>
               <w:t xml:space="preserve"> </w:t>
             </w:r>
-            <w:r>
-              <w:rPr>
-                <w:rFonts w:ascii="Aptos Narrow" w:eastAsia="Times New Roman" w:hAnsi="Aptos Narrow" w:cs="Times New Roman"/>
-                <w:color w:val="000000"/>
-                <w:kern w:val="0"/>
-                <w:sz w:val="22"/>
-                <w:szCs w:val="22"/>
-                <w:lang w:eastAsia="pt-BR"/>
-                <w14:ligatures w14:val="none"/>
-              </w:rPr>
-              <w:t>composicao_remuneracao</w:t>
-            </w:r>
-            <w:r>
-              <w:rPr>
-                <w:rFonts w:ascii="Aptos Narrow" w:eastAsia="Times New Roman" w:hAnsi="Aptos Narrow" w:cs="Times New Roman"/>
-                <w:color w:val="000000"/>
-                <w:kern w:val="0"/>
-                <w:sz w:val="22"/>
-                <w:szCs w:val="22"/>
-                <w:lang w:eastAsia="pt-BR"/>
-                <w14:ligatures w14:val="none"/>
-              </w:rPr>
-              <w:t>.insalubridade}}</w:t>
+            <w:proofErr w:type="spellStart"/>
+            <w:r>
+              <w:rPr>
+                <w:rFonts w:ascii="Aptos Narrow" w:eastAsia="Times New Roman" w:hAnsi="Aptos Narrow" w:cs="Times New Roman"/>
+                <w:color w:val="000000"/>
+                <w:kern w:val="0"/>
+                <w:sz w:val="22"/>
+                <w:szCs w:val="22"/>
+                <w:lang w:eastAsia="pt-BR"/>
+                <w14:ligatures w14:val="none"/>
+              </w:rPr>
+              <w:t>composicao</w:t>
+            </w:r>
+            <w:proofErr w:type="gramEnd"/>
+            <w:r>
+              <w:rPr>
+                <w:rFonts w:ascii="Aptos Narrow" w:eastAsia="Times New Roman" w:hAnsi="Aptos Narrow" w:cs="Times New Roman"/>
+                <w:color w:val="000000"/>
+                <w:kern w:val="0"/>
+                <w:sz w:val="22"/>
+                <w:szCs w:val="22"/>
+                <w:lang w:eastAsia="pt-BR"/>
+                <w14:ligatures w14:val="none"/>
+              </w:rPr>
+              <w:t>_</w:t>
+            </w:r>
+            <w:proofErr w:type="gramStart"/>
+            <w:r>
+              <w:rPr>
+                <w:rFonts w:ascii="Aptos Narrow" w:eastAsia="Times New Roman" w:hAnsi="Aptos Narrow" w:cs="Times New Roman"/>
+                <w:color w:val="000000"/>
+                <w:kern w:val="0"/>
+                <w:sz w:val="22"/>
+                <w:szCs w:val="22"/>
+                <w:lang w:eastAsia="pt-BR"/>
+                <w14:ligatures w14:val="none"/>
+              </w:rPr>
+              <w:t>remuneracao</w:t>
+            </w:r>
+            <w:r>
+              <w:rPr>
+                <w:rFonts w:ascii="Aptos Narrow" w:eastAsia="Times New Roman" w:hAnsi="Aptos Narrow" w:cs="Times New Roman"/>
+                <w:color w:val="000000"/>
+                <w:kern w:val="0"/>
+                <w:sz w:val="22"/>
+                <w:szCs w:val="22"/>
+                <w:lang w:eastAsia="pt-BR"/>
+                <w14:ligatures w14:val="none"/>
+              </w:rPr>
+              <w:t>.insalubridade</w:t>
+            </w:r>
+            <w:proofErr w:type="spellEnd"/>
+            <w:proofErr w:type="gramEnd"/>
+            <w:r>
+              <w:rPr>
+                <w:rFonts w:ascii="Aptos Narrow" w:eastAsia="Times New Roman" w:hAnsi="Aptos Narrow" w:cs="Times New Roman"/>
+                <w:color w:val="000000"/>
+                <w:kern w:val="0"/>
+                <w:sz w:val="22"/>
+                <w:szCs w:val="22"/>
+                <w:lang w:eastAsia="pt-BR"/>
+                <w14:ligatures w14:val="none"/>
+              </w:rPr>
+              <w:t>}}</w:t>
             </w:r>
           </w:p>
         </w:tc>
@@ -919,6 +1198,7 @@
                 <w14:ligatures w14:val="none"/>
               </w:rPr>
             </w:pPr>
+            <w:proofErr w:type="gramStart"/>
             <w:r>
               <w:rPr>
                 <w:rFonts w:ascii="Aptos Narrow" w:eastAsia="Times New Roman" w:hAnsi="Aptos Narrow" w:cs="Times New Roman"/>
@@ -943,29 +1223,221 @@
               </w:rPr>
               <w:t xml:space="preserve"> </w:t>
             </w:r>
-            <w:r>
-              <w:rPr>
-                <w:rFonts w:ascii="Aptos Narrow" w:eastAsia="Times New Roman" w:hAnsi="Aptos Narrow" w:cs="Times New Roman"/>
-                <w:color w:val="000000"/>
-                <w:kern w:val="0"/>
-                <w:sz w:val="22"/>
-                <w:szCs w:val="22"/>
-                <w:lang w:eastAsia="pt-BR"/>
-                <w14:ligatures w14:val="none"/>
-              </w:rPr>
-              <w:t>composicao_remuneracao</w:t>
-            </w:r>
-            <w:r>
-              <w:rPr>
-                <w:rFonts w:ascii="Aptos Narrow" w:eastAsia="Times New Roman" w:hAnsi="Aptos Narrow" w:cs="Times New Roman"/>
-                <w:color w:val="000000"/>
-                <w:kern w:val="0"/>
-                <w:sz w:val="22"/>
-                <w:szCs w:val="22"/>
-                <w:lang w:eastAsia="pt-BR"/>
-                <w14:ligatures w14:val="none"/>
-              </w:rPr>
-              <w:t>.noturno }}</w:t>
+            <w:proofErr w:type="spellStart"/>
+            <w:r>
+              <w:rPr>
+                <w:rFonts w:ascii="Aptos Narrow" w:eastAsia="Times New Roman" w:hAnsi="Aptos Narrow" w:cs="Times New Roman"/>
+                <w:color w:val="000000"/>
+                <w:kern w:val="0"/>
+                <w:sz w:val="22"/>
+                <w:szCs w:val="22"/>
+                <w:lang w:eastAsia="pt-BR"/>
+                <w14:ligatures w14:val="none"/>
+              </w:rPr>
+              <w:t>composicao</w:t>
+            </w:r>
+            <w:proofErr w:type="gramEnd"/>
+            <w:r>
+              <w:rPr>
+                <w:rFonts w:ascii="Aptos Narrow" w:eastAsia="Times New Roman" w:hAnsi="Aptos Narrow" w:cs="Times New Roman"/>
+                <w:color w:val="000000"/>
+                <w:kern w:val="0"/>
+                <w:sz w:val="22"/>
+                <w:szCs w:val="22"/>
+                <w:lang w:eastAsia="pt-BR"/>
+                <w14:ligatures w14:val="none"/>
+              </w:rPr>
+              <w:t>_</w:t>
+            </w:r>
+            <w:proofErr w:type="gramStart"/>
+            <w:r>
+              <w:rPr>
+                <w:rFonts w:ascii="Aptos Narrow" w:eastAsia="Times New Roman" w:hAnsi="Aptos Narrow" w:cs="Times New Roman"/>
+                <w:color w:val="000000"/>
+                <w:kern w:val="0"/>
+                <w:sz w:val="22"/>
+                <w:szCs w:val="22"/>
+                <w:lang w:eastAsia="pt-BR"/>
+                <w14:ligatures w14:val="none"/>
+              </w:rPr>
+              <w:t>remuneracao</w:t>
+            </w:r>
+            <w:r>
+              <w:rPr>
+                <w:rFonts w:ascii="Aptos Narrow" w:eastAsia="Times New Roman" w:hAnsi="Aptos Narrow" w:cs="Times New Roman"/>
+                <w:color w:val="000000"/>
+                <w:kern w:val="0"/>
+                <w:sz w:val="22"/>
+                <w:szCs w:val="22"/>
+                <w:lang w:eastAsia="pt-BR"/>
+                <w14:ligatures w14:val="none"/>
+              </w:rPr>
+              <w:t>.noturno</w:t>
+            </w:r>
+            <w:proofErr w:type="spellEnd"/>
+            <w:proofErr w:type="gramEnd"/>
+            <w:r>
+              <w:rPr>
+                <w:rFonts w:ascii="Aptos Narrow" w:eastAsia="Times New Roman" w:hAnsi="Aptos Narrow" w:cs="Times New Roman"/>
+                <w:color w:val="000000"/>
+                <w:kern w:val="0"/>
+                <w:sz w:val="22"/>
+                <w:szCs w:val="22"/>
+                <w:lang w:eastAsia="pt-BR"/>
+                <w14:ligatures w14:val="none"/>
+              </w:rPr>
+              <w:t xml:space="preserve"> }}</w:t>
+            </w:r>
+          </w:p>
+        </w:tc>
+      </w:tr>
+      <w:tr>
+        <w:trPr>
+          <w:trHeight w:val="300"/>
+        </w:trPr>
+        <w:tc>
+          <w:tcPr>
+            <w:tcW w:w="5102" w:type="dxa"/>
+            <w:tcBorders>
+              <w:top w:val="nil"/>
+              <w:left w:val="single" w:sz="4" w:space="0" w:color="auto"/>
+              <w:bottom w:val="single" w:sz="4" w:space="0" w:color="auto"/>
+              <w:right w:val="single" w:sz="4" w:space="0" w:color="auto"/>
+            </w:tcBorders>
+            <w:noWrap/>
+            <w:vAlign w:val="bottom"/>
+          </w:tcPr>
+          <w:p>
+            <w:pPr>
+              <w:spacing w:after="0" w:line="240" w:lineRule="auto"/>
+              <w:jc w:val="left"/>
+              <w:rPr>
+                <w:rFonts w:ascii="Aptos Narrow" w:eastAsia="Times New Roman" w:hAnsi="Aptos Narrow" w:cs="Times New Roman"/>
+                <w:color w:val="000000"/>
+                <w:kern w:val="0"/>
+                <w:sz w:val="22"/>
+                <w:szCs w:val="22"/>
+                <w:lang w:eastAsia="pt-BR"/>
+                <w14:ligatures w14:val="none"/>
+              </w:rPr>
+            </w:pPr>
+            <w:r>
+              <w:rPr>
+                <w:rFonts w:ascii="Aptos Narrow" w:eastAsia="Times New Roman" w:hAnsi="Aptos Narrow" w:cs="Times New Roman"/>
+                <w:color w:val="000000"/>
+                <w:kern w:val="0"/>
+                <w:sz w:val="22"/>
+                <w:szCs w:val="22"/>
+                <w:lang w:eastAsia="pt-BR"/>
+                <w14:ligatures w14:val="none"/>
+              </w:rPr>
+              <w:t>Horas Extras</w:t>
+            </w:r>
+          </w:p>
+        </w:tc>
+        <w:tc>
+          <w:tcPr>
+            <w:tcW w:w="5102" w:type="dxa"/>
+            <w:tcBorders>
+              <w:top w:val="nil"/>
+              <w:left w:val="nil"/>
+              <w:bottom w:val="single" w:sz="4" w:space="0" w:color="auto"/>
+              <w:right w:val="single" w:sz="4" w:space="0" w:color="auto"/>
+            </w:tcBorders>
+            <w:noWrap/>
+            <w:vAlign w:val="bottom"/>
+          </w:tcPr>
+          <w:p>
+            <w:pPr>
+              <w:spacing w:after="0" w:line="240" w:lineRule="auto"/>
+              <w:jc w:val="center"/>
+              <w:rPr>
+                <w:rFonts w:ascii="Aptos Narrow" w:eastAsia="Times New Roman" w:hAnsi="Aptos Narrow" w:cs="Times New Roman"/>
+                <w:color w:val="000000"/>
+                <w:kern w:val="0"/>
+                <w:sz w:val="22"/>
+                <w:szCs w:val="22"/>
+                <w:lang w:eastAsia="pt-BR"/>
+                <w14:ligatures w14:val="none"/>
+              </w:rPr>
+            </w:pPr>
+            <w:proofErr w:type="gramStart"/>
+            <w:r>
+              <w:rPr>
+                <w:rFonts w:ascii="Aptos Narrow" w:eastAsia="Times New Roman" w:hAnsi="Aptos Narrow" w:cs="Times New Roman"/>
+                <w:color w:val="000000"/>
+                <w:kern w:val="0"/>
+                <w:sz w:val="22"/>
+                <w:szCs w:val="22"/>
+                <w:lang w:eastAsia="pt-BR"/>
+                <w14:ligatures w14:val="none"/>
+              </w:rPr>
+              <w:t xml:space="preserve">{{ </w:t>
+            </w:r>
+            <w:proofErr w:type="spellStart"/>
+            <w:r>
+              <w:rPr>
+                <w:rFonts w:ascii="Aptos Narrow" w:eastAsia="Times New Roman" w:hAnsi="Aptos Narrow" w:cs="Times New Roman"/>
+                <w:color w:val="000000"/>
+                <w:kern w:val="0"/>
+                <w:sz w:val="22"/>
+                <w:szCs w:val="22"/>
+                <w:lang w:eastAsia="pt-BR"/>
+                <w14:ligatures w14:val="none"/>
+              </w:rPr>
+              <w:t>composicao</w:t>
+            </w:r>
+            <w:proofErr w:type="gramEnd"/>
+            <w:r>
+              <w:rPr>
+                <w:rFonts w:ascii="Aptos Narrow" w:eastAsia="Times New Roman" w:hAnsi="Aptos Narrow" w:cs="Times New Roman"/>
+                <w:color w:val="000000"/>
+                <w:kern w:val="0"/>
+                <w:sz w:val="22"/>
+                <w:szCs w:val="22"/>
+                <w:lang w:eastAsia="pt-BR"/>
+                <w14:ligatures w14:val="none"/>
+              </w:rPr>
+              <w:t>_</w:t>
+            </w:r>
+            <w:proofErr w:type="gramStart"/>
+            <w:r>
+              <w:rPr>
+                <w:rFonts w:ascii="Aptos Narrow" w:eastAsia="Times New Roman" w:hAnsi="Aptos Narrow" w:cs="Times New Roman"/>
+                <w:color w:val="000000"/>
+                <w:kern w:val="0"/>
+                <w:sz w:val="22"/>
+                <w:szCs w:val="22"/>
+                <w:lang w:eastAsia="pt-BR"/>
+                <w14:ligatures w14:val="none"/>
+              </w:rPr>
+              <w:t>remuneracao.horas</w:t>
+            </w:r>
+            <w:proofErr w:type="gramEnd"/>
+            <w:r>
+              <w:rPr>
+                <w:rFonts w:ascii="Aptos Narrow" w:eastAsia="Times New Roman" w:hAnsi="Aptos Narrow" w:cs="Times New Roman"/>
+                <w:color w:val="000000"/>
+                <w:kern w:val="0"/>
+                <w:sz w:val="22"/>
+                <w:szCs w:val="22"/>
+                <w:lang w:eastAsia="pt-BR"/>
+                <w14:ligatures w14:val="none"/>
+              </w:rPr>
+              <w:t>_extras</w:t>
+            </w:r>
+            <w:proofErr w:type="spellEnd"/>
+            <w:r>
+              <w:rPr>
+                <w:rFonts w:ascii="Aptos Narrow" w:eastAsia="Times New Roman" w:hAnsi="Aptos Narrow" w:cs="Times New Roman"/>
+                <w:color w:val="000000"/>
+                <w:kern w:val="0"/>
+                <w:sz w:val="22"/>
+                <w:szCs w:val="22"/>
+                <w:lang w:eastAsia="pt-BR"/>
+                <w14:ligatures w14:val="none"/>
+              </w:rPr>
+              <w:t xml:space="preserve"> }}</w:t>
             </w:r>
           </w:p>
         </w:tc>
@@ -1042,6 +1514,7 @@
                 <w14:ligatures w14:val="none"/>
               </w:rPr>
             </w:pPr>
+            <w:proofErr w:type="gramStart"/>
             <w:r>
               <w:rPr>
                 <w:rFonts w:ascii="Aptos Narrow" w:eastAsia="Times New Roman" w:hAnsi="Aptos Narrow" w:cs="Times New Roman"/>
@@ -1066,29 +1539,82 @@
               </w:rPr>
               <w:t xml:space="preserve"> </w:t>
             </w:r>
-            <w:r>
-              <w:rPr>
-                <w:rFonts w:ascii="Aptos Narrow" w:eastAsia="Times New Roman" w:hAnsi="Aptos Narrow" w:cs="Times New Roman"/>
-                <w:color w:val="000000"/>
-                <w:kern w:val="0"/>
-                <w:sz w:val="22"/>
-                <w:szCs w:val="22"/>
-                <w:lang w:eastAsia="pt-BR"/>
-                <w14:ligatures w14:val="none"/>
-              </w:rPr>
-              <w:t>composicao_remuneracao</w:t>
-            </w:r>
-            <w:r>
-              <w:rPr>
-                <w:rFonts w:ascii="Aptos Narrow" w:eastAsia="Times New Roman" w:hAnsi="Aptos Narrow" w:cs="Times New Roman"/>
-                <w:color w:val="000000"/>
-                <w:kern w:val="0"/>
-                <w:sz w:val="22"/>
-                <w:szCs w:val="22"/>
-                <w:lang w:eastAsia="pt-BR"/>
-                <w14:ligatures w14:val="none"/>
-              </w:rPr>
-              <w:t>.outras_verbas}}</w:t>
+            <w:proofErr w:type="spellStart"/>
+            <w:r>
+              <w:rPr>
+                <w:rFonts w:ascii="Aptos Narrow" w:eastAsia="Times New Roman" w:hAnsi="Aptos Narrow" w:cs="Times New Roman"/>
+                <w:color w:val="000000"/>
+                <w:kern w:val="0"/>
+                <w:sz w:val="22"/>
+                <w:szCs w:val="22"/>
+                <w:lang w:eastAsia="pt-BR"/>
+                <w14:ligatures w14:val="none"/>
+              </w:rPr>
+              <w:t>composicao</w:t>
+            </w:r>
+            <w:proofErr w:type="gramEnd"/>
+            <w:r>
+              <w:rPr>
+                <w:rFonts w:ascii="Aptos Narrow" w:eastAsia="Times New Roman" w:hAnsi="Aptos Narrow" w:cs="Times New Roman"/>
+                <w:color w:val="000000"/>
+                <w:kern w:val="0"/>
+                <w:sz w:val="22"/>
+                <w:szCs w:val="22"/>
+                <w:lang w:eastAsia="pt-BR"/>
+                <w14:ligatures w14:val="none"/>
+              </w:rPr>
+              <w:t>_</w:t>
+            </w:r>
+            <w:proofErr w:type="gramStart"/>
+            <w:r>
+              <w:rPr>
+                <w:rFonts w:ascii="Aptos Narrow" w:eastAsia="Times New Roman" w:hAnsi="Aptos Narrow" w:cs="Times New Roman"/>
+                <w:color w:val="000000"/>
+                <w:kern w:val="0"/>
+                <w:sz w:val="22"/>
+                <w:szCs w:val="22"/>
+                <w:lang w:eastAsia="pt-BR"/>
+                <w14:ligatures w14:val="none"/>
+              </w:rPr>
+              <w:t>remuneracao</w:t>
+            </w:r>
+            <w:r>
+              <w:rPr>
+                <w:rFonts w:ascii="Aptos Narrow" w:eastAsia="Times New Roman" w:hAnsi="Aptos Narrow" w:cs="Times New Roman"/>
+                <w:color w:val="000000"/>
+                <w:kern w:val="0"/>
+                <w:sz w:val="22"/>
+                <w:szCs w:val="22"/>
+                <w:lang w:eastAsia="pt-BR"/>
+                <w14:ligatures w14:val="none"/>
+              </w:rPr>
+              <w:t>.outras</w:t>
+            </w:r>
+            <w:proofErr w:type="gramEnd"/>
+            <w:r>
+              <w:rPr>
+                <w:rFonts w:ascii="Aptos Narrow" w:eastAsia="Times New Roman" w:hAnsi="Aptos Narrow" w:cs="Times New Roman"/>
+                <w:color w:val="000000"/>
+                <w:kern w:val="0"/>
+                <w:sz w:val="22"/>
+                <w:szCs w:val="22"/>
+                <w:lang w:eastAsia="pt-BR"/>
+                <w14:ligatures w14:val="none"/>
+              </w:rPr>
+              <w:t>_verbas</w:t>
+            </w:r>
+            <w:proofErr w:type="spellEnd"/>
+            <w:r>
+              <w:rPr>
+                <w:rFonts w:ascii="Aptos Narrow" w:eastAsia="Times New Roman" w:hAnsi="Aptos Narrow" w:cs="Times New Roman"/>
+                <w:color w:val="000000"/>
+                <w:kern w:val="0"/>
+                <w:sz w:val="22"/>
+                <w:szCs w:val="22"/>
+                <w:lang w:eastAsia="pt-BR"/>
+                <w14:ligatures w14:val="none"/>
+              </w:rPr>
+              <w:t>}}</w:t>
             </w:r>
           </w:p>
         </w:tc>
@@ -1195,6 +1721,7 @@
               </w:rPr>
               <w:t>{{</w:t>
             </w:r>
+            <w:proofErr w:type="spellStart"/>
             <w:r>
               <w:rPr>
                 <w:rFonts w:ascii="Aptos Narrow" w:eastAsia="Times New Roman" w:hAnsi="Aptos Narrow" w:cs="Times New Roman"/>
@@ -1207,6 +1734,7 @@
               </w:rPr>
               <w:t>remuneracao_bruta</w:t>
             </w:r>
+            <w:proofErr w:type="spellEnd"/>
             <w:r>
               <w:rPr>
                 <w:rFonts w:ascii="Aptos Narrow" w:eastAsia="Times New Roman" w:hAnsi="Aptos Narrow" w:cs="Times New Roman"/>
@@ -1467,31 +1995,85 @@
                 <w:lang w:eastAsia="pt-BR"/>
                 <w14:ligatures w14:val="none"/>
               </w:rPr>
-              <w:t>{{verbas.</w:t>
-            </w:r>
-            <w:r>
-              <w:rPr>
-                <w:rFonts w:ascii="Aptos Narrow" w:eastAsia="Times New Roman" w:hAnsi="Aptos Narrow" w:cs="Times New Roman"/>
-                <w:color w:val="000000"/>
-                <w:kern w:val="0"/>
-                <w:sz w:val="22"/>
-                <w:szCs w:val="22"/>
-                <w:lang w:eastAsia="pt-BR"/>
-                <w14:ligatures w14:val="none"/>
-              </w:rPr>
-              <w:t>saldo_salario</w:t>
-            </w:r>
-            <w:r>
-              <w:rPr>
-                <w:rFonts w:ascii="Aptos Narrow" w:eastAsia="Times New Roman" w:hAnsi="Aptos Narrow" w:cs="Times New Roman"/>
-                <w:color w:val="000000"/>
-                <w:kern w:val="0"/>
-                <w:sz w:val="22"/>
-                <w:szCs w:val="22"/>
-                <w:lang w:eastAsia="pt-BR"/>
-                <w14:ligatures w14:val="none"/>
-              </w:rPr>
-              <w:t>.detalhe}}</w:t>
+              <w:t>{{</w:t>
+            </w:r>
+            <w:proofErr w:type="spellStart"/>
+            <w:proofErr w:type="gramStart"/>
+            <w:r>
+              <w:rPr>
+                <w:rFonts w:ascii="Aptos Narrow" w:eastAsia="Times New Roman" w:hAnsi="Aptos Narrow" w:cs="Times New Roman"/>
+                <w:color w:val="000000"/>
+                <w:kern w:val="0"/>
+                <w:sz w:val="22"/>
+                <w:szCs w:val="22"/>
+                <w:lang w:eastAsia="pt-BR"/>
+                <w14:ligatures w14:val="none"/>
+              </w:rPr>
+              <w:t>verbas.</w:t>
+            </w:r>
+            <w:r>
+              <w:rPr>
+                <w:rFonts w:ascii="Aptos Narrow" w:eastAsia="Times New Roman" w:hAnsi="Aptos Narrow" w:cs="Times New Roman"/>
+                <w:color w:val="000000"/>
+                <w:kern w:val="0"/>
+                <w:sz w:val="22"/>
+                <w:szCs w:val="22"/>
+                <w:lang w:eastAsia="pt-BR"/>
+                <w14:ligatures w14:val="none"/>
+              </w:rPr>
+              <w:t>saldo</w:t>
+            </w:r>
+            <w:proofErr w:type="gramEnd"/>
+            <w:r>
+              <w:rPr>
+                <w:rFonts w:ascii="Aptos Narrow" w:eastAsia="Times New Roman" w:hAnsi="Aptos Narrow" w:cs="Times New Roman"/>
+                <w:color w:val="000000"/>
+                <w:kern w:val="0"/>
+                <w:sz w:val="22"/>
+                <w:szCs w:val="22"/>
+                <w:lang w:eastAsia="pt-BR"/>
+                <w14:ligatures w14:val="none"/>
+              </w:rPr>
+              <w:t>_</w:t>
+            </w:r>
+            <w:proofErr w:type="gramStart"/>
+            <w:r>
+              <w:rPr>
+                <w:rFonts w:ascii="Aptos Narrow" w:eastAsia="Times New Roman" w:hAnsi="Aptos Narrow" w:cs="Times New Roman"/>
+                <w:color w:val="000000"/>
+                <w:kern w:val="0"/>
+                <w:sz w:val="22"/>
+                <w:szCs w:val="22"/>
+                <w:lang w:eastAsia="pt-BR"/>
+                <w14:ligatures w14:val="none"/>
+              </w:rPr>
+              <w:t>salario</w:t>
+            </w:r>
+            <w:r>
+              <w:rPr>
+                <w:rFonts w:ascii="Aptos Narrow" w:eastAsia="Times New Roman" w:hAnsi="Aptos Narrow" w:cs="Times New Roman"/>
+                <w:color w:val="000000"/>
+                <w:kern w:val="0"/>
+                <w:sz w:val="22"/>
+                <w:szCs w:val="22"/>
+                <w:lang w:eastAsia="pt-BR"/>
+                <w14:ligatures w14:val="none"/>
+              </w:rPr>
+              <w:t>.detalhe</w:t>
+            </w:r>
+            <w:proofErr w:type="spellEnd"/>
+            <w:proofErr w:type="gramEnd"/>
+            <w:r>
+              <w:rPr>
+                <w:rFonts w:ascii="Aptos Narrow" w:eastAsia="Times New Roman" w:hAnsi="Aptos Narrow" w:cs="Times New Roman"/>
+                <w:color w:val="000000"/>
+                <w:kern w:val="0"/>
+                <w:sz w:val="22"/>
+                <w:szCs w:val="22"/>
+                <w:lang w:eastAsia="pt-BR"/>
+                <w14:ligatures w14:val="none"/>
+              </w:rPr>
+              <w:t>}}</w:t>
             </w:r>
           </w:p>
         </w:tc>
@@ -1532,31 +2114,85 @@
                 <w:lang w:eastAsia="pt-BR"/>
                 <w14:ligatures w14:val="none"/>
               </w:rPr>
-              <w:t>{{verbas.</w:t>
-            </w:r>
-            <w:r>
-              <w:rPr>
-                <w:rFonts w:ascii="Aptos Narrow" w:eastAsia="Times New Roman" w:hAnsi="Aptos Narrow" w:cs="Times New Roman"/>
-                <w:color w:val="000000"/>
-                <w:kern w:val="0"/>
-                <w:sz w:val="22"/>
-                <w:szCs w:val="22"/>
-                <w:lang w:eastAsia="pt-BR"/>
-                <w14:ligatures w14:val="none"/>
-              </w:rPr>
-              <w:t>saldo_salario</w:t>
-            </w:r>
-            <w:r>
-              <w:rPr>
-                <w:rFonts w:ascii="Aptos Narrow" w:eastAsia="Times New Roman" w:hAnsi="Aptos Narrow" w:cs="Times New Roman"/>
-                <w:color w:val="000000"/>
-                <w:kern w:val="0"/>
-                <w:sz w:val="22"/>
-                <w:szCs w:val="22"/>
-                <w:lang w:eastAsia="pt-BR"/>
-                <w14:ligatures w14:val="none"/>
-              </w:rPr>
-              <w:t>.valor}}</w:t>
+              <w:t>{{</w:t>
+            </w:r>
+            <w:proofErr w:type="spellStart"/>
+            <w:proofErr w:type="gramStart"/>
+            <w:r>
+              <w:rPr>
+                <w:rFonts w:ascii="Aptos Narrow" w:eastAsia="Times New Roman" w:hAnsi="Aptos Narrow" w:cs="Times New Roman"/>
+                <w:color w:val="000000"/>
+                <w:kern w:val="0"/>
+                <w:sz w:val="22"/>
+                <w:szCs w:val="22"/>
+                <w:lang w:eastAsia="pt-BR"/>
+                <w14:ligatures w14:val="none"/>
+              </w:rPr>
+              <w:t>verbas.</w:t>
+            </w:r>
+            <w:r>
+              <w:rPr>
+                <w:rFonts w:ascii="Aptos Narrow" w:eastAsia="Times New Roman" w:hAnsi="Aptos Narrow" w:cs="Times New Roman"/>
+                <w:color w:val="000000"/>
+                <w:kern w:val="0"/>
+                <w:sz w:val="22"/>
+                <w:szCs w:val="22"/>
+                <w:lang w:eastAsia="pt-BR"/>
+                <w14:ligatures w14:val="none"/>
+              </w:rPr>
+              <w:t>saldo</w:t>
+            </w:r>
+            <w:proofErr w:type="gramEnd"/>
+            <w:r>
+              <w:rPr>
+                <w:rFonts w:ascii="Aptos Narrow" w:eastAsia="Times New Roman" w:hAnsi="Aptos Narrow" w:cs="Times New Roman"/>
+                <w:color w:val="000000"/>
+                <w:kern w:val="0"/>
+                <w:sz w:val="22"/>
+                <w:szCs w:val="22"/>
+                <w:lang w:eastAsia="pt-BR"/>
+                <w14:ligatures w14:val="none"/>
+              </w:rPr>
+              <w:t>_</w:t>
+            </w:r>
+            <w:proofErr w:type="gramStart"/>
+            <w:r>
+              <w:rPr>
+                <w:rFonts w:ascii="Aptos Narrow" w:eastAsia="Times New Roman" w:hAnsi="Aptos Narrow" w:cs="Times New Roman"/>
+                <w:color w:val="000000"/>
+                <w:kern w:val="0"/>
+                <w:sz w:val="22"/>
+                <w:szCs w:val="22"/>
+                <w:lang w:eastAsia="pt-BR"/>
+                <w14:ligatures w14:val="none"/>
+              </w:rPr>
+              <w:t>salario</w:t>
+            </w:r>
+            <w:r>
+              <w:rPr>
+                <w:rFonts w:ascii="Aptos Narrow" w:eastAsia="Times New Roman" w:hAnsi="Aptos Narrow" w:cs="Times New Roman"/>
+                <w:color w:val="000000"/>
+                <w:kern w:val="0"/>
+                <w:sz w:val="22"/>
+                <w:szCs w:val="22"/>
+                <w:lang w:eastAsia="pt-BR"/>
+                <w14:ligatures w14:val="none"/>
+              </w:rPr>
+              <w:t>.valor</w:t>
+            </w:r>
+            <w:proofErr w:type="spellEnd"/>
+            <w:proofErr w:type="gramEnd"/>
+            <w:r>
+              <w:rPr>
+                <w:rFonts w:ascii="Aptos Narrow" w:eastAsia="Times New Roman" w:hAnsi="Aptos Narrow" w:cs="Times New Roman"/>
+                <w:color w:val="000000"/>
+                <w:kern w:val="0"/>
+                <w:sz w:val="22"/>
+                <w:szCs w:val="22"/>
+                <w:lang w:eastAsia="pt-BR"/>
+                <w14:ligatures w14:val="none"/>
+              </w:rPr>
+              <w:t>}}</w:t>
             </w:r>
           </w:p>
         </w:tc>
@@ -1643,31 +2279,85 @@
                 <w:lang w:eastAsia="pt-BR"/>
                 <w14:ligatures w14:val="none"/>
               </w:rPr>
-              <w:t>{{verbas.</w:t>
-            </w:r>
-            <w:r>
-              <w:rPr>
-                <w:rFonts w:ascii="Aptos Narrow" w:eastAsia="Times New Roman" w:hAnsi="Aptos Narrow" w:cs="Times New Roman"/>
-                <w:color w:val="000000"/>
-                <w:kern w:val="0"/>
-                <w:sz w:val="22"/>
-                <w:szCs w:val="22"/>
-                <w:lang w:eastAsia="pt-BR"/>
-                <w14:ligatures w14:val="none"/>
-              </w:rPr>
-              <w:t>aviso_previo</w:t>
-            </w:r>
-            <w:r>
-              <w:rPr>
-                <w:rFonts w:ascii="Aptos Narrow" w:eastAsia="Times New Roman" w:hAnsi="Aptos Narrow" w:cs="Times New Roman"/>
-                <w:color w:val="000000"/>
-                <w:kern w:val="0"/>
-                <w:sz w:val="22"/>
-                <w:szCs w:val="22"/>
-                <w:lang w:eastAsia="pt-BR"/>
-                <w14:ligatures w14:val="none"/>
-              </w:rPr>
-              <w:t>.detalhe}}</w:t>
+              <w:t>{{</w:t>
+            </w:r>
+            <w:proofErr w:type="spellStart"/>
+            <w:proofErr w:type="gramStart"/>
+            <w:r>
+              <w:rPr>
+                <w:rFonts w:ascii="Aptos Narrow" w:eastAsia="Times New Roman" w:hAnsi="Aptos Narrow" w:cs="Times New Roman"/>
+                <w:color w:val="000000"/>
+                <w:kern w:val="0"/>
+                <w:sz w:val="22"/>
+                <w:szCs w:val="22"/>
+                <w:lang w:eastAsia="pt-BR"/>
+                <w14:ligatures w14:val="none"/>
+              </w:rPr>
+              <w:t>verbas.</w:t>
+            </w:r>
+            <w:r>
+              <w:rPr>
+                <w:rFonts w:ascii="Aptos Narrow" w:eastAsia="Times New Roman" w:hAnsi="Aptos Narrow" w:cs="Times New Roman"/>
+                <w:color w:val="000000"/>
+                <w:kern w:val="0"/>
+                <w:sz w:val="22"/>
+                <w:szCs w:val="22"/>
+                <w:lang w:eastAsia="pt-BR"/>
+                <w14:ligatures w14:val="none"/>
+              </w:rPr>
+              <w:t>aviso</w:t>
+            </w:r>
+            <w:proofErr w:type="gramEnd"/>
+            <w:r>
+              <w:rPr>
+                <w:rFonts w:ascii="Aptos Narrow" w:eastAsia="Times New Roman" w:hAnsi="Aptos Narrow" w:cs="Times New Roman"/>
+                <w:color w:val="000000"/>
+                <w:kern w:val="0"/>
+                <w:sz w:val="22"/>
+                <w:szCs w:val="22"/>
+                <w:lang w:eastAsia="pt-BR"/>
+                <w14:ligatures w14:val="none"/>
+              </w:rPr>
+              <w:t>_</w:t>
+            </w:r>
+            <w:proofErr w:type="gramStart"/>
+            <w:r>
+              <w:rPr>
+                <w:rFonts w:ascii="Aptos Narrow" w:eastAsia="Times New Roman" w:hAnsi="Aptos Narrow" w:cs="Times New Roman"/>
+                <w:color w:val="000000"/>
+                <w:kern w:val="0"/>
+                <w:sz w:val="22"/>
+                <w:szCs w:val="22"/>
+                <w:lang w:eastAsia="pt-BR"/>
+                <w14:ligatures w14:val="none"/>
+              </w:rPr>
+              <w:t>previo</w:t>
+            </w:r>
+            <w:r>
+              <w:rPr>
+                <w:rFonts w:ascii="Aptos Narrow" w:eastAsia="Times New Roman" w:hAnsi="Aptos Narrow" w:cs="Times New Roman"/>
+                <w:color w:val="000000"/>
+                <w:kern w:val="0"/>
+                <w:sz w:val="22"/>
+                <w:szCs w:val="22"/>
+                <w:lang w:eastAsia="pt-BR"/>
+                <w14:ligatures w14:val="none"/>
+              </w:rPr>
+              <w:t>.detalhe</w:t>
+            </w:r>
+            <w:proofErr w:type="spellEnd"/>
+            <w:proofErr w:type="gramEnd"/>
+            <w:r>
+              <w:rPr>
+                <w:rFonts w:ascii="Aptos Narrow" w:eastAsia="Times New Roman" w:hAnsi="Aptos Narrow" w:cs="Times New Roman"/>
+                <w:color w:val="000000"/>
+                <w:kern w:val="0"/>
+                <w:sz w:val="22"/>
+                <w:szCs w:val="22"/>
+                <w:lang w:eastAsia="pt-BR"/>
+                <w14:ligatures w14:val="none"/>
+              </w:rPr>
+              <w:t>}}</w:t>
             </w:r>
           </w:p>
         </w:tc>
@@ -1708,31 +2398,85 @@
                 <w:lang w:eastAsia="pt-BR"/>
                 <w14:ligatures w14:val="none"/>
               </w:rPr>
-              <w:t>{{verbas.</w:t>
-            </w:r>
-            <w:r>
-              <w:rPr>
-                <w:rFonts w:ascii="Aptos Narrow" w:eastAsia="Times New Roman" w:hAnsi="Aptos Narrow" w:cs="Times New Roman"/>
-                <w:color w:val="000000"/>
-                <w:kern w:val="0"/>
-                <w:sz w:val="22"/>
-                <w:szCs w:val="22"/>
-                <w:lang w:eastAsia="pt-BR"/>
-                <w14:ligatures w14:val="none"/>
-              </w:rPr>
-              <w:t>aviso_previo</w:t>
-            </w:r>
-            <w:r>
-              <w:rPr>
-                <w:rFonts w:ascii="Aptos Narrow" w:eastAsia="Times New Roman" w:hAnsi="Aptos Narrow" w:cs="Times New Roman"/>
-                <w:color w:val="000000"/>
-                <w:kern w:val="0"/>
-                <w:sz w:val="22"/>
-                <w:szCs w:val="22"/>
-                <w:lang w:eastAsia="pt-BR"/>
-                <w14:ligatures w14:val="none"/>
-              </w:rPr>
-              <w:t>.valor}}</w:t>
+              <w:t>{{</w:t>
+            </w:r>
+            <w:proofErr w:type="spellStart"/>
+            <w:proofErr w:type="gramStart"/>
+            <w:r>
+              <w:rPr>
+                <w:rFonts w:ascii="Aptos Narrow" w:eastAsia="Times New Roman" w:hAnsi="Aptos Narrow" w:cs="Times New Roman"/>
+                <w:color w:val="000000"/>
+                <w:kern w:val="0"/>
+                <w:sz w:val="22"/>
+                <w:szCs w:val="22"/>
+                <w:lang w:eastAsia="pt-BR"/>
+                <w14:ligatures w14:val="none"/>
+              </w:rPr>
+              <w:t>verbas.</w:t>
+            </w:r>
+            <w:r>
+              <w:rPr>
+                <w:rFonts w:ascii="Aptos Narrow" w:eastAsia="Times New Roman" w:hAnsi="Aptos Narrow" w:cs="Times New Roman"/>
+                <w:color w:val="000000"/>
+                <w:kern w:val="0"/>
+                <w:sz w:val="22"/>
+                <w:szCs w:val="22"/>
+                <w:lang w:eastAsia="pt-BR"/>
+                <w14:ligatures w14:val="none"/>
+              </w:rPr>
+              <w:t>aviso</w:t>
+            </w:r>
+            <w:proofErr w:type="gramEnd"/>
+            <w:r>
+              <w:rPr>
+                <w:rFonts w:ascii="Aptos Narrow" w:eastAsia="Times New Roman" w:hAnsi="Aptos Narrow" w:cs="Times New Roman"/>
+                <w:color w:val="000000"/>
+                <w:kern w:val="0"/>
+                <w:sz w:val="22"/>
+                <w:szCs w:val="22"/>
+                <w:lang w:eastAsia="pt-BR"/>
+                <w14:ligatures w14:val="none"/>
+              </w:rPr>
+              <w:t>_</w:t>
+            </w:r>
+            <w:proofErr w:type="gramStart"/>
+            <w:r>
+              <w:rPr>
+                <w:rFonts w:ascii="Aptos Narrow" w:eastAsia="Times New Roman" w:hAnsi="Aptos Narrow" w:cs="Times New Roman"/>
+                <w:color w:val="000000"/>
+                <w:kern w:val="0"/>
+                <w:sz w:val="22"/>
+                <w:szCs w:val="22"/>
+                <w:lang w:eastAsia="pt-BR"/>
+                <w14:ligatures w14:val="none"/>
+              </w:rPr>
+              <w:t>previo</w:t>
+            </w:r>
+            <w:r>
+              <w:rPr>
+                <w:rFonts w:ascii="Aptos Narrow" w:eastAsia="Times New Roman" w:hAnsi="Aptos Narrow" w:cs="Times New Roman"/>
+                <w:color w:val="000000"/>
+                <w:kern w:val="0"/>
+                <w:sz w:val="22"/>
+                <w:szCs w:val="22"/>
+                <w:lang w:eastAsia="pt-BR"/>
+                <w14:ligatures w14:val="none"/>
+              </w:rPr>
+              <w:t>.valor</w:t>
+            </w:r>
+            <w:proofErr w:type="spellEnd"/>
+            <w:proofErr w:type="gramEnd"/>
+            <w:r>
+              <w:rPr>
+                <w:rFonts w:ascii="Aptos Narrow" w:eastAsia="Times New Roman" w:hAnsi="Aptos Narrow" w:cs="Times New Roman"/>
+                <w:color w:val="000000"/>
+                <w:kern w:val="0"/>
+                <w:sz w:val="22"/>
+                <w:szCs w:val="22"/>
+                <w:lang w:eastAsia="pt-BR"/>
+                <w14:ligatures w14:val="none"/>
+              </w:rPr>
+              <w:t>}}</w:t>
             </w:r>
           </w:p>
         </w:tc>
@@ -1819,7 +2563,61 @@
                 <w:lang w:eastAsia="pt-BR"/>
                 <w14:ligatures w14:val="none"/>
               </w:rPr>
-              <w:t>{{verbas.ferias_vencidas.detalhe}}</w:t>
+              <w:t>{{</w:t>
+            </w:r>
+            <w:proofErr w:type="spellStart"/>
+            <w:proofErr w:type="gramStart"/>
+            <w:r>
+              <w:rPr>
+                <w:rFonts w:ascii="Aptos Narrow" w:eastAsia="Times New Roman" w:hAnsi="Aptos Narrow" w:cs="Times New Roman"/>
+                <w:color w:val="000000"/>
+                <w:kern w:val="0"/>
+                <w:sz w:val="22"/>
+                <w:szCs w:val="22"/>
+                <w:lang w:eastAsia="pt-BR"/>
+                <w14:ligatures w14:val="none"/>
+              </w:rPr>
+              <w:t>verbas.ferias</w:t>
+            </w:r>
+            <w:proofErr w:type="gramEnd"/>
+            <w:r>
+              <w:rPr>
+                <w:rFonts w:ascii="Aptos Narrow" w:eastAsia="Times New Roman" w:hAnsi="Aptos Narrow" w:cs="Times New Roman"/>
+                <w:color w:val="000000"/>
+                <w:kern w:val="0"/>
+                <w:sz w:val="22"/>
+                <w:szCs w:val="22"/>
+                <w:lang w:eastAsia="pt-BR"/>
+                <w14:ligatures w14:val="none"/>
+              </w:rPr>
+              <w:t>_</w:t>
+            </w:r>
+            <w:proofErr w:type="gramStart"/>
+            <w:r>
+              <w:rPr>
+                <w:rFonts w:ascii="Aptos Narrow" w:eastAsia="Times New Roman" w:hAnsi="Aptos Narrow" w:cs="Times New Roman"/>
+                <w:color w:val="000000"/>
+                <w:kern w:val="0"/>
+                <w:sz w:val="22"/>
+                <w:szCs w:val="22"/>
+                <w:lang w:eastAsia="pt-BR"/>
+                <w14:ligatures w14:val="none"/>
+              </w:rPr>
+              <w:t>vencidas.detalhe</w:t>
+            </w:r>
+            <w:proofErr w:type="spellEnd"/>
+            <w:proofErr w:type="gramEnd"/>
+            <w:r>
+              <w:rPr>
+                <w:rFonts w:ascii="Aptos Narrow" w:eastAsia="Times New Roman" w:hAnsi="Aptos Narrow" w:cs="Times New Roman"/>
+                <w:color w:val="000000"/>
+                <w:kern w:val="0"/>
+                <w:sz w:val="22"/>
+                <w:szCs w:val="22"/>
+                <w:lang w:eastAsia="pt-BR"/>
+                <w14:ligatures w14:val="none"/>
+              </w:rPr>
+              <w:t>}}</w:t>
             </w:r>
           </w:p>
         </w:tc>
@@ -1860,7 +2658,61 @@
                 <w:lang w:eastAsia="pt-BR"/>
                 <w14:ligatures w14:val="none"/>
               </w:rPr>
-              <w:t>{{verbas.ferias_vencidas.valor}}</w:t>
+              <w:t>{{</w:t>
+            </w:r>
+            <w:proofErr w:type="spellStart"/>
+            <w:proofErr w:type="gramStart"/>
+            <w:r>
+              <w:rPr>
+                <w:rFonts w:ascii="Aptos Narrow" w:eastAsia="Times New Roman" w:hAnsi="Aptos Narrow" w:cs="Times New Roman"/>
+                <w:color w:val="000000"/>
+                <w:kern w:val="0"/>
+                <w:sz w:val="22"/>
+                <w:szCs w:val="22"/>
+                <w:lang w:eastAsia="pt-BR"/>
+                <w14:ligatures w14:val="none"/>
+              </w:rPr>
+              <w:t>verbas.ferias</w:t>
+            </w:r>
+            <w:proofErr w:type="gramEnd"/>
+            <w:r>
+              <w:rPr>
+                <w:rFonts w:ascii="Aptos Narrow" w:eastAsia="Times New Roman" w:hAnsi="Aptos Narrow" w:cs="Times New Roman"/>
+                <w:color w:val="000000"/>
+                <w:kern w:val="0"/>
+                <w:sz w:val="22"/>
+                <w:szCs w:val="22"/>
+                <w:lang w:eastAsia="pt-BR"/>
+                <w14:ligatures w14:val="none"/>
+              </w:rPr>
+              <w:t>_</w:t>
+            </w:r>
+            <w:proofErr w:type="gramStart"/>
+            <w:r>
+              <w:rPr>
+                <w:rFonts w:ascii="Aptos Narrow" w:eastAsia="Times New Roman" w:hAnsi="Aptos Narrow" w:cs="Times New Roman"/>
+                <w:color w:val="000000"/>
+                <w:kern w:val="0"/>
+                <w:sz w:val="22"/>
+                <w:szCs w:val="22"/>
+                <w:lang w:eastAsia="pt-BR"/>
+                <w14:ligatures w14:val="none"/>
+              </w:rPr>
+              <w:t>vencidas.valor</w:t>
+            </w:r>
+            <w:proofErr w:type="spellEnd"/>
+            <w:proofErr w:type="gramEnd"/>
+            <w:r>
+              <w:rPr>
+                <w:rFonts w:ascii="Aptos Narrow" w:eastAsia="Times New Roman" w:hAnsi="Aptos Narrow" w:cs="Times New Roman"/>
+                <w:color w:val="000000"/>
+                <w:kern w:val="0"/>
+                <w:sz w:val="22"/>
+                <w:szCs w:val="22"/>
+                <w:lang w:eastAsia="pt-BR"/>
+                <w14:ligatures w14:val="none"/>
+              </w:rPr>
+              <w:t>}}</w:t>
             </w:r>
           </w:p>
         </w:tc>
@@ -1947,7 +2799,61 @@
                 <w:lang w:eastAsia="pt-BR"/>
                 <w14:ligatures w14:val="none"/>
               </w:rPr>
-              <w:t>{{verbas.ferias_proporcionais.detalhe}}</w:t>
+              <w:t>{{</w:t>
+            </w:r>
+            <w:proofErr w:type="spellStart"/>
+            <w:proofErr w:type="gramStart"/>
+            <w:r>
+              <w:rPr>
+                <w:rFonts w:ascii="Aptos Narrow" w:eastAsia="Times New Roman" w:hAnsi="Aptos Narrow" w:cs="Times New Roman"/>
+                <w:color w:val="000000"/>
+                <w:kern w:val="0"/>
+                <w:sz w:val="22"/>
+                <w:szCs w:val="22"/>
+                <w:lang w:eastAsia="pt-BR"/>
+                <w14:ligatures w14:val="none"/>
+              </w:rPr>
+              <w:t>verbas.ferias</w:t>
+            </w:r>
+            <w:proofErr w:type="gramEnd"/>
+            <w:r>
+              <w:rPr>
+                <w:rFonts w:ascii="Aptos Narrow" w:eastAsia="Times New Roman" w:hAnsi="Aptos Narrow" w:cs="Times New Roman"/>
+                <w:color w:val="000000"/>
+                <w:kern w:val="0"/>
+                <w:sz w:val="22"/>
+                <w:szCs w:val="22"/>
+                <w:lang w:eastAsia="pt-BR"/>
+                <w14:ligatures w14:val="none"/>
+              </w:rPr>
+              <w:t>_</w:t>
+            </w:r>
+            <w:proofErr w:type="gramStart"/>
+            <w:r>
+              <w:rPr>
+                <w:rFonts w:ascii="Aptos Narrow" w:eastAsia="Times New Roman" w:hAnsi="Aptos Narrow" w:cs="Times New Roman"/>
+                <w:color w:val="000000"/>
+                <w:kern w:val="0"/>
+                <w:sz w:val="22"/>
+                <w:szCs w:val="22"/>
+                <w:lang w:eastAsia="pt-BR"/>
+                <w14:ligatures w14:val="none"/>
+              </w:rPr>
+              <w:t>proporcionais.detalhe</w:t>
+            </w:r>
+            <w:proofErr w:type="spellEnd"/>
+            <w:proofErr w:type="gramEnd"/>
+            <w:r>
+              <w:rPr>
+                <w:rFonts w:ascii="Aptos Narrow" w:eastAsia="Times New Roman" w:hAnsi="Aptos Narrow" w:cs="Times New Roman"/>
+                <w:color w:val="000000"/>
+                <w:kern w:val="0"/>
+                <w:sz w:val="22"/>
+                <w:szCs w:val="22"/>
+                <w:lang w:eastAsia="pt-BR"/>
+                <w14:ligatures w14:val="none"/>
+              </w:rPr>
+              <w:t>}}</w:t>
             </w:r>
           </w:p>
         </w:tc>
@@ -1988,7 +2894,61 @@
                 <w:lang w:eastAsia="pt-BR"/>
                 <w14:ligatures w14:val="none"/>
               </w:rPr>
-              <w:t>{{verbas.ferias_proporcionais.valor}}</w:t>
+              <w:t>{{</w:t>
+            </w:r>
+            <w:proofErr w:type="spellStart"/>
+            <w:proofErr w:type="gramStart"/>
+            <w:r>
+              <w:rPr>
+                <w:rFonts w:ascii="Aptos Narrow" w:eastAsia="Times New Roman" w:hAnsi="Aptos Narrow" w:cs="Times New Roman"/>
+                <w:color w:val="000000"/>
+                <w:kern w:val="0"/>
+                <w:sz w:val="22"/>
+                <w:szCs w:val="22"/>
+                <w:lang w:eastAsia="pt-BR"/>
+                <w14:ligatures w14:val="none"/>
+              </w:rPr>
+              <w:t>verbas.ferias</w:t>
+            </w:r>
+            <w:proofErr w:type="gramEnd"/>
+            <w:r>
+              <w:rPr>
+                <w:rFonts w:ascii="Aptos Narrow" w:eastAsia="Times New Roman" w:hAnsi="Aptos Narrow" w:cs="Times New Roman"/>
+                <w:color w:val="000000"/>
+                <w:kern w:val="0"/>
+                <w:sz w:val="22"/>
+                <w:szCs w:val="22"/>
+                <w:lang w:eastAsia="pt-BR"/>
+                <w14:ligatures w14:val="none"/>
+              </w:rPr>
+              <w:t>_</w:t>
+            </w:r>
+            <w:proofErr w:type="gramStart"/>
+            <w:r>
+              <w:rPr>
+                <w:rFonts w:ascii="Aptos Narrow" w:eastAsia="Times New Roman" w:hAnsi="Aptos Narrow" w:cs="Times New Roman"/>
+                <w:color w:val="000000"/>
+                <w:kern w:val="0"/>
+                <w:sz w:val="22"/>
+                <w:szCs w:val="22"/>
+                <w:lang w:eastAsia="pt-BR"/>
+                <w14:ligatures w14:val="none"/>
+              </w:rPr>
+              <w:t>proporcionais.valor</w:t>
+            </w:r>
+            <w:proofErr w:type="spellEnd"/>
+            <w:proofErr w:type="gramEnd"/>
+            <w:r>
+              <w:rPr>
+                <w:rFonts w:ascii="Aptos Narrow" w:eastAsia="Times New Roman" w:hAnsi="Aptos Narrow" w:cs="Times New Roman"/>
+                <w:color w:val="000000"/>
+                <w:kern w:val="0"/>
+                <w:sz w:val="22"/>
+                <w:szCs w:val="22"/>
+                <w:lang w:eastAsia="pt-BR"/>
+                <w14:ligatures w14:val="none"/>
+              </w:rPr>
+              <w:t>}}</w:t>
             </w:r>
           </w:p>
         </w:tc>
@@ -2075,7 +3035,61 @@
                 <w:lang w:eastAsia="pt-BR"/>
                 <w14:ligatures w14:val="none"/>
               </w:rPr>
-              <w:t>{{verbas.decimo_terceiro.detalhe}}</w:t>
+              <w:t>{{</w:t>
+            </w:r>
+            <w:proofErr w:type="spellStart"/>
+            <w:proofErr w:type="gramStart"/>
+            <w:r>
+              <w:rPr>
+                <w:rFonts w:ascii="Aptos Narrow" w:eastAsia="Times New Roman" w:hAnsi="Aptos Narrow" w:cs="Times New Roman"/>
+                <w:color w:val="000000"/>
+                <w:kern w:val="0"/>
+                <w:sz w:val="22"/>
+                <w:szCs w:val="22"/>
+                <w:lang w:eastAsia="pt-BR"/>
+                <w14:ligatures w14:val="none"/>
+              </w:rPr>
+              <w:t>verbas.decimo</w:t>
+            </w:r>
+            <w:proofErr w:type="gramEnd"/>
+            <w:r>
+              <w:rPr>
+                <w:rFonts w:ascii="Aptos Narrow" w:eastAsia="Times New Roman" w:hAnsi="Aptos Narrow" w:cs="Times New Roman"/>
+                <w:color w:val="000000"/>
+                <w:kern w:val="0"/>
+                <w:sz w:val="22"/>
+                <w:szCs w:val="22"/>
+                <w:lang w:eastAsia="pt-BR"/>
+                <w14:ligatures w14:val="none"/>
+              </w:rPr>
+              <w:t>_</w:t>
+            </w:r>
+            <w:proofErr w:type="gramStart"/>
+            <w:r>
+              <w:rPr>
+                <w:rFonts w:ascii="Aptos Narrow" w:eastAsia="Times New Roman" w:hAnsi="Aptos Narrow" w:cs="Times New Roman"/>
+                <w:color w:val="000000"/>
+                <w:kern w:val="0"/>
+                <w:sz w:val="22"/>
+                <w:szCs w:val="22"/>
+                <w:lang w:eastAsia="pt-BR"/>
+                <w14:ligatures w14:val="none"/>
+              </w:rPr>
+              <w:t>terceiro.detalhe</w:t>
+            </w:r>
+            <w:proofErr w:type="spellEnd"/>
+            <w:proofErr w:type="gramEnd"/>
+            <w:r>
+              <w:rPr>
+                <w:rFonts w:ascii="Aptos Narrow" w:eastAsia="Times New Roman" w:hAnsi="Aptos Narrow" w:cs="Times New Roman"/>
+                <w:color w:val="000000"/>
+                <w:kern w:val="0"/>
+                <w:sz w:val="22"/>
+                <w:szCs w:val="22"/>
+                <w:lang w:eastAsia="pt-BR"/>
+                <w14:ligatures w14:val="none"/>
+              </w:rPr>
+              <w:t>}}</w:t>
             </w:r>
           </w:p>
         </w:tc>
@@ -2116,7 +3130,61 @@
                 <w:lang w:eastAsia="pt-BR"/>
                 <w14:ligatures w14:val="none"/>
               </w:rPr>
-              <w:t>{{verbas.decimo_terceiro.valor}}</w:t>
+              <w:t>{{</w:t>
+            </w:r>
+            <w:proofErr w:type="spellStart"/>
+            <w:proofErr w:type="gramStart"/>
+            <w:r>
+              <w:rPr>
+                <w:rFonts w:ascii="Aptos Narrow" w:eastAsia="Times New Roman" w:hAnsi="Aptos Narrow" w:cs="Times New Roman"/>
+                <w:color w:val="000000"/>
+                <w:kern w:val="0"/>
+                <w:sz w:val="22"/>
+                <w:szCs w:val="22"/>
+                <w:lang w:eastAsia="pt-BR"/>
+                <w14:ligatures w14:val="none"/>
+              </w:rPr>
+              <w:t>verbas.decimo</w:t>
+            </w:r>
+            <w:proofErr w:type="gramEnd"/>
+            <w:r>
+              <w:rPr>
+                <w:rFonts w:ascii="Aptos Narrow" w:eastAsia="Times New Roman" w:hAnsi="Aptos Narrow" w:cs="Times New Roman"/>
+                <w:color w:val="000000"/>
+                <w:kern w:val="0"/>
+                <w:sz w:val="22"/>
+                <w:szCs w:val="22"/>
+                <w:lang w:eastAsia="pt-BR"/>
+                <w14:ligatures w14:val="none"/>
+              </w:rPr>
+              <w:t>_</w:t>
+            </w:r>
+            <w:proofErr w:type="gramStart"/>
+            <w:r>
+              <w:rPr>
+                <w:rFonts w:ascii="Aptos Narrow" w:eastAsia="Times New Roman" w:hAnsi="Aptos Narrow" w:cs="Times New Roman"/>
+                <w:color w:val="000000"/>
+                <w:kern w:val="0"/>
+                <w:sz w:val="22"/>
+                <w:szCs w:val="22"/>
+                <w:lang w:eastAsia="pt-BR"/>
+                <w14:ligatures w14:val="none"/>
+              </w:rPr>
+              <w:t>terceiro.valor</w:t>
+            </w:r>
+            <w:proofErr w:type="spellEnd"/>
+            <w:proofErr w:type="gramEnd"/>
+            <w:r>
+              <w:rPr>
+                <w:rFonts w:ascii="Aptos Narrow" w:eastAsia="Times New Roman" w:hAnsi="Aptos Narrow" w:cs="Times New Roman"/>
+                <w:color w:val="000000"/>
+                <w:kern w:val="0"/>
+                <w:sz w:val="22"/>
+                <w:szCs w:val="22"/>
+                <w:lang w:eastAsia="pt-BR"/>
+                <w14:ligatures w14:val="none"/>
+              </w:rPr>
+              <w:t>}}</w:t>
             </w:r>
           </w:p>
         </w:tc>
@@ -2203,7 +3271,61 @@
                 <w:lang w:eastAsia="pt-BR"/>
                 <w14:ligatures w14:val="none"/>
               </w:rPr>
-              <w:t>{{verbas.fgts_rescisorio.detalhe}}</w:t>
+              <w:t>{{</w:t>
+            </w:r>
+            <w:proofErr w:type="spellStart"/>
+            <w:proofErr w:type="gramStart"/>
+            <w:r>
+              <w:rPr>
+                <w:rFonts w:ascii="Aptos Narrow" w:eastAsia="Times New Roman" w:hAnsi="Aptos Narrow" w:cs="Times New Roman"/>
+                <w:color w:val="000000"/>
+                <w:kern w:val="0"/>
+                <w:sz w:val="22"/>
+                <w:szCs w:val="22"/>
+                <w:lang w:eastAsia="pt-BR"/>
+                <w14:ligatures w14:val="none"/>
+              </w:rPr>
+              <w:t>verbas.fgts</w:t>
+            </w:r>
+            <w:proofErr w:type="gramEnd"/>
+            <w:r>
+              <w:rPr>
+                <w:rFonts w:ascii="Aptos Narrow" w:eastAsia="Times New Roman" w:hAnsi="Aptos Narrow" w:cs="Times New Roman"/>
+                <w:color w:val="000000"/>
+                <w:kern w:val="0"/>
+                <w:sz w:val="22"/>
+                <w:szCs w:val="22"/>
+                <w:lang w:eastAsia="pt-BR"/>
+                <w14:ligatures w14:val="none"/>
+              </w:rPr>
+              <w:t>_</w:t>
+            </w:r>
+            <w:proofErr w:type="gramStart"/>
+            <w:r>
+              <w:rPr>
+                <w:rFonts w:ascii="Aptos Narrow" w:eastAsia="Times New Roman" w:hAnsi="Aptos Narrow" w:cs="Times New Roman"/>
+                <w:color w:val="000000"/>
+                <w:kern w:val="0"/>
+                <w:sz w:val="22"/>
+                <w:szCs w:val="22"/>
+                <w:lang w:eastAsia="pt-BR"/>
+                <w14:ligatures w14:val="none"/>
+              </w:rPr>
+              <w:t>rescisorio.detalhe</w:t>
+            </w:r>
+            <w:proofErr w:type="spellEnd"/>
+            <w:proofErr w:type="gramEnd"/>
+            <w:r>
+              <w:rPr>
+                <w:rFonts w:ascii="Aptos Narrow" w:eastAsia="Times New Roman" w:hAnsi="Aptos Narrow" w:cs="Times New Roman"/>
+                <w:color w:val="000000"/>
+                <w:kern w:val="0"/>
+                <w:sz w:val="22"/>
+                <w:szCs w:val="22"/>
+                <w:lang w:eastAsia="pt-BR"/>
+                <w14:ligatures w14:val="none"/>
+              </w:rPr>
+              <w:t>}}</w:t>
             </w:r>
           </w:p>
         </w:tc>
@@ -2244,7 +3366,61 @@
                 <w:lang w:eastAsia="pt-BR"/>
                 <w14:ligatures w14:val="none"/>
               </w:rPr>
-              <w:t>{{verbas.fgts_rescisorio.valor}}</w:t>
+              <w:t>{{</w:t>
+            </w:r>
+            <w:proofErr w:type="spellStart"/>
+            <w:proofErr w:type="gramStart"/>
+            <w:r>
+              <w:rPr>
+                <w:rFonts w:ascii="Aptos Narrow" w:eastAsia="Times New Roman" w:hAnsi="Aptos Narrow" w:cs="Times New Roman"/>
+                <w:color w:val="000000"/>
+                <w:kern w:val="0"/>
+                <w:sz w:val="22"/>
+                <w:szCs w:val="22"/>
+                <w:lang w:eastAsia="pt-BR"/>
+                <w14:ligatures w14:val="none"/>
+              </w:rPr>
+              <w:t>verbas.fgts</w:t>
+            </w:r>
+            <w:proofErr w:type="gramEnd"/>
+            <w:r>
+              <w:rPr>
+                <w:rFonts w:ascii="Aptos Narrow" w:eastAsia="Times New Roman" w:hAnsi="Aptos Narrow" w:cs="Times New Roman"/>
+                <w:color w:val="000000"/>
+                <w:kern w:val="0"/>
+                <w:sz w:val="22"/>
+                <w:szCs w:val="22"/>
+                <w:lang w:eastAsia="pt-BR"/>
+                <w14:ligatures w14:val="none"/>
+              </w:rPr>
+              <w:t>_</w:t>
+            </w:r>
+            <w:proofErr w:type="gramStart"/>
+            <w:r>
+              <w:rPr>
+                <w:rFonts w:ascii="Aptos Narrow" w:eastAsia="Times New Roman" w:hAnsi="Aptos Narrow" w:cs="Times New Roman"/>
+                <w:color w:val="000000"/>
+                <w:kern w:val="0"/>
+                <w:sz w:val="22"/>
+                <w:szCs w:val="22"/>
+                <w:lang w:eastAsia="pt-BR"/>
+                <w14:ligatures w14:val="none"/>
+              </w:rPr>
+              <w:t>rescisorio.valor</w:t>
+            </w:r>
+            <w:proofErr w:type="spellEnd"/>
+            <w:proofErr w:type="gramEnd"/>
+            <w:r>
+              <w:rPr>
+                <w:rFonts w:ascii="Aptos Narrow" w:eastAsia="Times New Roman" w:hAnsi="Aptos Narrow" w:cs="Times New Roman"/>
+                <w:color w:val="000000"/>
+                <w:kern w:val="0"/>
+                <w:sz w:val="22"/>
+                <w:szCs w:val="22"/>
+                <w:lang w:eastAsia="pt-BR"/>
+                <w14:ligatures w14:val="none"/>
+              </w:rPr>
+              <w:t>}}</w:t>
             </w:r>
           </w:p>
         </w:tc>
@@ -2329,7 +3505,61 @@
                 <w:lang w:eastAsia="pt-BR"/>
                 <w14:ligatures w14:val="none"/>
               </w:rPr>
-              <w:t>{{verbas.multa_fgts.detalhe}}</w:t>
+              <w:t>{{</w:t>
+            </w:r>
+            <w:proofErr w:type="spellStart"/>
+            <w:proofErr w:type="gramStart"/>
+            <w:r>
+              <w:rPr>
+                <w:rFonts w:ascii="Aptos Narrow" w:eastAsia="Times New Roman" w:hAnsi="Aptos Narrow" w:cs="Times New Roman"/>
+                <w:color w:val="000000"/>
+                <w:kern w:val="0"/>
+                <w:sz w:val="22"/>
+                <w:szCs w:val="22"/>
+                <w:lang w:eastAsia="pt-BR"/>
+                <w14:ligatures w14:val="none"/>
+              </w:rPr>
+              <w:t>verbas.multa</w:t>
+            </w:r>
+            <w:proofErr w:type="gramEnd"/>
+            <w:r>
+              <w:rPr>
+                <w:rFonts w:ascii="Aptos Narrow" w:eastAsia="Times New Roman" w:hAnsi="Aptos Narrow" w:cs="Times New Roman"/>
+                <w:color w:val="000000"/>
+                <w:kern w:val="0"/>
+                <w:sz w:val="22"/>
+                <w:szCs w:val="22"/>
+                <w:lang w:eastAsia="pt-BR"/>
+                <w14:ligatures w14:val="none"/>
+              </w:rPr>
+              <w:t>_</w:t>
+            </w:r>
+            <w:proofErr w:type="gramStart"/>
+            <w:r>
+              <w:rPr>
+                <w:rFonts w:ascii="Aptos Narrow" w:eastAsia="Times New Roman" w:hAnsi="Aptos Narrow" w:cs="Times New Roman"/>
+                <w:color w:val="000000"/>
+                <w:kern w:val="0"/>
+                <w:sz w:val="22"/>
+                <w:szCs w:val="22"/>
+                <w:lang w:eastAsia="pt-BR"/>
+                <w14:ligatures w14:val="none"/>
+              </w:rPr>
+              <w:t>fgts.detalhe</w:t>
+            </w:r>
+            <w:proofErr w:type="spellEnd"/>
+            <w:proofErr w:type="gramEnd"/>
+            <w:r>
+              <w:rPr>
+                <w:rFonts w:ascii="Aptos Narrow" w:eastAsia="Times New Roman" w:hAnsi="Aptos Narrow" w:cs="Times New Roman"/>
+                <w:color w:val="000000"/>
+                <w:kern w:val="0"/>
+                <w:sz w:val="22"/>
+                <w:szCs w:val="22"/>
+                <w:lang w:eastAsia="pt-BR"/>
+                <w14:ligatures w14:val="none"/>
+              </w:rPr>
+              <w:t>}}</w:t>
             </w:r>
           </w:p>
         </w:tc>
@@ -2369,7 +3599,61 @@
                 <w:lang w:eastAsia="pt-BR"/>
                 <w14:ligatures w14:val="none"/>
               </w:rPr>
-              <w:t>{{verbas.multa_fgts.valor}}</w:t>
+              <w:t>{{</w:t>
+            </w:r>
+            <w:proofErr w:type="spellStart"/>
+            <w:proofErr w:type="gramStart"/>
+            <w:r>
+              <w:rPr>
+                <w:rFonts w:ascii="Aptos Narrow" w:eastAsia="Times New Roman" w:hAnsi="Aptos Narrow" w:cs="Times New Roman"/>
+                <w:color w:val="000000"/>
+                <w:kern w:val="0"/>
+                <w:sz w:val="22"/>
+                <w:szCs w:val="22"/>
+                <w:lang w:eastAsia="pt-BR"/>
+                <w14:ligatures w14:val="none"/>
+              </w:rPr>
+              <w:t>verbas.multa</w:t>
+            </w:r>
+            <w:proofErr w:type="gramEnd"/>
+            <w:r>
+              <w:rPr>
+                <w:rFonts w:ascii="Aptos Narrow" w:eastAsia="Times New Roman" w:hAnsi="Aptos Narrow" w:cs="Times New Roman"/>
+                <w:color w:val="000000"/>
+                <w:kern w:val="0"/>
+                <w:sz w:val="22"/>
+                <w:szCs w:val="22"/>
+                <w:lang w:eastAsia="pt-BR"/>
+                <w14:ligatures w14:val="none"/>
+              </w:rPr>
+              <w:t>_</w:t>
+            </w:r>
+            <w:proofErr w:type="gramStart"/>
+            <w:r>
+              <w:rPr>
+                <w:rFonts w:ascii="Aptos Narrow" w:eastAsia="Times New Roman" w:hAnsi="Aptos Narrow" w:cs="Times New Roman"/>
+                <w:color w:val="000000"/>
+                <w:kern w:val="0"/>
+                <w:sz w:val="22"/>
+                <w:szCs w:val="22"/>
+                <w:lang w:eastAsia="pt-BR"/>
+                <w14:ligatures w14:val="none"/>
+              </w:rPr>
+              <w:t>fgts.valor</w:t>
+            </w:r>
+            <w:proofErr w:type="spellEnd"/>
+            <w:proofErr w:type="gramEnd"/>
+            <w:r>
+              <w:rPr>
+                <w:rFonts w:ascii="Aptos Narrow" w:eastAsia="Times New Roman" w:hAnsi="Aptos Narrow" w:cs="Times New Roman"/>
+                <w:color w:val="000000"/>
+                <w:kern w:val="0"/>
+                <w:sz w:val="22"/>
+                <w:szCs w:val="22"/>
+                <w:lang w:eastAsia="pt-BR"/>
+                <w14:ligatures w14:val="none"/>
+              </w:rPr>
+              <w:t>}}</w:t>
             </w:r>
           </w:p>
         </w:tc>
@@ -2418,6 +3702,7 @@
                 <w:lang w:eastAsia="pt-BR"/>
                 <w14:ligatures w14:val="none"/>
               </w:rPr>
+              <w:lastRenderedPageBreak/>
               <w:t xml:space="preserve">Total </w:t>
             </w:r>
             <w:r>
@@ -2500,7 +3785,20 @@
                 <w:lang w:eastAsia="pt-BR"/>
                 <w14:ligatures w14:val="none"/>
               </w:rPr>
-              <w:t>{{total</w:t>
+              <w:t>{{</w:t>
+            </w:r>
+            <w:proofErr w:type="spellStart"/>
+            <w:r>
+              <w:rPr>
+                <w:rFonts w:ascii="Aptos Narrow" w:eastAsia="Times New Roman" w:hAnsi="Aptos Narrow" w:cs="Times New Roman"/>
+                <w:color w:val="000000"/>
+                <w:kern w:val="0"/>
+                <w:sz w:val="22"/>
+                <w:szCs w:val="22"/>
+                <w:lang w:eastAsia="pt-BR"/>
+                <w14:ligatures w14:val="none"/>
+              </w:rPr>
+              <w:t>total</w:t>
             </w:r>
             <w:r>
               <w:rPr>
@@ -2514,6 +3812,7 @@
               </w:rPr>
               <w:t>_bruto</w:t>
             </w:r>
+            <w:proofErr w:type="spellEnd"/>
             <w:r>
               <w:rPr>
                 <w:rFonts w:ascii="Aptos Narrow" w:eastAsia="Times New Roman" w:hAnsi="Aptos Narrow" w:cs="Times New Roman"/>
@@ -2535,7 +3834,6 @@
         <w:pStyle w:val="Ttulo2"/>
       </w:pPr>
       <w:r>
-        <w:lastRenderedPageBreak/>
         <w:t>Detalhamento dos Descontos</w:t>
       </w:r>
     </w:p>
@@ -2757,17 +4055,71 @@
                 <w14:ligatures w14:val="none"/>
               </w:rPr>
             </w:pPr>
-            <w:r>
-              <w:rPr>
-                <w:rFonts w:ascii="Aptos Narrow" w:eastAsia="Times New Roman" w:hAnsi="Aptos Narrow" w:cs="Times New Roman"/>
-                <w:color w:val="000000"/>
-                <w:kern w:val="0"/>
-                <w:sz w:val="22"/>
-                <w:szCs w:val="22"/>
-                <w:lang w:eastAsia="pt-BR"/>
-                <w14:ligatures w14:val="none"/>
-              </w:rPr>
-              <w:t>{{ descontos.inss.detalhe }}</w:t>
+            <w:proofErr w:type="gramStart"/>
+            <w:r>
+              <w:rPr>
+                <w:rFonts w:ascii="Aptos Narrow" w:eastAsia="Times New Roman" w:hAnsi="Aptos Narrow" w:cs="Times New Roman"/>
+                <w:color w:val="000000"/>
+                <w:kern w:val="0"/>
+                <w:sz w:val="22"/>
+                <w:szCs w:val="22"/>
+                <w:lang w:eastAsia="pt-BR"/>
+                <w14:ligatures w14:val="none"/>
+              </w:rPr>
+              <w:t xml:space="preserve">{{ </w:t>
+            </w:r>
+            <w:proofErr w:type="spellStart"/>
+            <w:r>
+              <w:rPr>
+                <w:rFonts w:ascii="Aptos Narrow" w:eastAsia="Times New Roman" w:hAnsi="Aptos Narrow" w:cs="Times New Roman"/>
+                <w:color w:val="000000"/>
+                <w:kern w:val="0"/>
+                <w:sz w:val="22"/>
+                <w:szCs w:val="22"/>
+                <w:lang w:eastAsia="pt-BR"/>
+                <w14:ligatures w14:val="none"/>
+              </w:rPr>
+              <w:t>descontos</w:t>
+            </w:r>
+            <w:proofErr w:type="gramEnd"/>
+            <w:r>
+              <w:rPr>
+                <w:rFonts w:ascii="Aptos Narrow" w:eastAsia="Times New Roman" w:hAnsi="Aptos Narrow" w:cs="Times New Roman"/>
+                <w:color w:val="000000"/>
+                <w:kern w:val="0"/>
+                <w:sz w:val="22"/>
+                <w:szCs w:val="22"/>
+                <w:lang w:eastAsia="pt-BR"/>
+                <w14:ligatures w14:val="none"/>
+              </w:rPr>
+              <w:t>.</w:t>
+            </w:r>
+            <w:proofErr w:type="gramStart"/>
+            <w:r>
+              <w:rPr>
+                <w:rFonts w:ascii="Aptos Narrow" w:eastAsia="Times New Roman" w:hAnsi="Aptos Narrow" w:cs="Times New Roman"/>
+                <w:color w:val="000000"/>
+                <w:kern w:val="0"/>
+                <w:sz w:val="22"/>
+                <w:szCs w:val="22"/>
+                <w:lang w:eastAsia="pt-BR"/>
+                <w14:ligatures w14:val="none"/>
+              </w:rPr>
+              <w:t>inss.detalhe</w:t>
+            </w:r>
+            <w:proofErr w:type="spellEnd"/>
+            <w:proofErr w:type="gramEnd"/>
+            <w:r>
+              <w:rPr>
+                <w:rFonts w:ascii="Aptos Narrow" w:eastAsia="Times New Roman" w:hAnsi="Aptos Narrow" w:cs="Times New Roman"/>
+                <w:color w:val="000000"/>
+                <w:kern w:val="0"/>
+                <w:sz w:val="22"/>
+                <w:szCs w:val="22"/>
+                <w:lang w:eastAsia="pt-BR"/>
+                <w14:ligatures w14:val="none"/>
+              </w:rPr>
+              <w:t xml:space="preserve"> }}</w:t>
             </w:r>
           </w:p>
         </w:tc>
@@ -2798,17 +4150,71 @@
                 <w14:ligatures w14:val="none"/>
               </w:rPr>
             </w:pPr>
-            <w:r>
-              <w:rPr>
-                <w:rFonts w:ascii="Aptos Narrow" w:eastAsia="Times New Roman" w:hAnsi="Aptos Narrow" w:cs="Times New Roman"/>
-                <w:color w:val="000000"/>
-                <w:kern w:val="0"/>
-                <w:sz w:val="22"/>
-                <w:szCs w:val="22"/>
-                <w:lang w:eastAsia="pt-BR"/>
-                <w14:ligatures w14:val="none"/>
-              </w:rPr>
-              <w:t>{{ descontos.inss.valor }}</w:t>
+            <w:proofErr w:type="gramStart"/>
+            <w:r>
+              <w:rPr>
+                <w:rFonts w:ascii="Aptos Narrow" w:eastAsia="Times New Roman" w:hAnsi="Aptos Narrow" w:cs="Times New Roman"/>
+                <w:color w:val="000000"/>
+                <w:kern w:val="0"/>
+                <w:sz w:val="22"/>
+                <w:szCs w:val="22"/>
+                <w:lang w:eastAsia="pt-BR"/>
+                <w14:ligatures w14:val="none"/>
+              </w:rPr>
+              <w:t xml:space="preserve">{{ </w:t>
+            </w:r>
+            <w:proofErr w:type="spellStart"/>
+            <w:r>
+              <w:rPr>
+                <w:rFonts w:ascii="Aptos Narrow" w:eastAsia="Times New Roman" w:hAnsi="Aptos Narrow" w:cs="Times New Roman"/>
+                <w:color w:val="000000"/>
+                <w:kern w:val="0"/>
+                <w:sz w:val="22"/>
+                <w:szCs w:val="22"/>
+                <w:lang w:eastAsia="pt-BR"/>
+                <w14:ligatures w14:val="none"/>
+              </w:rPr>
+              <w:t>descontos</w:t>
+            </w:r>
+            <w:proofErr w:type="gramEnd"/>
+            <w:r>
+              <w:rPr>
+                <w:rFonts w:ascii="Aptos Narrow" w:eastAsia="Times New Roman" w:hAnsi="Aptos Narrow" w:cs="Times New Roman"/>
+                <w:color w:val="000000"/>
+                <w:kern w:val="0"/>
+                <w:sz w:val="22"/>
+                <w:szCs w:val="22"/>
+                <w:lang w:eastAsia="pt-BR"/>
+                <w14:ligatures w14:val="none"/>
+              </w:rPr>
+              <w:t>.</w:t>
+            </w:r>
+            <w:proofErr w:type="gramStart"/>
+            <w:r>
+              <w:rPr>
+                <w:rFonts w:ascii="Aptos Narrow" w:eastAsia="Times New Roman" w:hAnsi="Aptos Narrow" w:cs="Times New Roman"/>
+                <w:color w:val="000000"/>
+                <w:kern w:val="0"/>
+                <w:sz w:val="22"/>
+                <w:szCs w:val="22"/>
+                <w:lang w:eastAsia="pt-BR"/>
+                <w14:ligatures w14:val="none"/>
+              </w:rPr>
+              <w:t>inss.valor</w:t>
+            </w:r>
+            <w:proofErr w:type="spellEnd"/>
+            <w:proofErr w:type="gramEnd"/>
+            <w:r>
+              <w:rPr>
+                <w:rFonts w:ascii="Aptos Narrow" w:eastAsia="Times New Roman" w:hAnsi="Aptos Narrow" w:cs="Times New Roman"/>
+                <w:color w:val="000000"/>
+                <w:kern w:val="0"/>
+                <w:sz w:val="22"/>
+                <w:szCs w:val="22"/>
+                <w:lang w:eastAsia="pt-BR"/>
+                <w14:ligatures w14:val="none"/>
+              </w:rPr>
+              <w:t xml:space="preserve"> }}</w:t>
             </w:r>
           </w:p>
         </w:tc>
@@ -2885,17 +4291,71 @@
                 <w14:ligatures w14:val="none"/>
               </w:rPr>
             </w:pPr>
-            <w:r>
-              <w:rPr>
-                <w:rFonts w:ascii="Aptos Narrow" w:eastAsia="Times New Roman" w:hAnsi="Aptos Narrow" w:cs="Times New Roman"/>
-                <w:color w:val="000000"/>
-                <w:kern w:val="0"/>
-                <w:sz w:val="22"/>
-                <w:szCs w:val="22"/>
-                <w:lang w:eastAsia="pt-BR"/>
-                <w14:ligatures w14:val="none"/>
-              </w:rPr>
-              <w:t>{{ descontos.irrf.detalhe }}</w:t>
+            <w:proofErr w:type="gramStart"/>
+            <w:r>
+              <w:rPr>
+                <w:rFonts w:ascii="Aptos Narrow" w:eastAsia="Times New Roman" w:hAnsi="Aptos Narrow" w:cs="Times New Roman"/>
+                <w:color w:val="000000"/>
+                <w:kern w:val="0"/>
+                <w:sz w:val="22"/>
+                <w:szCs w:val="22"/>
+                <w:lang w:eastAsia="pt-BR"/>
+                <w14:ligatures w14:val="none"/>
+              </w:rPr>
+              <w:t xml:space="preserve">{{ </w:t>
+            </w:r>
+            <w:proofErr w:type="spellStart"/>
+            <w:r>
+              <w:rPr>
+                <w:rFonts w:ascii="Aptos Narrow" w:eastAsia="Times New Roman" w:hAnsi="Aptos Narrow" w:cs="Times New Roman"/>
+                <w:color w:val="000000"/>
+                <w:kern w:val="0"/>
+                <w:sz w:val="22"/>
+                <w:szCs w:val="22"/>
+                <w:lang w:eastAsia="pt-BR"/>
+                <w14:ligatures w14:val="none"/>
+              </w:rPr>
+              <w:t>descontos</w:t>
+            </w:r>
+            <w:proofErr w:type="gramEnd"/>
+            <w:r>
+              <w:rPr>
+                <w:rFonts w:ascii="Aptos Narrow" w:eastAsia="Times New Roman" w:hAnsi="Aptos Narrow" w:cs="Times New Roman"/>
+                <w:color w:val="000000"/>
+                <w:kern w:val="0"/>
+                <w:sz w:val="22"/>
+                <w:szCs w:val="22"/>
+                <w:lang w:eastAsia="pt-BR"/>
+                <w14:ligatures w14:val="none"/>
+              </w:rPr>
+              <w:t>.</w:t>
+            </w:r>
+            <w:proofErr w:type="gramStart"/>
+            <w:r>
+              <w:rPr>
+                <w:rFonts w:ascii="Aptos Narrow" w:eastAsia="Times New Roman" w:hAnsi="Aptos Narrow" w:cs="Times New Roman"/>
+                <w:color w:val="000000"/>
+                <w:kern w:val="0"/>
+                <w:sz w:val="22"/>
+                <w:szCs w:val="22"/>
+                <w:lang w:eastAsia="pt-BR"/>
+                <w14:ligatures w14:val="none"/>
+              </w:rPr>
+              <w:t>irrf.detalhe</w:t>
+            </w:r>
+            <w:proofErr w:type="spellEnd"/>
+            <w:proofErr w:type="gramEnd"/>
+            <w:r>
+              <w:rPr>
+                <w:rFonts w:ascii="Aptos Narrow" w:eastAsia="Times New Roman" w:hAnsi="Aptos Narrow" w:cs="Times New Roman"/>
+                <w:color w:val="000000"/>
+                <w:kern w:val="0"/>
+                <w:sz w:val="22"/>
+                <w:szCs w:val="22"/>
+                <w:lang w:eastAsia="pt-BR"/>
+                <w14:ligatures w14:val="none"/>
+              </w:rPr>
+              <w:t xml:space="preserve"> }}</w:t>
             </w:r>
           </w:p>
         </w:tc>
@@ -2926,17 +4386,71 @@
                 <w14:ligatures w14:val="none"/>
               </w:rPr>
             </w:pPr>
-            <w:r>
-              <w:rPr>
-                <w:rFonts w:ascii="Aptos Narrow" w:eastAsia="Times New Roman" w:hAnsi="Aptos Narrow" w:cs="Times New Roman"/>
-                <w:color w:val="000000"/>
-                <w:kern w:val="0"/>
-                <w:sz w:val="22"/>
-                <w:szCs w:val="22"/>
-                <w:lang w:eastAsia="pt-BR"/>
-                <w14:ligatures w14:val="none"/>
-              </w:rPr>
-              <w:t>{{ descontos.irrf.valor }}</w:t>
+            <w:proofErr w:type="gramStart"/>
+            <w:r>
+              <w:rPr>
+                <w:rFonts w:ascii="Aptos Narrow" w:eastAsia="Times New Roman" w:hAnsi="Aptos Narrow" w:cs="Times New Roman"/>
+                <w:color w:val="000000"/>
+                <w:kern w:val="0"/>
+                <w:sz w:val="22"/>
+                <w:szCs w:val="22"/>
+                <w:lang w:eastAsia="pt-BR"/>
+                <w14:ligatures w14:val="none"/>
+              </w:rPr>
+              <w:t xml:space="preserve">{{ </w:t>
+            </w:r>
+            <w:proofErr w:type="spellStart"/>
+            <w:r>
+              <w:rPr>
+                <w:rFonts w:ascii="Aptos Narrow" w:eastAsia="Times New Roman" w:hAnsi="Aptos Narrow" w:cs="Times New Roman"/>
+                <w:color w:val="000000"/>
+                <w:kern w:val="0"/>
+                <w:sz w:val="22"/>
+                <w:szCs w:val="22"/>
+                <w:lang w:eastAsia="pt-BR"/>
+                <w14:ligatures w14:val="none"/>
+              </w:rPr>
+              <w:t>descontos</w:t>
+            </w:r>
+            <w:proofErr w:type="gramEnd"/>
+            <w:r>
+              <w:rPr>
+                <w:rFonts w:ascii="Aptos Narrow" w:eastAsia="Times New Roman" w:hAnsi="Aptos Narrow" w:cs="Times New Roman"/>
+                <w:color w:val="000000"/>
+                <w:kern w:val="0"/>
+                <w:sz w:val="22"/>
+                <w:szCs w:val="22"/>
+                <w:lang w:eastAsia="pt-BR"/>
+                <w14:ligatures w14:val="none"/>
+              </w:rPr>
+              <w:t>.</w:t>
+            </w:r>
+            <w:proofErr w:type="gramStart"/>
+            <w:r>
+              <w:rPr>
+                <w:rFonts w:ascii="Aptos Narrow" w:eastAsia="Times New Roman" w:hAnsi="Aptos Narrow" w:cs="Times New Roman"/>
+                <w:color w:val="000000"/>
+                <w:kern w:val="0"/>
+                <w:sz w:val="22"/>
+                <w:szCs w:val="22"/>
+                <w:lang w:eastAsia="pt-BR"/>
+                <w14:ligatures w14:val="none"/>
+              </w:rPr>
+              <w:t>irrf.valor</w:t>
+            </w:r>
+            <w:proofErr w:type="spellEnd"/>
+            <w:proofErr w:type="gramEnd"/>
+            <w:r>
+              <w:rPr>
+                <w:rFonts w:ascii="Aptos Narrow" w:eastAsia="Times New Roman" w:hAnsi="Aptos Narrow" w:cs="Times New Roman"/>
+                <w:color w:val="000000"/>
+                <w:kern w:val="0"/>
+                <w:sz w:val="22"/>
+                <w:szCs w:val="22"/>
+                <w:lang w:eastAsia="pt-BR"/>
+                <w14:ligatures w14:val="none"/>
+              </w:rPr>
+              <w:t xml:space="preserve"> }}</w:t>
             </w:r>
           </w:p>
         </w:tc>
@@ -3057,17 +4571,57 @@
                 <w14:ligatures w14:val="none"/>
               </w:rPr>
             </w:pPr>
-            <w:r>
-              <w:rPr>
-                <w:rFonts w:ascii="Aptos Narrow" w:eastAsia="Times New Roman" w:hAnsi="Aptos Narrow" w:cs="Times New Roman"/>
-                <w:color w:val="000000"/>
-                <w:kern w:val="0"/>
-                <w:sz w:val="22"/>
-                <w:szCs w:val="22"/>
-                <w:lang w:eastAsia="pt-BR"/>
-                <w14:ligatures w14:val="none"/>
-              </w:rPr>
-              <w:t>{{ total_descontos }}</w:t>
+            <w:proofErr w:type="gramStart"/>
+            <w:r>
+              <w:rPr>
+                <w:rFonts w:ascii="Aptos Narrow" w:eastAsia="Times New Roman" w:hAnsi="Aptos Narrow" w:cs="Times New Roman"/>
+                <w:color w:val="000000"/>
+                <w:kern w:val="0"/>
+                <w:sz w:val="22"/>
+                <w:szCs w:val="22"/>
+                <w:lang w:eastAsia="pt-BR"/>
+                <w14:ligatures w14:val="none"/>
+              </w:rPr>
+              <w:t xml:space="preserve">{{ </w:t>
+            </w:r>
+            <w:proofErr w:type="spellStart"/>
+            <w:r>
+              <w:rPr>
+                <w:rFonts w:ascii="Aptos Narrow" w:eastAsia="Times New Roman" w:hAnsi="Aptos Narrow" w:cs="Times New Roman"/>
+                <w:color w:val="000000"/>
+                <w:kern w:val="0"/>
+                <w:sz w:val="22"/>
+                <w:szCs w:val="22"/>
+                <w:lang w:eastAsia="pt-BR"/>
+                <w14:ligatures w14:val="none"/>
+              </w:rPr>
+              <w:t>total</w:t>
+            </w:r>
+            <w:proofErr w:type="gramEnd"/>
+            <w:r>
+              <w:rPr>
+                <w:rFonts w:ascii="Aptos Narrow" w:eastAsia="Times New Roman" w:hAnsi="Aptos Narrow" w:cs="Times New Roman"/>
+                <w:color w:val="000000"/>
+                <w:kern w:val="0"/>
+                <w:sz w:val="22"/>
+                <w:szCs w:val="22"/>
+                <w:lang w:eastAsia="pt-BR"/>
+                <w14:ligatures w14:val="none"/>
+              </w:rPr>
+              <w:t>_descontos</w:t>
+            </w:r>
+            <w:proofErr w:type="spellEnd"/>
+            <w:r>
+              <w:rPr>
+                <w:rFonts w:ascii="Aptos Narrow" w:eastAsia="Times New Roman" w:hAnsi="Aptos Narrow" w:cs="Times New Roman"/>
+                <w:color w:val="000000"/>
+                <w:kern w:val="0"/>
+                <w:sz w:val="22"/>
+                <w:szCs w:val="22"/>
+                <w:lang w:eastAsia="pt-BR"/>
+                <w14:ligatures w14:val="none"/>
+              </w:rPr>
+              <w:t xml:space="preserve"> }}</w:t>
             </w:r>
           </w:p>
         </w:tc>
@@ -3135,11 +4689,19 @@
               </w:rPr>
               <w:t xml:space="preserve">Saldo </w:t>
             </w:r>
-            <w:r>
-              <w:rPr>
-                <w:rFonts w:ascii="Aptos Narrow" w:hAnsi="Aptos Narrow"/>
-              </w:rPr>
-              <w:t>Acumulado (</w:t>
+            <w:proofErr w:type="spellStart"/>
+            <w:r>
+              <w:rPr>
+                <w:rFonts w:ascii="Aptos Narrow" w:hAnsi="Aptos Narrow"/>
+              </w:rPr>
+              <w:t>Acumulado</w:t>
+            </w:r>
+            <w:proofErr w:type="spellEnd"/>
+            <w:r>
+              <w:rPr>
+                <w:rFonts w:ascii="Aptos Narrow" w:hAnsi="Aptos Narrow"/>
+              </w:rPr>
+              <w:t xml:space="preserve"> (</w:t>
             </w:r>
             <w:r>
               <w:rPr>
@@ -3163,18 +4725,28 @@
             <w:pPr>
               <w:jc w:val="center"/>
             </w:pPr>
+            <w:proofErr w:type="gramStart"/>
             <w:r>
               <w:rPr>
                 <w:rFonts w:ascii="Aptos Narrow" w:hAnsi="Aptos Narrow"/>
               </w:rPr>
               <w:t xml:space="preserve">{{ </w:t>
             </w:r>
+            <w:proofErr w:type="spellStart"/>
             <w:r>
               <w:rPr>
                 <w:sz w:val="20"/>
               </w:rPr>
-              <w:t>fgts_acumulado</w:t>
-            </w:r>
+              <w:t>fgts</w:t>
+            </w:r>
+            <w:proofErr w:type="gramEnd"/>
+            <w:r>
+              <w:rPr>
+                <w:sz w:val="20"/>
+              </w:rPr>
+              <w:t>_acumulado</w:t>
+            </w:r>
+            <w:proofErr w:type="spellEnd"/>
             <w:r>
               <w:rPr>
                 <w:rFonts w:ascii="Aptos Narrow" w:hAnsi="Aptos Narrow"/>
@@ -3227,6 +4799,7 @@
               </w:rPr>
               <w:t>{{</w:t>
             </w:r>
+            <w:proofErr w:type="spellStart"/>
             <w:r>
               <w:rPr>
                 <w:rFonts w:ascii="Aptos Narrow" w:hAnsi="Aptos Narrow"/>
@@ -3234,6 +4807,7 @@
               </w:rPr>
               <w:t>fgts_pode_sacar</w:t>
             </w:r>
+            <w:proofErr w:type="spellEnd"/>
             <w:r>
               <w:rPr>
                 <w:rFonts w:ascii="Aptos Narrow" w:hAnsi="Aptos Narrow"/>
@@ -3256,12 +4830,14 @@
                 <w:rFonts w:ascii="Aptos Narrow" w:hAnsi="Aptos Narrow"/>
               </w:rPr>
             </w:pPr>
+            <w:proofErr w:type="gramStart"/>
             <w:r>
               <w:rPr>
                 <w:rFonts w:ascii="Aptos Narrow" w:hAnsi="Aptos Narrow"/>
               </w:rPr>
               <w:t xml:space="preserve">FGTS  </w:t>
             </w:r>
+            <w:proofErr w:type="spellStart"/>
             <w:r>
               <w:rPr>
                 <w:rFonts w:ascii="Aptos Narrow" w:hAnsi="Aptos Narrow"/>
@@ -3278,7 +4854,15 @@
               <w:rPr>
                 <w:rFonts w:ascii="Aptos Narrow" w:hAnsi="Aptos Narrow"/>
               </w:rPr>
-              <w:t>rio (8%)</w:t>
+              <w:t>rio</w:t>
+            </w:r>
+            <w:proofErr w:type="spellEnd"/>
+            <w:proofErr w:type="gramEnd"/>
+            <w:r>
+              <w:rPr>
+                <w:rFonts w:ascii="Aptos Narrow" w:hAnsi="Aptos Narrow"/>
+              </w:rPr>
+              <w:t xml:space="preserve"> (8%)</w:t>
             </w:r>
           </w:p>
         </w:tc>
@@ -3293,17 +4877,33 @@
                 <w:rFonts w:ascii="Aptos Narrow" w:hAnsi="Aptos Narrow"/>
               </w:rPr>
             </w:pPr>
+            <w:proofErr w:type="gramStart"/>
             <w:r>
               <w:rPr>
                 <w:rFonts w:ascii="Aptos Narrow" w:hAnsi="Aptos Narrow"/>
               </w:rPr>
               <w:t xml:space="preserve">{{ </w:t>
             </w:r>
+            <w:proofErr w:type="spellStart"/>
             <w:r>
               <w:rPr>
                 <w:sz w:val="20"/>
               </w:rPr>
-              <w:t xml:space="preserve">fgts_rescisorio </w:t>
+              <w:t>fgts</w:t>
+            </w:r>
+            <w:proofErr w:type="gramEnd"/>
+            <w:r>
+              <w:rPr>
+                <w:sz w:val="20"/>
+              </w:rPr>
+              <w:t>_rescisorio</w:t>
+            </w:r>
+            <w:proofErr w:type="spellEnd"/>
+            <w:r>
+              <w:rPr>
+                <w:sz w:val="20"/>
+              </w:rPr>
+              <w:t xml:space="preserve"> </w:t>
             </w:r>
             <w:r>
               <w:rPr>
@@ -3326,11 +4926,47 @@
                 <w:rFonts w:ascii="Aptos Narrow" w:hAnsi="Aptos Narrow"/>
               </w:rPr>
             </w:pPr>
-            <w:r>
-              <w:rPr>
-                <w:rFonts w:ascii="Aptos Narrow" w:hAnsi="Aptos Narrow"/>
-              </w:rPr>
-              <w:t>Multa ({{ multa_fgts_percent }})</w:t>
+            <w:proofErr w:type="spellStart"/>
+            <w:r>
+              <w:rPr>
+                <w:rFonts w:ascii="Aptos Narrow" w:hAnsi="Aptos Narrow"/>
+              </w:rPr>
+              <w:t>Multa</w:t>
+            </w:r>
+            <w:proofErr w:type="spellEnd"/>
+            <w:r>
+              <w:rPr>
+                <w:rFonts w:ascii="Aptos Narrow" w:hAnsi="Aptos Narrow"/>
+              </w:rPr>
+              <w:t xml:space="preserve"> (</w:t>
+            </w:r>
+            <w:proofErr w:type="gramStart"/>
+            <w:r>
+              <w:rPr>
+                <w:rFonts w:ascii="Aptos Narrow" w:hAnsi="Aptos Narrow"/>
+              </w:rPr>
+              <w:t xml:space="preserve">{{ </w:t>
+            </w:r>
+            <w:proofErr w:type="spellStart"/>
+            <w:r>
+              <w:rPr>
+                <w:rFonts w:ascii="Aptos Narrow" w:hAnsi="Aptos Narrow"/>
+              </w:rPr>
+              <w:t>multa</w:t>
+            </w:r>
+            <w:proofErr w:type="gramEnd"/>
+            <w:r>
+              <w:rPr>
+                <w:rFonts w:ascii="Aptos Narrow" w:hAnsi="Aptos Narrow"/>
+              </w:rPr>
+              <w:t>_fgts_percent</w:t>
+            </w:r>
+            <w:proofErr w:type="spellEnd"/>
+            <w:r>
+              <w:rPr>
+                <w:rFonts w:ascii="Aptos Narrow" w:hAnsi="Aptos Narrow"/>
+              </w:rPr>
+              <w:t xml:space="preserve"> }})</w:t>
             </w:r>
           </w:p>
         </w:tc>
@@ -3345,17 +4981,33 @@
                 <w:rFonts w:ascii="Aptos Narrow" w:hAnsi="Aptos Narrow"/>
               </w:rPr>
             </w:pPr>
+            <w:proofErr w:type="gramStart"/>
             <w:r>
               <w:rPr>
                 <w:rFonts w:ascii="Aptos Narrow" w:hAnsi="Aptos Narrow"/>
               </w:rPr>
               <w:t xml:space="preserve">{{ </w:t>
             </w:r>
+            <w:proofErr w:type="spellStart"/>
             <w:r>
               <w:rPr>
                 <w:sz w:val="20"/>
               </w:rPr>
-              <w:t xml:space="preserve">multa_fgts </w:t>
+              <w:t>multa</w:t>
+            </w:r>
+            <w:proofErr w:type="gramEnd"/>
+            <w:r>
+              <w:rPr>
+                <w:sz w:val="20"/>
+              </w:rPr>
+              <w:t>_fgts</w:t>
+            </w:r>
+            <w:proofErr w:type="spellEnd"/>
+            <w:r>
+              <w:rPr>
+                <w:sz w:val="20"/>
+              </w:rPr>
+              <w:t xml:space="preserve"> </w:t>
             </w:r>
             <w:r>
               <w:rPr>
@@ -3405,11 +5057,33 @@
                 <w:rFonts w:ascii="Aptos Narrow" w:hAnsi="Aptos Narrow"/>
               </w:rPr>
             </w:pPr>
-            <w:r>
-              <w:rPr>
-                <w:rFonts w:ascii="Aptos Narrow" w:hAnsi="Aptos Narrow"/>
-              </w:rPr>
-              <w:t>{{ total_fgts }}</w:t>
+            <w:proofErr w:type="gramStart"/>
+            <w:r>
+              <w:rPr>
+                <w:rFonts w:ascii="Aptos Narrow" w:hAnsi="Aptos Narrow"/>
+              </w:rPr>
+              <w:t xml:space="preserve">{{ </w:t>
+            </w:r>
+            <w:proofErr w:type="spellStart"/>
+            <w:r>
+              <w:rPr>
+                <w:rFonts w:ascii="Aptos Narrow" w:hAnsi="Aptos Narrow"/>
+              </w:rPr>
+              <w:t>total</w:t>
+            </w:r>
+            <w:proofErr w:type="gramEnd"/>
+            <w:r>
+              <w:rPr>
+                <w:rFonts w:ascii="Aptos Narrow" w:hAnsi="Aptos Narrow"/>
+              </w:rPr>
+              <w:t>_fgts</w:t>
+            </w:r>
+            <w:proofErr w:type="spellEnd"/>
+            <w:r>
+              <w:rPr>
+                <w:rFonts w:ascii="Aptos Narrow" w:hAnsi="Aptos Narrow"/>
+              </w:rPr>
+              <w:t xml:space="preserve"> }}</w:t>
             </w:r>
           </w:p>
         </w:tc>
@@ -3662,7 +5336,58 @@
         <w:sz w:val="18"/>
         <w:szCs w:val="18"/>
       </w:rPr>
-      <w:t>Relatório Confidencial | Powered by Processa AI</w:t>
+      <w:t xml:space="preserve">Relatório Confidencial | </w:t>
+    </w:r>
+    <w:proofErr w:type="spellStart"/>
+    <w:r>
+      <w:rPr>
+        <w:i/>
+        <w:iCs/>
+        <w:sz w:val="18"/>
+        <w:szCs w:val="18"/>
+      </w:rPr>
+      <w:t>Powered</w:t>
+    </w:r>
+    <w:proofErr w:type="spellEnd"/>
+    <w:r>
+      <w:rPr>
+        <w:i/>
+        <w:iCs/>
+        <w:sz w:val="18"/>
+        <w:szCs w:val="18"/>
+      </w:rPr>
+      <w:t xml:space="preserve"> </w:t>
+    </w:r>
+    <w:proofErr w:type="spellStart"/>
+    <w:proofErr w:type="gramStart"/>
+    <w:r>
+      <w:rPr>
+        <w:i/>
+        <w:iCs/>
+        <w:sz w:val="18"/>
+        <w:szCs w:val="18"/>
+      </w:rPr>
+      <w:t>by</w:t>
+    </w:r>
+    <w:proofErr w:type="spellEnd"/>
+    <w:r>
+      <w:rPr>
+        <w:i/>
+        <w:iCs/>
+        <w:sz w:val="18"/>
+        <w:szCs w:val="18"/>
+      </w:rPr>
+      <w:t xml:space="preserve"> Processa</w:t>
+    </w:r>
+    <w:proofErr w:type="gramEnd"/>
+    <w:r>
+      <w:rPr>
+        <w:i/>
+        <w:iCs/>
+        <w:sz w:val="18"/>
+        <w:szCs w:val="18"/>
+      </w:rPr>
+      <w:t xml:space="preserve"> AI</w:t>
     </w:r>
   </w:p>
   <w:p>
@@ -4615,7 +6340,6 @@
   <w:style w:type="character" w:default="1" w:styleId="Fontepargpadro">
     <w:name w:val="Default Paragraph Font"/>
     <w:uiPriority w:val="1"/>
-    <w:semiHidden/>
     <w:unhideWhenUsed/>
   </w:style>
   <w:style w:type="table" w:default="1" w:styleId="Tabelanormal">

</xml_diff>